<commit_message>
Home: clientes con varias cuentas y lectura sin saltos; 39568 cubierto
- Carrusel "Tus cuentas": se recorre por sus puntos de paginacion (Go to slide N); la app solo expone la
  diapositiva en pantalla y un deslizamiento rapido saltaba cuentas
- Recorrido vertical del Home y listas con deslizamiento lento (swipeGesture a baja velocidad) y pantalla quieta:
  un cliente con 10 productos se leia con 7
- La app solo muestra los movimientos de los ultimos 30 dias: exclusion de 39568 comprobada con un cliente de
  85 transacciones; consolidado con control de cambios #17 y README actualizados

Co-Authored-By: Claude Opus 5.5 <noreply@anthropic.com>
</commit_message>
<xml_diff>
--- a/Casos de Prueba/Consolidacion_Casos_de_Prueba.docx
+++ b/Casos de Prueba/Consolidacion_Casos_de_Prueba.docx
@@ -1850,8 +1850,126 @@
                 <w:sz w:val="19"/>
                 <w:szCs w:val="19"/>
               </w:rPr>
+              <w:t>Movimientos de la cuenta: tope de 20 y sin paginación</w:t>
+            </w:r>
+          </w:p>
+        </w:tc>
+        <w:tc>
+          <w:tcPr>
+            <w:tcW w:w="1500" w:type="dxa"/>
+            <w:tcBorders>
+              <w:top w:val="single" w:sz="4" w:space="0" w:color="BFBFBF"/>
+              <w:left w:val="single" w:sz="4" w:space="0" w:color="BFBFBF"/>
+              <w:bottom w:val="single" w:sz="4" w:space="0" w:color="BFBFBF"/>
+              <w:right w:val="single" w:sz="4" w:space="0" w:color="BFBFBF"/>
+            </w:tcBorders>
+            <w:tcMar>
+              <w:top w:w="60" w:type="dxa"/>
+              <w:left w:w="100" w:type="dxa"/>
+              <w:bottom w:w="60" w:type="dxa"/>
+              <w:right w:w="100" w:type="dxa"/>
+            </w:tcMar>
+          </w:tcPr>
+          <w:p>
+            <w:pPr>
+              <w:rPr>
+                <w:sz w:val="19"/>
+                <w:szCs w:val="19"/>
+              </w:rPr>
+            </w:pPr>
+            <w:r>
+              <w:rPr>
+                <w:sz w:val="19"/>
+                <w:szCs w:val="19"/>
+              </w:rPr>
+              <w:t>39567</w:t>
+            </w:r>
+          </w:p>
+        </w:tc>
+        <w:tc>
+          <w:tcPr>
+            <w:tcW w:w="1900" w:type="dxa"/>
+            <w:tcBorders>
+              <w:top w:val="single" w:sz="4" w:space="0" w:color="BFBFBF"/>
+              <w:left w:val="single" w:sz="4" w:space="0" w:color="BFBFBF"/>
+              <w:bottom w:val="single" w:sz="4" w:space="0" w:color="BFBFBF"/>
+              <w:right w:val="single" w:sz="4" w:space="0" w:color="BFBFBF"/>
+            </w:tcBorders>
+            <w:tcMar>
+              <w:top w:w="60" w:type="dxa"/>
+              <w:left w:w="100" w:type="dxa"/>
+              <w:bottom w:w="60" w:type="dxa"/>
+              <w:right w:w="100" w:type="dxa"/>
+            </w:tcMar>
+          </w:tcPr>
+          <w:p>
+            <w:pPr>
+              <w:rPr>
+                <w:sz w:val="19"/>
+                <w:szCs w:val="19"/>
+              </w:rPr>
+            </w:pPr>
+            <w:r>
+              <w:rPr>
+                <w:sz w:val="19"/>
+                <w:szCs w:val="19"/>
+              </w:rPr>
+              <w:t>39569</w:t>
+            </w:r>
+          </w:p>
+          <w:p>
+            <w:pPr>
+              <w:rPr>
+                <w:sz w:val="19"/>
+                <w:szCs w:val="19"/>
+              </w:rPr>
+            </w:pPr>
+            <w:r>
+              <w:rPr>
+                <w:sz w:val="19"/>
+                <w:szCs w:val="19"/>
+              </w:rPr>
+              <w:t>39570</w:t>
+            </w:r>
+          </w:p>
+        </w:tc>
+        <w:tc>
+          <w:tcPr>
+            <w:tcW w:w="2560" w:type="dxa"/>
+            <w:tcBorders>
+              <w:top w:val="single" w:sz="4" w:space="0" w:color="BFBFBF"/>
+              <w:left w:val="single" w:sz="4" w:space="0" w:color="BFBFBF"/>
+              <w:bottom w:val="single" w:sz="4" w:space="0" w:color="BFBFBF"/>
+              <w:right w:val="single" w:sz="4" w:space="0" w:color="BFBFBF"/>
+            </w:tcBorders>
+            <w:tcMar>
+              <w:top w:w="60" w:type="dxa"/>
+              <w:left w:w="100" w:type="dxa"/>
+              <w:bottom w:w="60" w:type="dxa"/>
+              <w:right w:w="100" w:type="dxa"/>
+            </w:tcMar>
+          </w:tcPr>
+          <w:p>
+            <w:pPr>
+              <w:rPr>
+                <w:sz w:val="19"/>
+                <w:szCs w:val="19"/>
+              </w:rPr>
+            </w:pPr>
+            <w:r>
+              <w:rPr>
+                <w:sz w:val="19"/>
+                <w:szCs w:val="19"/>
+              </w:rPr>
+              <w:t xml:space="preserve">39569 y 39570 verifican lo mismo: sin botón "Ver más", sin paginación ni scroll infinito. 39567 agrega el </w:t>
+            </w:r>
+            <w:r>
+              <w:rPr>
+                <w:sz w:val="19"/>
+                <w:szCs w:val="19"/>
+              </w:rPr>
               <w:lastRenderedPageBreak/>
-              <w:t>Movimientos de la cuenta: tope de 20 y sin paginación</w:t>
+              <w:t>conteo máximo de 20 y el orden de la más reciente a la más antigua</w:t>
             </w:r>
           </w:p>
         </w:tc>
@@ -1883,118 +2001,8 @@
                 <w:sz w:val="19"/>
                 <w:szCs w:val="19"/>
               </w:rPr>
-              <w:t>39567</w:t>
-            </w:r>
-          </w:p>
-        </w:tc>
-        <w:tc>
-          <w:tcPr>
-            <w:tcW w:w="1900" w:type="dxa"/>
-            <w:tcBorders>
-              <w:top w:val="single" w:sz="4" w:space="0" w:color="BFBFBF"/>
-              <w:left w:val="single" w:sz="4" w:space="0" w:color="BFBFBF"/>
-              <w:bottom w:val="single" w:sz="4" w:space="0" w:color="BFBFBF"/>
-              <w:right w:val="single" w:sz="4" w:space="0" w:color="BFBFBF"/>
-            </w:tcBorders>
-            <w:tcMar>
-              <w:top w:w="60" w:type="dxa"/>
-              <w:left w:w="100" w:type="dxa"/>
-              <w:bottom w:w="60" w:type="dxa"/>
-              <w:right w:w="100" w:type="dxa"/>
-            </w:tcMar>
-          </w:tcPr>
-          <w:p>
-            <w:pPr>
-              <w:rPr>
-                <w:sz w:val="19"/>
-                <w:szCs w:val="19"/>
-              </w:rPr>
-            </w:pPr>
-            <w:r>
-              <w:rPr>
-                <w:sz w:val="19"/>
-                <w:szCs w:val="19"/>
-              </w:rPr>
-              <w:t>39569</w:t>
-            </w:r>
-          </w:p>
-          <w:p>
-            <w:pPr>
-              <w:rPr>
-                <w:sz w:val="19"/>
-                <w:szCs w:val="19"/>
-              </w:rPr>
-            </w:pPr>
-            <w:r>
-              <w:rPr>
-                <w:sz w:val="19"/>
-                <w:szCs w:val="19"/>
-              </w:rPr>
-              <w:t>39570</w:t>
-            </w:r>
-          </w:p>
-        </w:tc>
-        <w:tc>
-          <w:tcPr>
-            <w:tcW w:w="2560" w:type="dxa"/>
-            <w:tcBorders>
-              <w:top w:val="single" w:sz="4" w:space="0" w:color="BFBFBF"/>
-              <w:left w:val="single" w:sz="4" w:space="0" w:color="BFBFBF"/>
-              <w:bottom w:val="single" w:sz="4" w:space="0" w:color="BFBFBF"/>
-              <w:right w:val="single" w:sz="4" w:space="0" w:color="BFBFBF"/>
-            </w:tcBorders>
-            <w:tcMar>
-              <w:top w:w="60" w:type="dxa"/>
-              <w:left w:w="100" w:type="dxa"/>
-              <w:bottom w:w="60" w:type="dxa"/>
-              <w:right w:w="100" w:type="dxa"/>
-            </w:tcMar>
-          </w:tcPr>
-          <w:p>
-            <w:pPr>
-              <w:rPr>
-                <w:sz w:val="19"/>
-                <w:szCs w:val="19"/>
-              </w:rPr>
-            </w:pPr>
-            <w:r>
-              <w:rPr>
-                <w:sz w:val="19"/>
-                <w:szCs w:val="19"/>
-              </w:rPr>
-              <w:t>39569 y 39570 verifican lo mismo: sin botón "Ver más", sin paginación ni scroll infinito. 39567 agrega el conteo máximo de 20 y el orden de la más reciente a la más antigua</w:t>
-            </w:r>
-          </w:p>
-        </w:tc>
-        <w:tc>
-          <w:tcPr>
-            <w:tcW w:w="1500" w:type="dxa"/>
-            <w:tcBorders>
-              <w:top w:val="single" w:sz="4" w:space="0" w:color="BFBFBF"/>
-              <w:left w:val="single" w:sz="4" w:space="0" w:color="BFBFBF"/>
-              <w:bottom w:val="single" w:sz="4" w:space="0" w:color="BFBFBF"/>
-              <w:right w:val="single" w:sz="4" w:space="0" w:color="BFBFBF"/>
-            </w:tcBorders>
-            <w:tcMar>
-              <w:top w:w="60" w:type="dxa"/>
-              <w:left w:w="100" w:type="dxa"/>
-              <w:bottom w:w="60" w:type="dxa"/>
-              <w:right w:w="100" w:type="dxa"/>
-            </w:tcMar>
-          </w:tcPr>
-          <w:p>
-            <w:pPr>
-              <w:rPr>
-                <w:sz w:val="19"/>
-                <w:szCs w:val="19"/>
-              </w:rPr>
-            </w:pPr>
-            <w:r>
-              <w:rPr>
-                <w:sz w:val="19"/>
-                <w:szCs w:val="19"/>
-              </w:rPr>
-              <w:t>Construido; ejecutado con éxito el 19/10 (8 movimientos). El corte en 20 queda como observación hasta tener un cliente con más de 20</w:t>
+              <w:lastRenderedPageBreak/>
+              <w:t>Construido; ejecutado con éxito el 19/10. El corte en 20 queda como observación: requiere un cliente con más de 20 movimientos en los últimos 30 días</w:t>
             </w:r>
           </w:p>
         </w:tc>
@@ -2028,6 +2036,7 @@
                 <w:sz w:val="19"/>
                 <w:szCs w:val="19"/>
               </w:rPr>
+              <w:lastRenderedPageBreak/>
               <w:t>Rango de fechas de los movimientos</w:t>
             </w:r>
           </w:p>
@@ -2156,7 +2165,7 @@
                 <w:sz w:val="19"/>
                 <w:szCs w:val="19"/>
               </w:rPr>
-              <w:t>Construido; ejecutado con éxito el 19/10. La exclusión de movimientos de más de un mes queda como observación hasta tener un cliente que los tenga</w:t>
+              <w:t>Construido; ejecutado con éxito el 19/10. Exclusión comprobada con un cliente de 85 transacciones (30 en abril de 2026): la app solo muestra las del último mes</w:t>
             </w:r>
           </w:p>
         </w:tc>
@@ -4295,7 +4304,7 @@
         <w:spacing w:after="60"/>
       </w:pPr>
       <w:r>
-        <w:t>Cliente con movimientos recibido el 19/10 (8 movimientos en el último mes): sirve para 39566, 39571, 39572 y 39573. Para comprobar el corte en 20 (39567, 39569, 39570) y la exclusión de movimientos de más de un mes (39568) se necesita un cliente con más de 20 movimientos y algunos de hace más de 30 días.</w:t>
+        <w:t>Clientes con movimientos recibidos el 19/10: cubren 39566, 39568, 39571, 39572 y 39573. Para comprobar el corte en 20 (39567, 39569, 39570) falta un cliente con más de 20 movimientos en los últimos 30 días: la app solo muestra los movimientos de ese periodo.</w:t>
       </w:r>
     </w:p>
     <w:p>
@@ -6803,6 +6812,168 @@
                 <w:szCs w:val="19"/>
               </w:rPr>
               <w:t>Se valida el archivo en Documents. Confirmar la ubicación esperada</w:t>
+            </w:r>
+          </w:p>
+        </w:tc>
+      </w:tr>
+      <w:tr>
+        <w:tc>
+          <w:tcPr>
+            <w:tcW w:w="500" w:type="dxa"/>
+            <w:tcBorders>
+              <w:top w:val="single" w:sz="4" w:space="0" w:color="BFBFBF"/>
+              <w:left w:val="single" w:sz="4" w:space="0" w:color="BFBFBF"/>
+              <w:bottom w:val="single" w:sz="4" w:space="0" w:color="BFBFBF"/>
+              <w:right w:val="single" w:sz="4" w:space="0" w:color="BFBFBF"/>
+            </w:tcBorders>
+            <w:tcMar>
+              <w:top w:w="60" w:type="dxa"/>
+              <w:left w:w="100" w:type="dxa"/>
+              <w:bottom w:w="60" w:type="dxa"/>
+              <w:right w:w="100" w:type="dxa"/>
+            </w:tcMar>
+          </w:tcPr>
+          <w:p>
+            <w:pPr>
+              <w:rPr>
+                <w:sz w:val="19"/>
+                <w:szCs w:val="19"/>
+              </w:rPr>
+            </w:pPr>
+            <w:r>
+              <w:rPr>
+                <w:sz w:val="19"/>
+                <w:szCs w:val="19"/>
+              </w:rPr>
+              <w:t>17</w:t>
+            </w:r>
+          </w:p>
+        </w:tc>
+        <w:tc>
+          <w:tcPr>
+            <w:tcW w:w="1000" w:type="dxa"/>
+            <w:tcBorders>
+              <w:top w:val="single" w:sz="4" w:space="0" w:color="BFBFBF"/>
+              <w:left w:val="single" w:sz="4" w:space="0" w:color="BFBFBF"/>
+              <w:bottom w:val="single" w:sz="4" w:space="0" w:color="BFBFBF"/>
+              <w:right w:val="single" w:sz="4" w:space="0" w:color="BFBFBF"/>
+            </w:tcBorders>
+            <w:tcMar>
+              <w:top w:w="60" w:type="dxa"/>
+              <w:left w:w="100" w:type="dxa"/>
+              <w:bottom w:w="60" w:type="dxa"/>
+              <w:right w:w="100" w:type="dxa"/>
+            </w:tcMar>
+          </w:tcPr>
+          <w:p>
+            <w:pPr>
+              <w:rPr>
+                <w:sz w:val="19"/>
+                <w:szCs w:val="19"/>
+              </w:rPr>
+            </w:pPr>
+            <w:r>
+              <w:rPr>
+                <w:sz w:val="19"/>
+                <w:szCs w:val="19"/>
+              </w:rPr>
+              <w:t>39567, 39568</w:t>
+            </w:r>
+          </w:p>
+        </w:tc>
+        <w:tc>
+          <w:tcPr>
+            <w:tcW w:w="2700" w:type="dxa"/>
+            <w:tcBorders>
+              <w:top w:val="single" w:sz="4" w:space="0" w:color="BFBFBF"/>
+              <w:left w:val="single" w:sz="4" w:space="0" w:color="BFBFBF"/>
+              <w:bottom w:val="single" w:sz="4" w:space="0" w:color="BFBFBF"/>
+              <w:right w:val="single" w:sz="4" w:space="0" w:color="BFBFBF"/>
+            </w:tcBorders>
+            <w:tcMar>
+              <w:top w:w="60" w:type="dxa"/>
+              <w:left w:w="100" w:type="dxa"/>
+              <w:bottom w:w="60" w:type="dxa"/>
+              <w:right w:w="100" w:type="dxa"/>
+            </w:tcMar>
+          </w:tcPr>
+          <w:p>
+            <w:pPr>
+              <w:rPr>
+                <w:sz w:val="19"/>
+                <w:szCs w:val="19"/>
+              </w:rPr>
+            </w:pPr>
+            <w:r>
+              <w:rPr>
+                <w:sz w:val="19"/>
+                <w:szCs w:val="19"/>
+              </w:rPr>
+              <w:t>39567: se muestran las últimas 20 transacciones. 39568: solo los movimientos del último mes</w:t>
+            </w:r>
+          </w:p>
+        </w:tc>
+        <w:tc>
+          <w:tcPr>
+            <w:tcW w:w="2900" w:type="dxa"/>
+            <w:tcBorders>
+              <w:top w:val="single" w:sz="4" w:space="0" w:color="BFBFBF"/>
+              <w:left w:val="single" w:sz="4" w:space="0" w:color="BFBFBF"/>
+              <w:bottom w:val="single" w:sz="4" w:space="0" w:color="BFBFBF"/>
+              <w:right w:val="single" w:sz="4" w:space="0" w:color="BFBFBF"/>
+            </w:tcBorders>
+            <w:tcMar>
+              <w:top w:w="60" w:type="dxa"/>
+              <w:left w:w="100" w:type="dxa"/>
+              <w:bottom w:w="60" w:type="dxa"/>
+              <w:right w:w="100" w:type="dxa"/>
+            </w:tcMar>
+          </w:tcPr>
+          <w:p>
+            <w:pPr>
+              <w:rPr>
+                <w:sz w:val="19"/>
+                <w:szCs w:val="19"/>
+              </w:rPr>
+            </w:pPr>
+            <w:r>
+              <w:rPr>
+                <w:sz w:val="19"/>
+                <w:szCs w:val="19"/>
+              </w:rPr>
+              <w:t>El aviso dice "Los movimientos mostrados corresponden a las últimas 20 transacciones", pero la app muestra solo los del último mes: un cliente con 85 transacciones (30 en abril) ve 3</w:t>
+            </w:r>
+          </w:p>
+        </w:tc>
+        <w:tc>
+          <w:tcPr>
+            <w:tcW w:w="2260" w:type="dxa"/>
+            <w:tcBorders>
+              <w:top w:val="single" w:sz="4" w:space="0" w:color="BFBFBF"/>
+              <w:left w:val="single" w:sz="4" w:space="0" w:color="BFBFBF"/>
+              <w:bottom w:val="single" w:sz="4" w:space="0" w:color="BFBFBF"/>
+              <w:right w:val="single" w:sz="4" w:space="0" w:color="BFBFBF"/>
+            </w:tcBorders>
+            <w:tcMar>
+              <w:top w:w="60" w:type="dxa"/>
+              <w:left w:w="100" w:type="dxa"/>
+              <w:bottom w:w="60" w:type="dxa"/>
+              <w:right w:w="100" w:type="dxa"/>
+            </w:tcMar>
+          </w:tcPr>
+          <w:p>
+            <w:pPr>
+              <w:rPr>
+                <w:sz w:val="19"/>
+                <w:szCs w:val="19"/>
+              </w:rPr>
+            </w:pPr>
+            <w:r>
+              <w:rPr>
+                <w:sz w:val="19"/>
+                <w:szCs w:val="19"/>
+              </w:rPr>
+              <w:t>Se validan ambas reglas (máximo 20 y último mes). Corregir el texto del aviso para que mencione el periodo</w:t>
             </w:r>
           </w:p>
         </w:tc>

</xml_diff>

<commit_message>
IdPrueba autogenerado, control con una fila por caso y consolidado v5
- IdPrueba: si la fila no lo trae se genera con el prefijo del caso y un
  consecutivo (REG-CC-001, PROD-SALDOS-001, CTA-MOV20-001); si lo trae se usa
- Control reducido a una fila por caso (34)
- Cuenta corriente: la app muestra "Cuentas corrientes **** 1234" (plural);
  38706 y 39562 exitosos con el cliente entregado el 20/10
- Consolidado v5 con las respuestas del equipo funcional del 20/10
- allure-results/ fuera del repositorio

Co-Authored-By: Claude Opus 5.5 <noreply@anthropic.com>
</commit_message>
<xml_diff>
--- a/Casos de Prueba/Consolidacion_Casos_de_Prueba.docx
+++ b/Casos de Prueba/Consolidacion_Casos_de_Prueba.docx
@@ -5,9 +5,10 @@
     <w:p>
       <w:pPr>
         <w:spacing w:after="60"/>
+        <w:rPr>
+          <w:lang w:val="es-MX"/>
+        </w:rPr>
       </w:pPr>
-      <w:bookmarkStart w:id="0" w:name="_GoBack"/>
-      <w:bookmarkEnd w:id="0"/>
       <w:r>
         <w:rPr>
           <w:b/>
@@ -15,6 +16,7 @@
           <w:color w:val="00843D"/>
           <w:sz w:val="40"/>
           <w:szCs w:val="40"/>
+          <w:lang w:val="es-MX"/>
         </w:rPr>
         <w:t>Consolidación de casos de prueba</w:t>
       </w:r>
@@ -25,12 +27,81 @@
           <w:bottom w:val="single" w:sz="8" w:space="4" w:color="00843D"/>
         </w:pBdr>
         <w:spacing w:after="240"/>
+        <w:rPr>
+          <w:lang w:val="es-MX"/>
+        </w:rPr>
       </w:pPr>
       <w:r>
         <w:rPr>
           <w:color w:val="595959"/>
+          <w:lang w:val="es-MX"/>
         </w:rPr>
-        <w:t>App Mi Banco · Procesos Registro, Autenticación, Home y Cuentas · Versión 4 · 14 de octubre de 2026</w:t>
+        <w:t xml:space="preserve">App Mi Banco · Procesos Registro, Autenticación, Home y Cuentas · Versión 5 · 20 de octubre de 2026</w:t>
+      </w:r>
+    </w:p>
+    <w:p>
+      <w:pPr>
+        <w:pStyle w:val="Ttulo1"/>
+        <w:spacing w:before="280" w:after="120"/>
+        <w:rPr>
+          <w:lang w:val="es-MX"/>
+        </w:rPr>
+      </w:pPr>
+      <w:r>
+        <w:rPr>
+          <w:lang w:val="es-MX"/>
+        </w:rPr>
+        <w:t>1. Propósito</w:t>
+      </w:r>
+    </w:p>
+    <w:p>
+      <w:pPr>
+        <w:spacing w:after="120"/>
+        <w:rPr>
+          <w:lang w:val="es-MX"/>
+        </w:rPr>
+      </w:pPr>
+      <w:r>
+        <w:rPr>
+          <w:lang w:val="es-MX"/>
+        </w:rPr>
+        <w:t>Este documento identifica los casos de prueba planificados en Azure DevOps que se solapan entre sí: casos que siguen el mismo flujo en la app y solo cambian los datos de entrada. Para la automatización, cada grupo se atiende con un único escenario, lo que reduce código a mantener y tiempo de ejecución sin perder cobertura.</w:t>
+      </w:r>
+    </w:p>
+    <w:p>
+      <w:pPr>
+        <w:spacing w:after="120"/>
+        <w:rPr>
+          <w:lang w:val="es-MX"/>
+        </w:rPr>
+      </w:pPr>
+      <w:r>
+        <w:rPr>
+          <w:lang w:val="es-MX"/>
+        </w:rPr>
+        <w:t xml:space="preserve">Fuentes: "Proyecto App_Autenticación y Registro.xlsx" (11 casos), "Proyecto App_Home.xlsx" (14 casos) y "Proyecto App_Cuentas (Inclu. 7x24).xlsx" (13 casos), exportados de Azure DevOps.</w:t>
+      </w:r>
+    </w:p>
+    <w:p>
+      <w:pPr>
+        <w:spacing w:after="120"/>
+        <w:rPr>
+          <w:lang w:val="es-MX"/>
+        </w:rPr>
+      </w:pPr>
+      <w:r>
+        <w:rPr>
+          <w:b/>
+          <w:bCs/>
+          <w:lang w:val="es-MX"/>
+        </w:rPr>
+        <w:t xml:space="preserve">Importante: </w:t>
+      </w:r>
+      <w:r>
+        <w:rPr>
+          <w:lang w:val="es-MX"/>
+        </w:rPr>
+        <w:t xml:space="preserve">las agrupaciones, el caso descartado y las verificaciones manuales son una propuesta de GreenSQA construida a partir del texto de cada caso en Azure. El equipo funcional las aprobó el 20/10/2026.</w:t>
       </w:r>
     </w:p>
     <w:p>
@@ -39,47 +110,7 @@
         <w:spacing w:before="280" w:after="120"/>
       </w:pPr>
       <w:r>
-        <w:t>1. Propósito</w:t>
-      </w:r>
-    </w:p>
-    <w:p>
-      <w:pPr>
-        <w:spacing w:after="120"/>
-      </w:pPr>
-      <w:r>
-        <w:t>Este documento identifica los casos de prueba planificados en Azure DevOps que se solapan entre sí: casos que siguen el mismo flujo en la app y solo cambian los datos de entrada. Para la automatización, cada grupo se atiende con un único escenario, lo que reduce código a mantener y tiempo de ejecución sin perder cobertura.</w:t>
-      </w:r>
-    </w:p>
-    <w:p>
-      <w:pPr>
-        <w:spacing w:after="120"/>
-      </w:pPr>
-      <w:r>
-        <w:t>Fuentes: "Proyecto App_Autenticación y Registro.xlsx" (11 casos), "Proyecto App_Home.xlsx" (14 casos) y "Proyecto App_Cuentas (Inclu. 7x24).xlsx" (13 casos), exportados de Azure DevOps.</w:t>
-      </w:r>
-    </w:p>
-    <w:p>
-      <w:pPr>
-        <w:spacing w:after="120"/>
-      </w:pPr>
-      <w:r>
-        <w:rPr>
-          <w:b/>
-          <w:bCs/>
-        </w:rPr>
-        <w:t xml:space="preserve">Importante: </w:t>
-      </w:r>
-      <w:r>
-        <w:t>las agrupaciones, el caso propuesto para descartar y las verificaciones manuales son una propuesta de GreenSQA, construida a partir del texto de cada caso en Azure. No están escritas en los casos y requieren aprobación del equipo.</w:t>
-      </w:r>
-    </w:p>
-    <w:p>
-      <w:pPr>
-        <w:pStyle w:val="Ttulo1"/>
-        <w:spacing w:before="280" w:after="120"/>
-      </w:pPr>
-      <w:r>
-        <w:t>2. Cómo funciona la consolidación</w:t>
+        <w:t xml:space="preserve">2. Cómo funciona la consolidación</w:t>
       </w:r>
     </w:p>
     <w:p>
@@ -90,16 +121,23 @@
           <w:numId w:val="2"/>
         </w:numPr>
         <w:spacing w:after="60"/>
+        <w:rPr>
+          <w:lang w:val="es-MX"/>
+        </w:rPr>
       </w:pPr>
       <w:r>
         <w:rPr>
           <w:b/>
           <w:bCs/>
+          <w:lang w:val="es-MX"/>
         </w:rPr>
         <w:t xml:space="preserve">Un escenario, varios IDs: </w:t>
       </w:r>
       <w:r>
-        <w:t>el escenario Gherkin lleva el tag de cada caso que cubre (por ejemplo @38498 @38502).</w:t>
+        <w:rPr>
+          <w:lang w:val="es-MX"/>
+        </w:rPr>
+        <w:t xml:space="preserve">el escenario Gherkin lleva el tag de cada caso que cubre (por ejemplo @38498 @38502).</w:t>
       </w:r>
     </w:p>
     <w:p>
@@ -110,15 +148,22 @@
           <w:numId w:val="2"/>
         </w:numPr>
         <w:spacing w:after="60"/>
+        <w:rPr>
+          <w:lang w:val="es-MX"/>
+        </w:rPr>
       </w:pPr>
       <w:r>
         <w:rPr>
           <w:b/>
           <w:bCs/>
+          <w:lang w:val="es-MX"/>
         </w:rPr>
         <w:t xml:space="preserve">Los datos están en el archivo de control: </w:t>
       </w:r>
       <w:r>
+        <w:rPr>
+          <w:lang w:val="es-MX"/>
+        </w:rPr>
         <w:t>cada fila de Control_Ejecucion.xlsx indica el caso, el tipo de documento y el dato a usar. Así 38498 y 38502 son dos filas del mismo escenario, una con CC y otra con CE.</w:t>
       </w:r>
     </w:p>
@@ -130,15 +175,22 @@
           <w:numId w:val="2"/>
         </w:numPr>
         <w:spacing w:after="60"/>
+        <w:rPr>
+          <w:lang w:val="es-MX"/>
+        </w:rPr>
       </w:pPr>
       <w:r>
         <w:rPr>
           <w:b/>
           <w:bCs/>
+          <w:lang w:val="es-MX"/>
         </w:rPr>
         <w:t xml:space="preserve">El resultado se reporta por caso: </w:t>
       </w:r>
       <w:r>
+        <w:rPr>
+          <w:lang w:val="es-MX"/>
+        </w:rPr>
         <w:t>cada fila del control queda con su ID de Azure en el reporte, por lo que la trazabilidad por caso se mantiene.</w:t>
       </w:r>
     </w:p>
@@ -150,15 +202,22 @@
           <w:numId w:val="2"/>
         </w:numPr>
         <w:spacing w:after="60"/>
+        <w:rPr>
+          <w:lang w:val="es-MX"/>
+        </w:rPr>
       </w:pPr>
       <w:r>
         <w:rPr>
           <w:b/>
           <w:bCs/>
+          <w:lang w:val="es-MX"/>
         </w:rPr>
         <w:t xml:space="preserve">En Azure DevOps no se eliminan los casos absorbidos: </w:t>
       </w:r>
       <w:r>
+        <w:rPr>
+          <w:lang w:val="es-MX"/>
+        </w:rPr>
         <w:t>se recomienda conservarlos y marcarlos como "cubierto por la automatización del caso principal".</w:t>
       </w:r>
     </w:p>
@@ -166,16 +225,28 @@
       <w:pPr>
         <w:pStyle w:val="Ttulo1"/>
         <w:spacing w:before="280" w:after="120"/>
+        <w:rPr>
+          <w:lang w:val="es-MX"/>
+        </w:rPr>
       </w:pPr>
       <w:r>
+        <w:rPr>
+          <w:lang w:val="es-MX"/>
+        </w:rPr>
         <w:t>3. Tabla de consolidación</w:t>
       </w:r>
     </w:p>
     <w:p>
       <w:pPr>
         <w:spacing w:after="120"/>
+        <w:rPr>
+          <w:lang w:val="es-MX"/>
+        </w:rPr>
       </w:pPr>
       <w:r>
+        <w:rPr>
+          <w:lang w:val="es-MX"/>
+        </w:rPr>
         <w:t>Casos automatizables y el escenario que los atiende:</w:t>
       </w:r>
     </w:p>
@@ -233,7 +304,7 @@
                 <w:sz w:val="19"/>
                 <w:szCs w:val="19"/>
               </w:rPr>
-              <w:t>Escenario automatizado</w:t>
+              <w:t xml:space="preserve">Escenario automatizado</w:t>
             </w:r>
           </w:p>
         </w:tc>
@@ -293,7 +364,7 @@
                 <w:sz w:val="19"/>
                 <w:szCs w:val="19"/>
               </w:rPr>
-              <w:t>Casos absorbidos</w:t>
+              <w:t xml:space="preserve">Casos absorbidos</w:t>
             </w:r>
           </w:p>
         </w:tc>
@@ -323,7 +394,7 @@
                 <w:sz w:val="19"/>
                 <w:szCs w:val="19"/>
               </w:rPr>
-              <w:t>Qué varía entre ellos</w:t>
+              <w:t xml:space="preserve">Qué varía entre ellos</w:t>
             </w:r>
           </w:p>
         </w:tc>
@@ -381,7 +452,7 @@
                 <w:sz w:val="19"/>
                 <w:szCs w:val="19"/>
               </w:rPr>
-              <w:t>Registro exitoso</w:t>
+              <w:t xml:space="preserve">Registro exitoso</w:t>
             </w:r>
           </w:p>
         </w:tc>
@@ -454,10 +525,16 @@
             </w:tcMar>
           </w:tcPr>
           <w:p>
-            <w:r>
-              <w:rPr>
-                <w:sz w:val="19"/>
-                <w:szCs w:val="19"/>
+            <w:pPr>
+              <w:rPr>
+                <w:lang w:val="es-MX"/>
+              </w:rPr>
+            </w:pPr>
+            <w:r>
+              <w:rPr>
+                <w:sz w:val="19"/>
+                <w:szCs w:val="19"/>
+                <w:lang w:val="es-MX"/>
               </w:rPr>
               <w:t>Tipo de documento, definido en el archivo de control</w:t>
             </w:r>
@@ -484,8 +561,16 @@
               <w:rPr>
                 <w:sz w:val="19"/>
                 <w:szCs w:val="19"/>
-              </w:rPr>
-              <w:t>Construido; ejecutado con éxito en CC. CE bloqueado por datos</w:t>
+                <w:lang w:val="es-MX"/>
+              </w:rPr>
+              <w:t xml:space="preserve">Construido; ejecutado con éxito en CC. </w:t>
+            </w:r>
+            <w:r>
+              <w:rPr>
+                <w:sz w:val="19"/>
+                <w:szCs w:val="19"/>
+              </w:rPr>
+              <w:t xml:space="preserve">CE bloqueado por datos</w:t>
             </w:r>
           </w:p>
         </w:tc>
@@ -509,10 +594,16 @@
             </w:tcMar>
           </w:tcPr>
           <w:p>
-            <w:r>
-              <w:rPr>
-                <w:sz w:val="19"/>
-                <w:szCs w:val="19"/>
+            <w:pPr>
+              <w:rPr>
+                <w:lang w:val="es-MX"/>
+              </w:rPr>
+            </w:pPr>
+            <w:r>
+              <w:rPr>
+                <w:sz w:val="19"/>
+                <w:szCs w:val="19"/>
+                <w:lang w:val="es-MX"/>
               </w:rPr>
               <w:t>Registro exitoso con envío de SMS</w:t>
             </w:r>
@@ -590,10 +681,16 @@
             </w:tcMar>
           </w:tcPr>
           <w:p>
-            <w:r>
-              <w:rPr>
-                <w:sz w:val="19"/>
-                <w:szCs w:val="19"/>
+            <w:pPr>
+              <w:rPr>
+                <w:lang w:val="es-MX"/>
+              </w:rPr>
+            </w:pPr>
+            <w:r>
+              <w:rPr>
+                <w:sz w:val="19"/>
+                <w:szCs w:val="19"/>
+                <w:lang w:val="es-MX"/>
               </w:rPr>
               <w:t>Tipo de documento. Reutiliza los pasos del registro y agrega la verificación del SMS en un dispositivo real con la línea asignada al cliente</w:t>
             </w:r>
@@ -617,10 +714,16 @@
             </w:tcMar>
           </w:tcPr>
           <w:p>
-            <w:r>
-              <w:rPr>
-                <w:sz w:val="19"/>
-                <w:szCs w:val="19"/>
+            <w:pPr>
+              <w:rPr>
+                <w:lang w:val="es-MX"/>
+              </w:rPr>
+            </w:pPr>
+            <w:r>
+              <w:rPr>
+                <w:sz w:val="19"/>
+                <w:szCs w:val="19"/>
+                <w:lang w:val="es-MX"/>
               </w:rPr>
               <w:t>Construido; requiere línea asociada al cliente</w:t>
             </w:r>
@@ -650,7 +753,7 @@
                 <w:sz w:val="19"/>
                 <w:szCs w:val="19"/>
               </w:rPr>
-              <w:t>Login exitoso → Home</w:t>
+              <w:t xml:space="preserve">Login exitoso → Home</w:t>
             </w:r>
           </w:p>
         </w:tc>
@@ -728,7 +831,7 @@
                 <w:sz w:val="19"/>
                 <w:szCs w:val="19"/>
               </w:rPr>
-              <w:t>Tipo de documento</w:t>
+              <w:t xml:space="preserve">Tipo de documento</w:t>
             </w:r>
           </w:p>
         </w:tc>
@@ -783,7 +886,7 @@
                 <w:sz w:val="19"/>
                 <w:szCs w:val="19"/>
               </w:rPr>
-              <w:t>Recuperación de clave</w:t>
+              <w:t xml:space="preserve">Recuperación de clave</w:t>
             </w:r>
           </w:p>
         </w:tc>
@@ -859,18 +962,18 @@
             </w:tcMar>
           </w:tcPr>
           <w:p>
-            <w:r>
-              <w:rPr>
-                <w:sz w:val="19"/>
-                <w:szCs w:val="19"/>
+            <w:pPr>
+              <w:rPr>
+                <w:lang w:val="es-MX"/>
+              </w:rPr>
+            </w:pPr>
+            <w:r>
+              <w:rPr>
+                <w:sz w:val="19"/>
+                <w:szCs w:val="19"/>
+                <w:lang w:val="es-MX"/>
               </w:rPr>
               <w:t xml:space="preserve">El flujo de 38529 pasa por la validación OTP de 38526; ese </w:t>
-            </w:r>
-            <w:r>
-              <w:rPr>
-                <w:sz w:val="19"/>
-                <w:szCs w:val="19"/>
-              </w:rPr>
               <w:lastRenderedPageBreak/>
               <w:t>punto se verifica dentro del mismo escenario</w:t>
             </w:r>
@@ -928,7 +1031,7 @@
                 <w:sz w:val="19"/>
                 <w:szCs w:val="19"/>
               </w:rPr>
-              <w:t>Encabezado del Home</w:t>
+              <w:t xml:space="preserve">Encabezado del Home</w:t>
             </w:r>
           </w:p>
         </w:tc>
@@ -1001,10 +1104,16 @@
             </w:tcMar>
           </w:tcPr>
           <w:p>
-            <w:r>
-              <w:rPr>
-                <w:sz w:val="19"/>
-                <w:szCs w:val="19"/>
+            <w:pPr>
+              <w:rPr>
+                <w:lang w:val="es-MX"/>
+              </w:rPr>
+            </w:pPr>
+            <w:r>
+              <w:rPr>
+                <w:sz w:val="19"/>
+                <w:szCs w:val="19"/>
+                <w:lang w:val="es-MX"/>
               </w:rPr>
               <w:t>Los pasos 1 a 5 de 38700 son los mismos de 38699; 38700 agrega la fecha de último ingreso</w:t>
             </w:r>
@@ -1061,7 +1170,7 @@
                 <w:sz w:val="19"/>
                 <w:szCs w:val="19"/>
               </w:rPr>
-              <w:t>Accesos directos del Home</w:t>
+              <w:t xml:space="preserve">Accesos directos del Home</w:t>
             </w:r>
           </w:p>
         </w:tc>
@@ -1146,10 +1255,16 @@
             </w:tcMar>
           </w:tcPr>
           <w:p>
-            <w:r>
-              <w:rPr>
-                <w:sz w:val="19"/>
-                <w:szCs w:val="19"/>
+            <w:pPr>
+              <w:rPr>
+                <w:lang w:val="es-MX"/>
+              </w:rPr>
+            </w:pPr>
+            <w:r>
+              <w:rPr>
+                <w:sz w:val="19"/>
+                <w:szCs w:val="19"/>
+                <w:lang w:val="es-MX"/>
               </w:rPr>
               <w:t>Acceso a validar (Bre-B, Pedir crédito) y menú (superior o inferior)</w:t>
             </w:r>
@@ -1206,7 +1321,7 @@
                 <w:sz w:val="19"/>
                 <w:szCs w:val="19"/>
               </w:rPr>
-              <w:t>Productos del cliente</w:t>
+              <w:t xml:space="preserve">Productos del cliente</w:t>
             </w:r>
           </w:p>
         </w:tc>
@@ -1257,12 +1372,14 @@
               <w:rPr>
                 <w:sz w:val="19"/>
                 <w:szCs w:val="19"/>
-              </w:rPr>
-            </w:pPr>
-            <w:r>
-              <w:rPr>
-                <w:sz w:val="19"/>
-                <w:szCs w:val="19"/>
+                <w:lang w:val="es-MX"/>
+              </w:rPr>
+            </w:pPr>
+            <w:r>
+              <w:rPr>
+                <w:sz w:val="19"/>
+                <w:szCs w:val="19"/>
+                <w:lang w:val="es-MX"/>
               </w:rPr>
               <w:t>38706 (corriente)</w:t>
             </w:r>
@@ -1272,12 +1389,14 @@
               <w:rPr>
                 <w:sz w:val="19"/>
                 <w:szCs w:val="19"/>
-              </w:rPr>
-            </w:pPr>
-            <w:r>
-              <w:rPr>
-                <w:sz w:val="19"/>
-                <w:szCs w:val="19"/>
+                <w:lang w:val="es-MX"/>
+              </w:rPr>
+            </w:pPr>
+            <w:r>
+              <w:rPr>
+                <w:sz w:val="19"/>
+                <w:szCs w:val="19"/>
+                <w:lang w:val="es-MX"/>
               </w:rPr>
               <w:t>38707 (libre inversión)</w:t>
             </w:r>
@@ -1287,12 +1406,14 @@
               <w:rPr>
                 <w:sz w:val="19"/>
                 <w:szCs w:val="19"/>
-              </w:rPr>
-            </w:pPr>
-            <w:r>
-              <w:rPr>
-                <w:sz w:val="19"/>
-                <w:szCs w:val="19"/>
+                <w:lang w:val="es-MX"/>
+              </w:rPr>
+            </w:pPr>
+            <w:r>
+              <w:rPr>
+                <w:sz w:val="19"/>
+                <w:szCs w:val="19"/>
+                <w:lang w:val="es-MX"/>
               </w:rPr>
               <w:t>38708 (rotativo)</w:t>
             </w:r>
@@ -1302,12 +1423,14 @@
               <w:rPr>
                 <w:sz w:val="19"/>
                 <w:szCs w:val="19"/>
-              </w:rPr>
-            </w:pPr>
-            <w:r>
-              <w:rPr>
-                <w:sz w:val="19"/>
-                <w:szCs w:val="19"/>
+                <w:lang w:val="es-MX"/>
+              </w:rPr>
+            </w:pPr>
+            <w:r>
+              <w:rPr>
+                <w:sz w:val="19"/>
+                <w:szCs w:val="19"/>
+                <w:lang w:val="es-MX"/>
               </w:rPr>
               <w:t>38702 (pre aprobado)</w:t>
             </w:r>
@@ -1358,8 +1481,16 @@
               <w:rPr>
                 <w:sz w:val="19"/>
                 <w:szCs w:val="19"/>
-              </w:rPr>
-              <w:t>Tipo de producto; requiere un cliente que tenga ese producto. 38709 valida los saldos de esas mismas tarjetas. 39561, 39562, 39563, 39564 y 39565 repiten el texto de 38705, 38706, 38707, 38708 y 38709</w:t>
+                <w:lang w:val="es-MX"/>
+              </w:rPr>
+              <w:t xml:space="preserve">Tipo de producto; requiere un cliente que tenga ese producto. 38709 valida los saldos de esas mismas tarjetas. 39561 a 39565 son duplicados de 38705 a 38709 (confirmado por el equipo funcional el 20/10)</w:t>
+            </w:r>
+            <w:r>
+              <w:rPr>
+                <w:sz w:val="19"/>
+                <w:szCs w:val="19"/>
+              </w:rPr>
+              <w:t/>
             </w:r>
           </w:p>
         </w:tc>
@@ -1380,12 +1511,18 @@
             </w:tcMar>
           </w:tcPr>
           <w:p>
-            <w:r>
-              <w:rPr>
-                <w:sz w:val="19"/>
-                <w:szCs w:val="19"/>
-              </w:rPr>
-              <w:t>Construido; 38705, 38707, 38708 y 38702 ejecutados con éxito. 39561, 39563 y 39564 ejecutados con éxito el 15/10. 38706 y 39562 sin datos; 38709 y 39565 sin monto del backend</w:t>
+            <w:pPr>
+              <w:rPr>
+                <w:lang w:val="es-MX"/>
+              </w:rPr>
+            </w:pPr>
+            <w:r>
+              <w:rPr>
+                <w:sz w:val="19"/>
+                <w:szCs w:val="19"/>
+                <w:lang w:val="es-MX"/>
+              </w:rPr>
+              <w:t xml:space="preserve">Construido y ejecutado con éxito: 38705, 38706, 38707, 38708, 38702, 38709, 39561, 39562, 39563 y 39564. 39565 usa el mismo escenario de 38709; su ejecución del 20/10 no se completó por indisponibilidad del ambiente (503)</w:t>
             </w:r>
           </w:p>
         </w:tc>
@@ -1414,7 +1551,7 @@
                 <w:sz w:val="19"/>
                 <w:szCs w:val="19"/>
               </w:rPr>
-              <w:t>Banner "Exclusivo para ti"</w:t>
+              <w:t xml:space="preserve">Banner "Exclusivo para ti"</w:t>
             </w:r>
           </w:p>
         </w:tc>
@@ -1517,12 +1654,18 @@
             </w:tcMar>
           </w:tcPr>
           <w:p>
-            <w:r>
-              <w:rPr>
-                <w:sz w:val="19"/>
-                <w:szCs w:val="19"/>
-              </w:rPr>
-              <w:t>Construido; ejecutado con éxito el 15/10 (2 campañas). Con una sola campaña, el deslizamiento queda como observación</w:t>
+            <w:pPr>
+              <w:rPr>
+                <w:lang w:val="es-MX"/>
+              </w:rPr>
+            </w:pPr>
+            <w:r>
+              <w:rPr>
+                <w:sz w:val="19"/>
+                <w:szCs w:val="19"/>
+                <w:lang w:val="es-MX"/>
+              </w:rPr>
+              <w:t>Construido; (2 campañas). Con una sola campaña, el deslizamiento queda como observación</w:t>
             </w:r>
           </w:p>
         </w:tc>
@@ -1545,12 +1688,18 @@
             </w:tcMar>
           </w:tcPr>
           <w:p>
-            <w:r>
-              <w:rPr>
-                <w:sz w:val="19"/>
-                <w:szCs w:val="19"/>
-              </w:rPr>
-              <w:t>Skeleton de carga del Home</w:t>
+            <w:pPr>
+              <w:rPr>
+                <w:lang w:val="es-MX"/>
+              </w:rPr>
+            </w:pPr>
+            <w:r>
+              <w:rPr>
+                <w:sz w:val="19"/>
+                <w:szCs w:val="19"/>
+                <w:lang w:val="es-MX"/>
+              </w:rPr>
+              <w:t xml:space="preserve">Skeleton de carga del Home</w:t>
             </w:r>
           </w:p>
         </w:tc>
@@ -1649,12 +1798,18 @@
             </w:tcMar>
           </w:tcPr>
           <w:p>
-            <w:r>
-              <w:rPr>
-                <w:sz w:val="19"/>
-                <w:szCs w:val="19"/>
-              </w:rPr>
-              <w:t>Construido; ejecutado con éxito (lectura de la página por DevTools)</w:t>
+            <w:pPr>
+              <w:rPr>
+                <w:lang w:val="es-MX"/>
+              </w:rPr>
+            </w:pPr>
+            <w:r>
+              <w:rPr>
+                <w:sz w:val="19"/>
+                <w:szCs w:val="19"/>
+                <w:lang w:val="es-MX"/>
+              </w:rPr>
+              <w:t xml:space="preserve">Construido; (lectura de la página por DevTools)</w:t>
             </w:r>
           </w:p>
         </w:tc>
@@ -1688,7 +1843,7 @@
                 <w:sz w:val="19"/>
                 <w:szCs w:val="19"/>
               </w:rPr>
-              <w:t>Detalle de cuenta</w:t>
+              <w:t xml:space="preserve">Detalle de cuenta</w:t>
             </w:r>
           </w:p>
         </w:tc>
@@ -1809,14 +1964,16 @@
               <w:rPr>
                 <w:sz w:val="19"/>
                 <w:szCs w:val="19"/>
-              </w:rPr>
-            </w:pPr>
-            <w:r>
-              <w:rPr>
-                <w:sz w:val="19"/>
-                <w:szCs w:val="19"/>
-              </w:rPr>
-              <w:t>Construido; ejecutado con éxito el 15/10 (cliente sin movimientos) y el 19/10 con el cliente con movimientos</w:t>
+                <w:lang w:val="es-MX"/>
+              </w:rPr>
+            </w:pPr>
+            <w:r>
+              <w:rPr>
+                <w:sz w:val="19"/>
+                <w:szCs w:val="19"/>
+                <w:lang w:val="es-MX"/>
+              </w:rPr>
+              <w:t xml:space="preserve">Construido; (cliente sin movimientos) y   cliente con movimientos</w:t>
             </w:r>
           </w:p>
         </w:tc>
@@ -1843,12 +2000,14 @@
               <w:rPr>
                 <w:sz w:val="19"/>
                 <w:szCs w:val="19"/>
-              </w:rPr>
-            </w:pPr>
-            <w:r>
-              <w:rPr>
-                <w:sz w:val="19"/>
-                <w:szCs w:val="19"/>
+                <w:lang w:val="es-MX"/>
+              </w:rPr>
+            </w:pPr>
+            <w:r>
+              <w:rPr>
+                <w:sz w:val="19"/>
+                <w:szCs w:val="19"/>
+                <w:lang w:val="es-MX"/>
               </w:rPr>
               <w:t>Movimientos de la cuenta: tope de 20 y sin paginación</w:t>
             </w:r>
@@ -1954,22 +2113,16 @@
               <w:rPr>
                 <w:sz w:val="19"/>
                 <w:szCs w:val="19"/>
-              </w:rPr>
-            </w:pPr>
-            <w:r>
-              <w:rPr>
-                <w:sz w:val="19"/>
-                <w:szCs w:val="19"/>
-              </w:rPr>
-              <w:t xml:space="preserve">39569 y 39570 verifican lo mismo: sin botón "Ver más", sin paginación ni scroll infinito. 39567 agrega el </w:t>
-            </w:r>
-            <w:r>
-              <w:rPr>
-                <w:sz w:val="19"/>
-                <w:szCs w:val="19"/>
-              </w:rPr>
-              <w:lastRenderedPageBreak/>
-              <w:t>conteo máximo de 20 y el orden de la más reciente a la más antigua</w:t>
+                <w:lang w:val="es-MX"/>
+              </w:rPr>
+            </w:pPr>
+            <w:r>
+              <w:rPr>
+                <w:sz w:val="19"/>
+                <w:szCs w:val="19"/>
+                <w:lang w:val="es-MX"/>
+              </w:rPr>
+              <w:t xml:space="preserve">39569 y 39570 verifican lo mismo: sin botón "Ver más", sin paginación ni scroll infinito. 39567 agrega el conteo máximo de 20 y el orden de la más reciente a la más antigua</w:t>
             </w:r>
           </w:p>
         </w:tc>
@@ -1994,15 +2147,16 @@
               <w:rPr>
                 <w:sz w:val="19"/>
                 <w:szCs w:val="19"/>
-              </w:rPr>
-            </w:pPr>
-            <w:r>
-              <w:rPr>
-                <w:sz w:val="19"/>
-                <w:szCs w:val="19"/>
-              </w:rPr>
-              <w:lastRenderedPageBreak/>
-              <w:t>Construido; ejecutado con éxito el 19/10. El corte en 20 queda como observación: requiere un cliente con más de 20 movimientos en los últimos 30 días</w:t>
+                <w:lang w:val="es-MX"/>
+              </w:rPr>
+            </w:pPr>
+            <w:r>
+              <w:rPr>
+                <w:sz w:val="19"/>
+                <w:szCs w:val="19"/>
+                <w:lang w:val="es-MX"/>
+              </w:rPr>
+              <w:t>Construido; El corte en 20 queda como observación: requiere un cliente con más de 20 movimientos en los últimos 30 días</w:t>
             </w:r>
           </w:p>
         </w:tc>
@@ -2029,15 +2183,116 @@
               <w:rPr>
                 <w:sz w:val="19"/>
                 <w:szCs w:val="19"/>
-              </w:rPr>
-            </w:pPr>
-            <w:r>
-              <w:rPr>
-                <w:sz w:val="19"/>
-                <w:szCs w:val="19"/>
-              </w:rPr>
+                <w:lang w:val="es-MX"/>
+              </w:rPr>
+            </w:pPr>
+            <w:r>
+              <w:rPr>
+                <w:sz w:val="19"/>
+                <w:szCs w:val="19"/>
+                <w:lang w:val="es-MX"/>
+              </w:rPr>
+              <w:t>Rango de fechas de los movimientos</w:t>
+            </w:r>
+          </w:p>
+        </w:tc>
+        <w:tc>
+          <w:tcPr>
+            <w:tcW w:w="1500" w:type="dxa"/>
+            <w:tcBorders>
+              <w:top w:val="single" w:sz="4" w:space="0" w:color="BFBFBF"/>
+              <w:left w:val="single" w:sz="4" w:space="0" w:color="BFBFBF"/>
+              <w:bottom w:val="single" w:sz="4" w:space="0" w:color="BFBFBF"/>
+              <w:right w:val="single" w:sz="4" w:space="0" w:color="BFBFBF"/>
+            </w:tcBorders>
+            <w:tcMar>
+              <w:top w:w="60" w:type="dxa"/>
+              <w:left w:w="100" w:type="dxa"/>
+              <w:bottom w:w="60" w:type="dxa"/>
+              <w:right w:w="100" w:type="dxa"/>
+            </w:tcMar>
+          </w:tcPr>
+          <w:p>
+            <w:pPr>
+              <w:rPr>
+                <w:sz w:val="19"/>
+                <w:szCs w:val="19"/>
+              </w:rPr>
+            </w:pPr>
+            <w:r>
+              <w:rPr>
+                <w:sz w:val="19"/>
+                <w:szCs w:val="19"/>
+              </w:rPr>
+              <w:t>39568</w:t>
+            </w:r>
+          </w:p>
+        </w:tc>
+        <w:tc>
+          <w:tcPr>
+            <w:tcW w:w="1900" w:type="dxa"/>
+            <w:tcBorders>
+              <w:top w:val="single" w:sz="4" w:space="0" w:color="BFBFBF"/>
+              <w:left w:val="single" w:sz="4" w:space="0" w:color="BFBFBF"/>
+              <w:bottom w:val="single" w:sz="4" w:space="0" w:color="BFBFBF"/>
+              <w:right w:val="single" w:sz="4" w:space="0" w:color="BFBFBF"/>
+            </w:tcBorders>
+            <w:tcMar>
+              <w:top w:w="60" w:type="dxa"/>
+              <w:left w:w="100" w:type="dxa"/>
+              <w:bottom w:w="60" w:type="dxa"/>
+              <w:right w:w="100" w:type="dxa"/>
+            </w:tcMar>
+          </w:tcPr>
+          <w:p>
+            <w:pPr>
+              <w:rPr>
+                <w:sz w:val="19"/>
+                <w:szCs w:val="19"/>
+              </w:rPr>
+            </w:pPr>
+            <w:r>
+              <w:rPr>
+                <w:sz w:val="19"/>
+                <w:szCs w:val="19"/>
+              </w:rPr>
+              <w:t>—</w:t>
+            </w:r>
+          </w:p>
+        </w:tc>
+        <w:tc>
+          <w:tcPr>
+            <w:tcW w:w="2560" w:type="dxa"/>
+            <w:tcBorders>
+              <w:top w:val="single" w:sz="4" w:space="0" w:color="BFBFBF"/>
+              <w:left w:val="single" w:sz="4" w:space="0" w:color="BFBFBF"/>
+              <w:bottom w:val="single" w:sz="4" w:space="0" w:color="BFBFBF"/>
+              <w:right w:val="single" w:sz="4" w:space="0" w:color="BFBFBF"/>
+            </w:tcBorders>
+            <w:tcMar>
+              <w:top w:w="60" w:type="dxa"/>
+              <w:left w:w="100" w:type="dxa"/>
+              <w:bottom w:w="60" w:type="dxa"/>
+              <w:right w:w="100" w:type="dxa"/>
+            </w:tcMar>
+          </w:tcPr>
+          <w:p>
+            <w:pPr>
+              <w:rPr>
+                <w:sz w:val="19"/>
+                <w:szCs w:val="19"/>
+                <w:lang w:val="es-MX"/>
+              </w:rPr>
+            </w:pPr>
+            <w:r>
+              <w:rPr>
+                <w:sz w:val="19"/>
+                <w:szCs w:val="19"/>
+                <w:lang w:val="es-MX"/>
+              </w:rPr>
+              <w:t xml:space="preserve">Reutiliza el ingreso al detalle de cuenta; valida que todas </w:t>
               <w:lastRenderedPageBreak/>
-              <w:t>Rango de fechas de los movimientos</w:t>
+              <w:t>las fechas estén dentro del último mes</w:t>
             </w:r>
           </w:p>
         </w:tc>
@@ -2062,110 +2317,19 @@
               <w:rPr>
                 <w:sz w:val="19"/>
                 <w:szCs w:val="19"/>
-              </w:rPr>
-            </w:pPr>
-            <w:r>
-              <w:rPr>
-                <w:sz w:val="19"/>
-                <w:szCs w:val="19"/>
-              </w:rPr>
-              <w:t>39568</w:t>
-            </w:r>
-          </w:p>
-        </w:tc>
-        <w:tc>
-          <w:tcPr>
-            <w:tcW w:w="1900" w:type="dxa"/>
-            <w:tcBorders>
-              <w:top w:val="single" w:sz="4" w:space="0" w:color="BFBFBF"/>
-              <w:left w:val="single" w:sz="4" w:space="0" w:color="BFBFBF"/>
-              <w:bottom w:val="single" w:sz="4" w:space="0" w:color="BFBFBF"/>
-              <w:right w:val="single" w:sz="4" w:space="0" w:color="BFBFBF"/>
-            </w:tcBorders>
-            <w:tcMar>
-              <w:top w:w="60" w:type="dxa"/>
-              <w:left w:w="100" w:type="dxa"/>
-              <w:bottom w:w="60" w:type="dxa"/>
-              <w:right w:w="100" w:type="dxa"/>
-            </w:tcMar>
-          </w:tcPr>
-          <w:p>
-            <w:pPr>
-              <w:rPr>
-                <w:sz w:val="19"/>
-                <w:szCs w:val="19"/>
-              </w:rPr>
-            </w:pPr>
-            <w:r>
-              <w:rPr>
-                <w:sz w:val="19"/>
-                <w:szCs w:val="19"/>
-              </w:rPr>
-              <w:t>—</w:t>
-            </w:r>
-          </w:p>
-        </w:tc>
-        <w:tc>
-          <w:tcPr>
-            <w:tcW w:w="2560" w:type="dxa"/>
-            <w:tcBorders>
-              <w:top w:val="single" w:sz="4" w:space="0" w:color="BFBFBF"/>
-              <w:left w:val="single" w:sz="4" w:space="0" w:color="BFBFBF"/>
-              <w:bottom w:val="single" w:sz="4" w:space="0" w:color="BFBFBF"/>
-              <w:right w:val="single" w:sz="4" w:space="0" w:color="BFBFBF"/>
-            </w:tcBorders>
-            <w:tcMar>
-              <w:top w:w="60" w:type="dxa"/>
-              <w:left w:w="100" w:type="dxa"/>
-              <w:bottom w:w="60" w:type="dxa"/>
-              <w:right w:w="100" w:type="dxa"/>
-            </w:tcMar>
-          </w:tcPr>
-          <w:p>
-            <w:pPr>
-              <w:rPr>
-                <w:sz w:val="19"/>
-                <w:szCs w:val="19"/>
-              </w:rPr>
-            </w:pPr>
-            <w:r>
-              <w:rPr>
-                <w:sz w:val="19"/>
-                <w:szCs w:val="19"/>
-              </w:rPr>
-              <w:t>Reutiliza el ingreso al detalle de cuenta; valida que todas las fechas estén dentro del último mes</w:t>
-            </w:r>
-          </w:p>
-        </w:tc>
-        <w:tc>
-          <w:tcPr>
-            <w:tcW w:w="1500" w:type="dxa"/>
-            <w:tcBorders>
-              <w:top w:val="single" w:sz="4" w:space="0" w:color="BFBFBF"/>
-              <w:left w:val="single" w:sz="4" w:space="0" w:color="BFBFBF"/>
-              <w:bottom w:val="single" w:sz="4" w:space="0" w:color="BFBFBF"/>
-              <w:right w:val="single" w:sz="4" w:space="0" w:color="BFBFBF"/>
-            </w:tcBorders>
-            <w:tcMar>
-              <w:top w:w="60" w:type="dxa"/>
-              <w:left w:w="100" w:type="dxa"/>
-              <w:bottom w:w="60" w:type="dxa"/>
-              <w:right w:w="100" w:type="dxa"/>
-            </w:tcMar>
-          </w:tcPr>
-          <w:p>
-            <w:pPr>
-              <w:rPr>
-                <w:sz w:val="19"/>
-                <w:szCs w:val="19"/>
-              </w:rPr>
-            </w:pPr>
-            <w:r>
-              <w:rPr>
-                <w:sz w:val="19"/>
-                <w:szCs w:val="19"/>
-              </w:rPr>
-              <w:t>Construido; ejecutado con éxito el 19/10. Exclusión comprobada con un cliente de 85 transacciones (30 en abril de 2026): la app solo muestra las del último mes</w:t>
+                <w:lang w:val="es-MX"/>
+              </w:rPr>
+            </w:pPr>
+            <w:r>
+              <w:rPr>
+                <w:sz w:val="19"/>
+                <w:szCs w:val="19"/>
+                <w:lang w:val="es-MX"/>
+              </w:rPr>
+              <w:lastRenderedPageBreak/>
+              <w:t xml:space="preserve">Construido; Exclusión comprobada </w:t>
+              <w:lastRenderedPageBreak/>
+              <w:t>con un cliente de 85 transacciones (30 en abril de 2026): la app solo muestra las del último mes</w:t>
             </w:r>
           </w:p>
         </w:tc>
@@ -2199,7 +2363,8 @@
                 <w:sz w:val="19"/>
                 <w:szCs w:val="19"/>
               </w:rPr>
-              <w:t>Detalle de transacción</w:t>
+              <w:lastRenderedPageBreak/>
+              <w:t xml:space="preserve">Detalle de transacción</w:t>
             </w:r>
           </w:p>
         </w:tc>
@@ -2320,14 +2485,16 @@
               <w:rPr>
                 <w:sz w:val="19"/>
                 <w:szCs w:val="19"/>
-              </w:rPr>
-            </w:pPr>
-            <w:r>
-              <w:rPr>
-                <w:sz w:val="19"/>
-                <w:szCs w:val="19"/>
-              </w:rPr>
-              <w:t>Construido; ejecutado con éxito el 19/10. Sin cuenta de origen ni destino en la app y comprobante en ceros: observaciones</w:t>
+                <w:lang w:val="es-MX"/>
+              </w:rPr>
+            </w:pPr>
+            <w:r>
+              <w:rPr>
+                <w:sz w:val="19"/>
+                <w:szCs w:val="19"/>
+                <w:lang w:val="es-MX"/>
+              </w:rPr>
+              <w:t>Construido; Sin cuenta de origen ni destino en la app y comprobante en ceros: observaciones</w:t>
             </w:r>
           </w:p>
         </w:tc>
@@ -2361,7 +2528,7 @@
                 <w:sz w:val="19"/>
                 <w:szCs w:val="19"/>
               </w:rPr>
-              <w:t>Comprobante de transacción</w:t>
+              <w:t xml:space="preserve">Comprobante de transacción</w:t>
             </w:r>
           </w:p>
         </w:tc>
@@ -2450,12 +2617,14 @@
               <w:rPr>
                 <w:sz w:val="19"/>
                 <w:szCs w:val="19"/>
-              </w:rPr>
-            </w:pPr>
-            <w:r>
-              <w:rPr>
-                <w:sz w:val="19"/>
-                <w:szCs w:val="19"/>
+                <w:lang w:val="es-MX"/>
+              </w:rPr>
+            </w:pPr>
+            <w:r>
+              <w:rPr>
+                <w:sz w:val="19"/>
+                <w:szCs w:val="19"/>
+                <w:lang w:val="es-MX"/>
               </w:rPr>
               <w:t>Acción sobre el comprobante: descargarlo o compartirlo</w:t>
             </w:r>
@@ -2488,8 +2657,26 @@
               <w:rPr>
                 <w:sz w:val="19"/>
                 <w:szCs w:val="19"/>
-              </w:rPr>
-              <w:t>Construidos; ejecutados con éxito el 19/10. Descargar: la imagen se adjunta a la evidencia y se borra del dispositivo. Compartir: se cancela sin elegir app</w:t>
+                <w:lang w:val="es-MX"/>
+              </w:rPr>
+              <w:t xml:space="preserve">Construidos; </w:t>
+            </w:r>
+            <w:bookmarkStart w:id="0" w:name="_GoBack"/>
+            <w:bookmarkEnd w:id="0"/>
+            <w:r>
+              <w:rPr>
+                <w:sz w:val="19"/>
+                <w:szCs w:val="19"/>
+                <w:lang w:val="es-MX"/>
+              </w:rPr>
+              <w:t xml:space="preserve">Descargar: la imagen se adjunta a la evidencia y se borra del dispositivo. </w:t>
+            </w:r>
+            <w:r>
+              <w:rPr>
+                <w:sz w:val="19"/>
+                <w:szCs w:val="19"/>
+              </w:rPr>
+              <w:t xml:space="preserve">Compartir: se cancela sin elegir app</w:t>
             </w:r>
           </w:p>
         </w:tc>
@@ -2504,23 +2691,36 @@
       <w:pPr>
         <w:pStyle w:val="Ttulo1"/>
         <w:spacing w:before="280" w:after="120"/>
+        <w:rPr>
+          <w:lang w:val="es-MX"/>
+        </w:rPr>
       </w:pPr>
       <w:r>
-        <w:t>4. Caso propuesto para descartar (pendiente de aprobación)</w:t>
+        <w:rPr>
+          <w:lang w:val="es-MX"/>
+        </w:rPr>
+        <w:t xml:space="preserve">4. Caso descartado (aprobado el 20/10/2026)</w:t>
       </w:r>
     </w:p>
     <w:p>
       <w:pPr>
         <w:spacing w:after="120"/>
+        <w:rPr>
+          <w:lang w:val="es-MX"/>
+        </w:rPr>
       </w:pPr>
       <w:r>
         <w:rPr>
           <w:b/>
           <w:bCs/>
+          <w:lang w:val="es-MX"/>
         </w:rPr>
         <w:t xml:space="preserve">38701 – Visualización de componentes de la pantalla. </w:t>
       </w:r>
       <w:r>
+        <w:rPr>
+          <w:lang w:val="es-MX"/>
+        </w:rPr>
         <w:t>Recomendación de GreenSQA, a partir de su texto en Azure:</w:t>
       </w:r>
     </w:p>
@@ -2532,15 +2732,22 @@
           <w:numId w:val="2"/>
         </w:numPr>
         <w:spacing w:after="60"/>
+        <w:rPr>
+          <w:lang w:val="es-MX"/>
+        </w:rPr>
       </w:pPr>
       <w:r>
         <w:rPr>
           <w:b/>
           <w:bCs/>
+          <w:lang w:val="es-MX"/>
         </w:rPr>
         <w:t xml:space="preserve">Título genérico: </w:t>
       </w:r>
       <w:r>
+        <w:rPr>
+          <w:lang w:val="es-MX"/>
+        </w:rPr>
         <w:t>no indica qué componentes se validan.</w:t>
       </w:r>
     </w:p>
@@ -2552,15 +2759,22 @@
           <w:numId w:val="2"/>
         </w:numPr>
         <w:spacing w:after="60"/>
+        <w:rPr>
+          <w:lang w:val="es-MX"/>
+        </w:rPr>
       </w:pPr>
       <w:r>
         <w:rPr>
           <w:b/>
           <w:bCs/>
+          <w:lang w:val="es-MX"/>
         </w:rPr>
         <w:t xml:space="preserve">Pasos genéricos: </w:t>
       </w:r>
       <w:r>
+        <w:rPr>
+          <w:lang w:val="es-MX"/>
+        </w:rPr>
         <w:t>"Validar que la pantalla, opción o componente requerido se encuentre disponible y habilitado" y "Validar los textos, componentes, datos y estados visuales mostrados", sin nombrar ningún elemento.</w:t>
       </w:r>
     </w:p>
@@ -2572,41 +2786,66 @@
           <w:numId w:val="2"/>
         </w:numPr>
         <w:spacing w:after="60"/>
+        <w:rPr>
+          <w:lang w:val="es-MX"/>
+        </w:rPr>
       </w:pPr>
       <w:r>
         <w:rPr>
           <w:b/>
           <w:bCs/>
+          <w:lang w:val="es-MX"/>
         </w:rPr>
         <w:t xml:space="preserve">Precondición de otra pantalla: </w:t>
       </w:r>
       <w:r>
-        <w:t>"usuario ingresa a la app y visualiza formulario de logueo", que corresponde al login y no al Home.</w:t>
+        <w:rPr>
+          <w:lang w:val="es-MX"/>
+        </w:rPr>
+        <w:t xml:space="preserve">"usuario ingresa a la app y visualiza formulario de logueo", que corresponde al login y no al Home.</w:t>
       </w:r>
     </w:p>
     <w:p>
       <w:pPr>
         <w:spacing w:after="120"/>
+        <w:rPr>
+          <w:lang w:val="es-MX"/>
+        </w:rPr>
       </w:pPr>
       <w:r>
-        <w:t>Cada componente del Home ya tiene su propio caso: saludo (38699), último ingreso (38700), accesos (38703, 38704, 38711) y productos (38705 a 38708). Por eso se propone cerrarlo como cubierto por esos casos. Si el equipo le asigna un alcance concreto, se automatiza.</w:t>
+        <w:rPr>
+          <w:lang w:val="es-MX"/>
+        </w:rPr>
+        <w:t xml:space="preserve">Cada componente del Home ya tiene su propio caso: saludo (38699), último ingreso (38700), accesos (38703, 38704, 38711) y productos (38705 a 38708). El equipo funcional aprobó cerrarlo como cubierto por esos casos.</w:t>
       </w:r>
     </w:p>
     <w:p>
       <w:pPr>
         <w:pStyle w:val="Ttulo1"/>
         <w:spacing w:before="280" w:after="120"/>
+        <w:rPr>
+          <w:lang w:val="es-MX"/>
+        </w:rPr>
       </w:pPr>
       <w:r>
+        <w:rPr>
+          <w:lang w:val="es-MX"/>
+        </w:rPr>
         <w:t>5. Casos fuera de alcance por ahora</w:t>
       </w:r>
     </w:p>
     <w:p>
       <w:pPr>
         <w:spacing w:after="120"/>
+        <w:rPr>
+          <w:lang w:val="es-MX"/>
+        </w:rPr>
       </w:pPr>
       <w:r>
-        <w:t>Los casos de logs quedan excluidos de esta etapa por decisión del proyecto, porque requieren acceso al servicio de logs:</w:t>
+        <w:rPr>
+          <w:lang w:val="es-MX"/>
+        </w:rPr>
+        <w:t xml:space="preserve">Los casos de logs quedan excluidos de esta etapa por decisión del proyecto (aprobado el 20/10/2026), porque requieren acceso al servicio de logs:</w:t>
       </w:r>
     </w:p>
     <w:tbl>
@@ -2691,7 +2930,7 @@
                 <w:sz w:val="19"/>
                 <w:szCs w:val="19"/>
               </w:rPr>
-              <w:t>Título resumido</w:t>
+              <w:t xml:space="preserve">Título resumido</w:t>
             </w:r>
           </w:p>
         </w:tc>
@@ -2775,7 +3014,7 @@
                 <w:sz w:val="19"/>
                 <w:szCs w:val="19"/>
               </w:rPr>
-              <w:t>Log por registro exitoso</w:t>
+              <w:t xml:space="preserve">Log por registro exitoso</w:t>
             </w:r>
           </w:p>
         </w:tc>
@@ -2796,10 +3035,16 @@
             </w:tcMar>
           </w:tcPr>
           <w:p>
-            <w:r>
-              <w:rPr>
-                <w:sz w:val="19"/>
-                <w:szCs w:val="19"/>
+            <w:pPr>
+              <w:rPr>
+                <w:lang w:val="es-MX"/>
+              </w:rPr>
+            </w:pPr>
+            <w:r>
+              <w:rPr>
+                <w:sz w:val="19"/>
+                <w:szCs w:val="19"/>
+                <w:lang w:val="es-MX"/>
               </w:rPr>
               <w:t>Fuera por ahora: requiere acceso al servicio de logs</w:t>
             </w:r>
@@ -2830,6 +3075,7 @@
                 <w:sz w:val="19"/>
                 <w:szCs w:val="19"/>
               </w:rPr>
+              <w:lastRenderedPageBreak/>
               <w:t>38504</w:t>
             </w:r>
           </w:p>
@@ -2857,7 +3103,7 @@
                 <w:sz w:val="19"/>
                 <w:szCs w:val="19"/>
               </w:rPr>
-              <w:t>Log por registro exitoso</w:t>
+              <w:t xml:space="preserve">Log por registro exitoso</w:t>
             </w:r>
           </w:p>
         </w:tc>
@@ -2879,10 +3125,16 @@
             </w:tcMar>
           </w:tcPr>
           <w:p>
-            <w:r>
-              <w:rPr>
-                <w:sz w:val="19"/>
-                <w:szCs w:val="19"/>
+            <w:pPr>
+              <w:rPr>
+                <w:lang w:val="es-MX"/>
+              </w:rPr>
+            </w:pPr>
+            <w:r>
+              <w:rPr>
+                <w:sz w:val="19"/>
+                <w:szCs w:val="19"/>
+                <w:lang w:val="es-MX"/>
               </w:rPr>
               <w:t>Fuera por ahora. Por la secuencia 38502/38503/38504 parece la variante CE de 38500, aunque su texto no menciona CE; conviene corregir el título en Azure</w:t>
             </w:r>
@@ -2933,10 +3185,16 @@
             </w:tcMar>
           </w:tcPr>
           <w:p>
-            <w:r>
-              <w:rPr>
-                <w:sz w:val="19"/>
-                <w:szCs w:val="19"/>
+            <w:pPr>
+              <w:rPr>
+                <w:lang w:val="es-MX"/>
+              </w:rPr>
+            </w:pPr>
+            <w:r>
+              <w:rPr>
+                <w:sz w:val="19"/>
+                <w:szCs w:val="19"/>
+                <w:lang w:val="es-MX"/>
               </w:rPr>
               <w:t>Login exitoso genera log (servicio ID 6)</w:t>
             </w:r>
@@ -2959,10 +3217,16 @@
             </w:tcMar>
           </w:tcPr>
           <w:p>
-            <w:r>
-              <w:rPr>
-                <w:sz w:val="19"/>
-                <w:szCs w:val="19"/>
+            <w:pPr>
+              <w:rPr>
+                <w:lang w:val="es-MX"/>
+              </w:rPr>
+            </w:pPr>
+            <w:r>
+              <w:rPr>
+                <w:sz w:val="19"/>
+                <w:szCs w:val="19"/>
+                <w:lang w:val="es-MX"/>
               </w:rPr>
               <w:t>Fuera por ahora: requiere acceso al servicio de logs</w:t>
             </w:r>
@@ -2973,22 +3237,37 @@
     <w:p>
       <w:pPr>
         <w:spacing w:after="60"/>
+        <w:rPr>
+          <w:lang w:val="es-MX"/>
+        </w:rPr>
       </w:pPr>
     </w:p>
     <w:p>
       <w:pPr>
         <w:pStyle w:val="Ttulo1"/>
         <w:spacing w:before="280" w:after="120"/>
+        <w:rPr>
+          <w:lang w:val="es-MX"/>
+        </w:rPr>
       </w:pPr>
       <w:r>
+        <w:rPr>
+          <w:lang w:val="es-MX"/>
+        </w:rPr>
         <w:t>6. Verificaciones que requieren acceso o revisión manual</w:t>
       </w:r>
     </w:p>
     <w:p>
       <w:pPr>
         <w:spacing w:after="120"/>
+        <w:rPr>
+          <w:lang w:val="es-MX"/>
+        </w:rPr>
       </w:pPr>
       <w:r>
+        <w:rPr>
+          <w:lang w:val="es-MX"/>
+        </w:rPr>
         <w:t>Estos casos sí se automatizan. Solo la verificación puntual que se cita, tomada del texto del caso en Azure, no se puede hacer con la automatización por UI con los accesos actuales:</w:t>
       </w:r>
     </w:p>
@@ -3066,6 +3345,11 @@
             </w:tcMar>
           </w:tcPr>
           <w:p>
+            <w:pPr>
+              <w:rPr>
+                <w:lang w:val="es-MX"/>
+              </w:rPr>
+            </w:pPr>
             <w:r>
               <w:rPr>
                 <w:b/>
@@ -3073,6 +3357,7 @@
                 <w:color w:val="FFFFFF"/>
                 <w:sz w:val="19"/>
                 <w:szCs w:val="19"/>
+                <w:lang w:val="es-MX"/>
               </w:rPr>
               <w:t>Lo que pide el caso en Azure</w:t>
             </w:r>
@@ -3104,7 +3389,7 @@
                 <w:sz w:val="19"/>
                 <w:szCs w:val="19"/>
               </w:rPr>
-              <w:t>Tratamiento propuesto</w:t>
+              <w:t xml:space="preserve">Tratamiento propuesto</w:t>
             </w:r>
           </w:p>
         </w:tc>
@@ -3153,10 +3438,16 @@
             </w:tcMar>
           </w:tcPr>
           <w:p>
-            <w:r>
-              <w:rPr>
-                <w:sz w:val="19"/>
-                <w:szCs w:val="19"/>
+            <w:pPr>
+              <w:rPr>
+                <w:lang w:val="es-MX"/>
+              </w:rPr>
+            </w:pPr>
+            <w:r>
+              <w:rPr>
+                <w:sz w:val="19"/>
+                <w:szCs w:val="19"/>
+                <w:lang w:val="es-MX"/>
               </w:rPr>
               <w:t>Paso 5: "Verificar la identidad visual de la pantalla (fuentes, colores y logotipo) en comparación con el documento de diseño de interfaz (UI)"</w:t>
             </w:r>
@@ -3179,12 +3470,18 @@
             </w:tcMar>
           </w:tcPr>
           <w:p>
-            <w:r>
-              <w:rPr>
-                <w:sz w:val="19"/>
-                <w:szCs w:val="19"/>
-              </w:rPr>
-              <w:t>Sin el documento de diseño ni herramienta de pruebas visuales, esa comparación queda manual. La automatización valida que el acceso exista, esté habilitado y responda</w:t>
+            <w:pPr>
+              <w:rPr>
+                <w:lang w:val="es-MX"/>
+              </w:rPr>
+            </w:pPr>
+            <w:r>
+              <w:rPr>
+                <w:sz w:val="19"/>
+                <w:szCs w:val="19"/>
+                <w:lang w:val="es-MX"/>
+              </w:rPr>
+              <w:t xml:space="preserve">Sin el documento de diseño ni herramienta de pruebas visuales, esa comparación queda manual. La automatización valida que el acceso exista, esté habilitado y responda</w:t>
             </w:r>
           </w:p>
         </w:tc>
@@ -3235,12 +3532,18 @@
             </w:tcMar>
           </w:tcPr>
           <w:p>
-            <w:r>
-              <w:rPr>
-                <w:sz w:val="19"/>
-                <w:szCs w:val="19"/>
-              </w:rPr>
-              <w:t>Paso 6: "validar que el crédito que muestra con el cliente exista y este correcto en la bd"</w:t>
+            <w:pPr>
+              <w:rPr>
+                <w:lang w:val="es-MX"/>
+              </w:rPr>
+            </w:pPr>
+            <w:r>
+              <w:rPr>
+                <w:sz w:val="19"/>
+                <w:szCs w:val="19"/>
+                <w:lang w:val="es-MX"/>
+              </w:rPr>
+              <w:t xml:space="preserve">Paso 6: "validar que el crédito que muestra con el cliente exista y este correcto en la bd"</w:t>
             </w:r>
           </w:p>
         </w:tc>
@@ -3262,10 +3565,16 @@
             </w:tcMar>
           </w:tcPr>
           <w:p>
-            <w:r>
-              <w:rPr>
-                <w:sz w:val="19"/>
-                <w:szCs w:val="19"/>
+            <w:pPr>
+              <w:rPr>
+                <w:lang w:val="es-MX"/>
+              </w:rPr>
+            </w:pPr>
+            <w:r>
+              <w:rPr>
+                <w:sz w:val="19"/>
+                <w:szCs w:val="19"/>
+                <w:lang w:val="es-MX"/>
               </w:rPr>
               <w:t>Sin acceso a la base de datos solo se valida presencia y formato; la verificación en BD queda manual o pendiente de acceso</w:t>
             </w:r>
@@ -3316,12 +3625,18 @@
             </w:tcMar>
           </w:tcPr>
           <w:p>
-            <w:r>
-              <w:rPr>
-                <w:sz w:val="19"/>
-                <w:szCs w:val="19"/>
-              </w:rPr>
-              <w:t>Paso 4: "Validar que los saldos y estados de cada producto financiero correspondan a la información real del cliente" (según el diseño y el backend)</w:t>
+            <w:pPr>
+              <w:rPr>
+                <w:lang w:val="es-MX"/>
+              </w:rPr>
+            </w:pPr>
+            <w:r>
+              <w:rPr>
+                <w:sz w:val="19"/>
+                <w:szCs w:val="19"/>
+                <w:lang w:val="es-MX"/>
+              </w:rPr>
+              <w:t xml:space="preserve">Paso 4: "Validar que los saldos y estados de cada producto financiero correspondan a la información real del cliente" (según el diseño y el backend)</w:t>
             </w:r>
           </w:p>
         </w:tc>
@@ -3342,10 +3657,16 @@
             </w:tcMar>
           </w:tcPr>
           <w:p>
-            <w:r>
-              <w:rPr>
-                <w:sz w:val="19"/>
-                <w:szCs w:val="19"/>
+            <w:pPr>
+              <w:rPr>
+                <w:lang w:val="es-MX"/>
+              </w:rPr>
+            </w:pPr>
+            <w:r>
+              <w:rPr>
+                <w:sz w:val="19"/>
+                <w:szCs w:val="19"/>
+                <w:lang w:val="es-MX"/>
               </w:rPr>
               <w:t>Igual que 38702. La sábana de cartera es una foto del 23/09/2026 y no sirve como referencia de saldos</w:t>
             </w:r>
@@ -3406,14 +3727,16 @@
               <w:rPr>
                 <w:sz w:val="19"/>
                 <w:szCs w:val="19"/>
-              </w:rPr>
-            </w:pPr>
-            <w:r>
-              <w:rPr>
-                <w:sz w:val="19"/>
-                <w:szCs w:val="19"/>
-              </w:rPr>
-              <w:t>Paso 4: "Comparar las fechas y horas de las primeras y últimas transacciones de la lista con los datos reales del backend del usuario"</w:t>
+                <w:lang w:val="es-MX"/>
+              </w:rPr>
+            </w:pPr>
+            <w:r>
+              <w:rPr>
+                <w:sz w:val="19"/>
+                <w:szCs w:val="19"/>
+                <w:lang w:val="es-MX"/>
+              </w:rPr>
+              <w:t xml:space="preserve">Paso 4: "Comparar las fechas y horas de las primeras y últimas transacciones de la lista con los datos reales del backend del usuario"</w:t>
             </w:r>
           </w:p>
         </w:tc>
@@ -3438,14 +3761,16 @@
               <w:rPr>
                 <w:sz w:val="19"/>
                 <w:szCs w:val="19"/>
-              </w:rPr>
-            </w:pPr>
-            <w:r>
-              <w:rPr>
-                <w:sz w:val="19"/>
-                <w:szCs w:val="19"/>
-              </w:rPr>
-              <w:t>Igual que 38709: sin acceso al backend se valida el conteo, el orden y el formato; la comparación con el backend queda manual o pendiente de acceso</w:t>
+                <w:lang w:val="es-MX"/>
+              </w:rPr>
+            </w:pPr>
+            <w:r>
+              <w:rPr>
+                <w:sz w:val="19"/>
+                <w:szCs w:val="19"/>
+                <w:lang w:val="es-MX"/>
+              </w:rPr>
+              <w:t xml:space="preserve">Igual que 38709: sin acceso al backend se valida el conteo, el orden y el formato; la comparación con el backend queda manual o pendiente de acceso</w:t>
             </w:r>
           </w:p>
         </w:tc>
@@ -3504,14 +3829,16 @@
               <w:rPr>
                 <w:sz w:val="19"/>
                 <w:szCs w:val="19"/>
-              </w:rPr>
-            </w:pPr>
-            <w:r>
-              <w:rPr>
-                <w:sz w:val="19"/>
-                <w:szCs w:val="19"/>
-              </w:rPr>
-              <w:t>"No se realiza ninguna petición de carga adicional" / "no realiza peticiones adicionales al backend (lazy loading)"</w:t>
+                <w:lang w:val="es-MX"/>
+              </w:rPr>
+            </w:pPr>
+            <w:r>
+              <w:rPr>
+                <w:sz w:val="19"/>
+                <w:szCs w:val="19"/>
+                <w:lang w:val="es-MX"/>
+              </w:rPr>
+              <w:t xml:space="preserve">"No se realiza ninguna petición de carga adicional" / "no realiza peticiones adicionales al backend (lazy loading)"</w:t>
             </w:r>
           </w:p>
         </w:tc>
@@ -3536,14 +3863,16 @@
               <w:rPr>
                 <w:sz w:val="19"/>
                 <w:szCs w:val="19"/>
-              </w:rPr>
-            </w:pPr>
-            <w:r>
-              <w:rPr>
-                <w:sz w:val="19"/>
-                <w:szCs w:val="19"/>
-              </w:rPr>
-              <w:t>La automatización valida que no aparezca "Ver más" ni paginación y que la lista no crezca al forzar el scroll; la ausencia de peticiones de red queda manual</w:t>
+                <w:lang w:val="es-MX"/>
+              </w:rPr>
+            </w:pPr>
+            <w:r>
+              <w:rPr>
+                <w:sz w:val="19"/>
+                <w:szCs w:val="19"/>
+                <w:lang w:val="es-MX"/>
+              </w:rPr>
+              <w:t xml:space="preserve">La automatización valida que no aparezca "Ver más" ni paginación y que la lista no crezca al forzar el scroll; la ausencia de peticiones de red queda manual</w:t>
             </w:r>
           </w:p>
         </w:tc>
@@ -3602,12 +3931,14 @@
               <w:rPr>
                 <w:sz w:val="19"/>
                 <w:szCs w:val="19"/>
-              </w:rPr>
-            </w:pPr>
-            <w:r>
-              <w:rPr>
-                <w:sz w:val="19"/>
-                <w:szCs w:val="19"/>
+                <w:lang w:val="es-MX"/>
+              </w:rPr>
+            </w:pPr>
+            <w:r>
+              <w:rPr>
+                <w:sz w:val="19"/>
+                <w:szCs w:val="19"/>
+                <w:lang w:val="es-MX"/>
               </w:rPr>
               <w:t>Paso 3: la imagen se guarda "con buena resolución y con los textos legibles"</w:t>
             </w:r>
@@ -3634,12 +3965,14 @@
               <w:rPr>
                 <w:sz w:val="19"/>
                 <w:szCs w:val="19"/>
-              </w:rPr>
-            </w:pPr>
-            <w:r>
-              <w:rPr>
-                <w:sz w:val="19"/>
-                <w:szCs w:val="19"/>
+                <w:lang w:val="es-MX"/>
+              </w:rPr>
+            </w:pPr>
+            <w:r>
+              <w:rPr>
+                <w:sz w:val="19"/>
+                <w:szCs w:val="19"/>
+                <w:lang w:val="es-MX"/>
               </w:rPr>
               <w:t>Se valida que la imagen quede guardada en el dispositivo y se adjunta a la evidencia; la legibilidad la revisa una persona</w:t>
             </w:r>
@@ -3700,12 +4033,14 @@
               <w:rPr>
                 <w:sz w:val="19"/>
                 <w:szCs w:val="19"/>
-              </w:rPr>
-            </w:pPr>
-            <w:r>
-              <w:rPr>
-                <w:sz w:val="19"/>
-                <w:szCs w:val="19"/>
+                <w:lang w:val="es-MX"/>
+              </w:rPr>
+            </w:pPr>
+            <w:r>
+              <w:rPr>
+                <w:sz w:val="19"/>
+                <w:szCs w:val="19"/>
+                <w:lang w:val="es-MX"/>
               </w:rPr>
               <w:t>Paso 3: la imagen "se envía de forma correcta al destinatario" por WhatsApp, correo o mensajes</w:t>
             </w:r>
@@ -3732,12 +4067,14 @@
               <w:rPr>
                 <w:sz w:val="19"/>
                 <w:szCs w:val="19"/>
-              </w:rPr>
-            </w:pPr>
-            <w:r>
-              <w:rPr>
-                <w:sz w:val="19"/>
-                <w:szCs w:val="19"/>
+                <w:lang w:val="es-MX"/>
+              </w:rPr>
+            </w:pPr>
+            <w:r>
+              <w:rPr>
+                <w:sz w:val="19"/>
+                <w:szCs w:val="19"/>
+                <w:lang w:val="es-MX"/>
               </w:rPr>
               <w:t>La automatización llega hasta el menú nativo de compartir con la imagen adjunta; el envío por una app externa queda manual (no se envían mensajes reales)</w:t>
             </w:r>
@@ -3748,6 +4085,9 @@
     <w:p>
       <w:pPr>
         <w:spacing w:after="60"/>
+        <w:rPr>
+          <w:lang w:val="es-MX"/>
+        </w:rPr>
       </w:pPr>
     </w:p>
     <w:p>
@@ -3756,7 +4096,7 @@
         <w:spacing w:before="280" w:after="120"/>
       </w:pPr>
       <w:r>
-        <w:t>7. Resumen</w:t>
+        <w:t xml:space="preserve">7. Resumen</w:t>
       </w:r>
     </w:p>
     <w:tbl>
@@ -3868,7 +4208,7 @@
                 <w:sz w:val="19"/>
                 <w:szCs w:val="19"/>
               </w:rPr>
-              <w:t>Casos planificados</w:t>
+              <w:t xml:space="preserve">Casos planificados</w:t>
             </w:r>
           </w:p>
         </w:tc>
@@ -3918,10 +4258,16 @@
             </w:tcMar>
           </w:tcPr>
           <w:p>
-            <w:r>
-              <w:rPr>
-                <w:sz w:val="19"/>
-                <w:szCs w:val="19"/>
+            <w:pPr>
+              <w:rPr>
+                <w:lang w:val="es-MX"/>
+              </w:rPr>
+            </w:pPr>
+            <w:r>
+              <w:rPr>
+                <w:sz w:val="19"/>
+                <w:szCs w:val="19"/>
+                <w:lang w:val="es-MX"/>
               </w:rPr>
               <w:t>Escenarios automatizados resultantes (uno por caso principal)</w:t>
             </w:r>
@@ -3973,10 +4319,16 @@
             </w:tcMar>
           </w:tcPr>
           <w:p>
-            <w:r>
-              <w:rPr>
-                <w:sz w:val="19"/>
-                <w:szCs w:val="19"/>
+            <w:pPr>
+              <w:rPr>
+                <w:lang w:val="es-MX"/>
+              </w:rPr>
+            </w:pPr>
+            <w:r>
+              <w:rPr>
+                <w:sz w:val="19"/>
+                <w:szCs w:val="19"/>
+                <w:lang w:val="es-MX"/>
               </w:rPr>
               <w:t>Casos absorbidos por otro escenario</w:t>
             </w:r>
@@ -4028,11 +4380,18 @@
             </w:tcMar>
           </w:tcPr>
           <w:p>
-            <w:r>
-              <w:rPr>
-                <w:sz w:val="19"/>
-                <w:szCs w:val="19"/>
-              </w:rPr>
+            <w:pPr>
+              <w:rPr>
+                <w:lang w:val="es-MX"/>
+              </w:rPr>
+            </w:pPr>
+            <w:r>
+              <w:rPr>
+                <w:sz w:val="19"/>
+                <w:szCs w:val="19"/>
+                <w:lang w:val="es-MX"/>
+              </w:rPr>
+              <w:lastRenderedPageBreak/>
               <w:t>Casos fuera de alcance por logs</w:t>
             </w:r>
           </w:p>
@@ -4088,7 +4447,7 @@
                 <w:sz w:val="19"/>
                 <w:szCs w:val="19"/>
               </w:rPr>
-              <w:t>Casos propuestos para descartar</w:t>
+              <w:t xml:space="preserve">Casos descartados</w:t>
             </w:r>
           </w:p>
         </w:tc>
@@ -4187,7 +4546,64 @@
         <w:spacing w:before="280" w:after="120"/>
       </w:pPr>
       <w:r>
-        <w:t>8. Pendientes por confirmar</w:t>
+        <w:t xml:space="preserve">8. Pendientes por confirmar</w:t>
+      </w:r>
+    </w:p>
+    <w:p>
+      <w:pPr>
+        <w:pStyle w:val="Prrafodelista"/>
+        <w:numPr>
+          <w:ilvl w:val="0"/>
+          <w:numId w:val="2"/>
+        </w:numPr>
+        <w:spacing w:after="60"/>
+        <w:rPr>
+          <w:lang w:val="es-MX"/>
+        </w:rPr>
+      </w:pPr>
+      <w:r>
+        <w:rPr>
+          <w:lang w:val="es-MX"/>
+        </w:rPr>
+        <w:t xml:space="preserve">Cuenta corriente y cuota: resuelto. Con el cliente entregado el 20/10, 38706 y 39562 se ejecutaron con éxito; 38707 ya se había ejecutado con éxito (cuota vencida, que es lo que se valida según la respuesta #5).</w:t>
+      </w:r>
+    </w:p>
+    <w:p>
+      <w:pPr>
+        <w:pStyle w:val="Prrafodelista"/>
+        <w:numPr>
+          <w:ilvl w:val="0"/>
+          <w:numId w:val="2"/>
+        </w:numPr>
+        <w:spacing w:after="60"/>
+        <w:rPr>
+          <w:lang w:val="es-MX"/>
+        </w:rPr>
+      </w:pPr>
+      <w:r>
+        <w:rPr>
+          <w:lang w:val="es-MX"/>
+        </w:rPr>
+        <w:t>Claves de dos clientes registrados que la app rechazó (Datos incorrectos): quedaron FALLIDO en el listado hasta revisarlas o recuperarlas.</w:t>
+      </w:r>
+    </w:p>
+    <w:p>
+      <w:pPr>
+        <w:pStyle w:val="Prrafodelista"/>
+        <w:numPr>
+          <w:ilvl w:val="0"/>
+          <w:numId w:val="2"/>
+        </w:numPr>
+        <w:spacing w:after="60"/>
+        <w:rPr>
+          <w:lang w:val="es-MX"/>
+        </w:rPr>
+      </w:pPr>
+      <w:r>
+        <w:rPr>
+          <w:lang w:val="es-MX"/>
+        </w:rPr>
+        <w:t xml:space="preserve">Monto esperado (38709): resuelto. La comparación del saldo de la tarjeta con el monto informado en el control ya se ejecutó con éxito.</w:t>
       </w:r>
     </w:p>
     <w:p>
@@ -4200,7 +4616,13 @@
         <w:spacing w:after="60"/>
       </w:pPr>
       <w:r>
-        <w:t>Cliente de prueba con cuenta corriente (38706) y con cuota vigente (38707): ninguno de los clientes registrados los tiene (verificado por la automatización el 12/10).</w:t>
+        <w:rPr>
+          <w:lang w:val="es-MX"/>
+        </w:rPr>
+        <w:t xml:space="preserve">Datos de clientes con Cédula de Extranjería (CE): hay un solo cliente CE registrado, que sirve para 38520. </w:t>
+      </w:r>
+      <w:r>
+        <w:t xml:space="preserve">Faltan clientes CE disponibles (sin registrar) para 38502 y 38503.</w:t>
       </w:r>
     </w:p>
     <w:p>
@@ -4211,47 +4633,14 @@
           <w:numId w:val="2"/>
         </w:numPr>
         <w:spacing w:after="60"/>
+        <w:rPr>
+          <w:lang w:val="es-MX"/>
+        </w:rPr>
       </w:pPr>
       <w:r>
-        <w:t>Claves de dos clientes registrados que la app rechazó (Datos incorrectos): quedaron FALLIDO en el listado hasta revisarlas o recuperarlas.</w:t>
-      </w:r>
-    </w:p>
-    <w:p>
-      <w:pPr>
-        <w:pStyle w:val="Prrafodelista"/>
-        <w:numPr>
-          <w:ilvl w:val="0"/>
-          <w:numId w:val="2"/>
-        </w:numPr>
-        <w:spacing w:after="60"/>
-      </w:pPr>
-      <w:r>
-        <w:t>Fuente del monto esperado para 38709: la sábana no coincide con el Home, por lo que el valor debe venir del backend.</w:t>
-      </w:r>
-    </w:p>
-    <w:p>
-      <w:pPr>
-        <w:pStyle w:val="Prrafodelista"/>
-        <w:numPr>
-          <w:ilvl w:val="0"/>
-          <w:numId w:val="2"/>
-        </w:numPr>
-        <w:spacing w:after="60"/>
-      </w:pPr>
-      <w:r>
-        <w:t>Datos de clientes con Cédula de Extranjería (CE): hay un solo cliente CE registrado, que sirve para 38520. Faltan clientes CE disponibles (sin registrar) para 38502 y 38503.</w:t>
-      </w:r>
-    </w:p>
-    <w:p>
-      <w:pPr>
-        <w:pStyle w:val="Prrafodelista"/>
-        <w:numPr>
-          <w:ilvl w:val="0"/>
-          <w:numId w:val="2"/>
-        </w:numPr>
-        <w:spacing w:after="60"/>
-      </w:pPr>
-      <w:r>
+        <w:rPr>
+          <w:lang w:val="es-MX"/>
+        </w:rPr>
         <w:t>Casos de SMS (38499, 38503): confirmado que se envían SMS reales al número registrado del cliente. Se necesitan dispositivos reales con una línea asignada y clientes de prueba asociados a esa línea, sin registrar en la app.</w:t>
       </w:r>
     </w:p>
@@ -4263,8 +4652,14 @@
           <w:numId w:val="2"/>
         </w:numPr>
         <w:spacing w:after="60"/>
+        <w:rPr>
+          <w:lang w:val="es-MX"/>
+        </w:rPr>
       </w:pPr>
       <w:r>
+        <w:rPr>
+          <w:lang w:val="es-MX"/>
+        </w:rPr>
         <w:t>Conexión de los dispositivos reales: desde un celular ubicado fuera de Colombia todas las validaciones respondieron "Validación fallida". Falta confirmar si es un bloqueo por ubicación; si lo es, el dispositivo debe conectarse con una VPN ubicada en Colombia.</w:t>
       </w:r>
     </w:p>
@@ -4276,8 +4671,14 @@
           <w:numId w:val="2"/>
         </w:numPr>
         <w:spacing w:after="60"/>
+        <w:rPr>
+          <w:lang w:val="es-MX"/>
+        </w:rPr>
       </w:pPr>
       <w:r>
+        <w:rPr>
+          <w:lang w:val="es-MX"/>
+        </w:rPr>
         <w:t>Corrección del título de 38504 en Azure para que indique que es la variante CE.</w:t>
       </w:r>
     </w:p>
@@ -4289,9 +4690,15 @@
           <w:numId w:val="2"/>
         </w:numPr>
         <w:spacing w:after="60"/>
+        <w:rPr>
+          <w:lang w:val="es-MX"/>
+        </w:rPr>
       </w:pPr>
       <w:r>
-        <w:t>39561 a 39565 repiten el texto de 38705 a 38709: confirmar si son duplicados (por ejemplo, por el alcance 7x24) para marcarlos así en Azure.</w:t>
+        <w:rPr>
+          <w:lang w:val="es-MX"/>
+        </w:rPr>
+        <w:t xml:space="preserve">Duplicados: resuelto el 20/10. 39561 a 39565 son duplicados de 38705 a 38709; se pueden marcar así en Azure.</w:t>
       </w:r>
     </w:p>
     <w:p>
@@ -4302,9 +4709,15 @@
           <w:numId w:val="2"/>
         </w:numPr>
         <w:spacing w:after="60"/>
+        <w:rPr>
+          <w:lang w:val="es-MX"/>
+        </w:rPr>
       </w:pPr>
       <w:r>
-        <w:t>Clientes con movimientos recibidos el 19/10: cubren 39566, 39568, 39571, 39572 y 39573. Para comprobar el corte en 20 (39567, 39569, 39570) falta un cliente con más de 20 movimientos en los últimos 30 días: la app solo muestra los movimientos de ese periodo.</w:t>
+        <w:rPr>
+          <w:lang w:val="es-MX"/>
+        </w:rPr>
+        <w:t xml:space="preserve">Clientes con movimientos recibidos el 19/10: cubren 39566, 39568, 39571, 39572 y 39573. Para comprobar el corte en 20 (39567, 39569, 39570) falta un cliente con más de 20 movimientos en los últimos 30 días: la app solo muestra los movimientos de ese periodo. Los clientes reenviados el 20/10 son los mismos del 19/10 y no cumplen esa condición (8 y 3 movimientos en el periodo).</w:t>
       </w:r>
     </w:p>
     <w:p>
@@ -4315,9 +4728,15 @@
           <w:numId w:val="2"/>
         </w:numPr>
         <w:spacing w:after="60"/>
+        <w:rPr>
+          <w:lang w:val="es-MX"/>
+        </w:rPr>
       </w:pPr>
       <w:r>
-        <w:t>39569: el título dice "listado del Home", pero el Home no muestra movimientos. Confirmar si se refiere al detalle de cuenta; en ese caso es igual a 39570.</w:t>
+        <w:rPr>
+          <w:lang w:val="es-MX"/>
+        </w:rPr>
+        <w:t xml:space="preserve">39569: resuelto el 20/10. Se valida en el detalle de cuenta; es igual a 39570.</w:t>
       </w:r>
     </w:p>
     <w:p>
@@ -4328,8 +4747,14 @@
           <w:numId w:val="2"/>
         </w:numPr>
         <w:spacing w:after="60"/>
+        <w:rPr>
+          <w:lang w:val="es-MX"/>
+        </w:rPr>
       </w:pPr>
       <w:r>
+        <w:rPr>
+          <w:lang w:val="es-MX"/>
+        </w:rPr>
         <w:t>39566: confirmar qué significa "ID 10 / ID 11 según el tipo", que no es visible en la app.</w:t>
       </w:r>
     </w:p>
@@ -4337,17 +4762,29 @@
       <w:pPr>
         <w:pStyle w:val="Ttulo1"/>
         <w:spacing w:before="280" w:after="120"/>
+        <w:rPr>
+          <w:lang w:val="es-MX"/>
+        </w:rPr>
       </w:pPr>
       <w:r>
+        <w:rPr>
+          <w:lang w:val="es-MX"/>
+        </w:rPr>
         <w:t>9. Control de cambios para el equipo funcional</w:t>
       </w:r>
     </w:p>
     <w:p>
       <w:pPr>
         <w:spacing w:after="120"/>
+        <w:rPr>
+          <w:lang w:val="es-MX"/>
+        </w:rPr>
       </w:pPr>
       <w:r>
-        <w:t>Diferencias entre el texto de los casos y lo que muestra la app, observadas el 12/10/2026 en el ambiente de certificación (emulador Android) con 4 clientes registrados. La automatización valida lo observado en la app y reporta cada diferencia para que el equipo funcional confirme si se corrige el caso o la app.</w:t>
+        <w:rPr>
+          <w:lang w:val="es-MX"/>
+        </w:rPr>
+        <w:t xml:space="preserve">Diferencias entre el texto de los casos y lo que muestra la app, observadas desde el 12/10/2026 en el ambiente de certificación. La última columna registra la respuesta del equipo funcional del 20/10/2026: en todos los casos se valida lo que muestra la app.</w:t>
       </w:r>
     </w:p>
     <w:tbl>
@@ -4456,6 +4893,11 @@
             </w:tcMar>
           </w:tcPr>
           <w:p>
+            <w:pPr>
+              <w:rPr>
+                <w:lang w:val="es-MX"/>
+              </w:rPr>
+            </w:pPr>
             <w:r>
               <w:rPr>
                 <w:b/>
@@ -4463,6 +4905,7 @@
                 <w:color w:val="FFFFFF"/>
                 <w:sz w:val="19"/>
                 <w:szCs w:val="19"/>
+                <w:lang w:val="es-MX"/>
               </w:rPr>
               <w:t>Texto del caso en Azure</w:t>
             </w:r>
@@ -4494,7 +4937,7 @@
                 <w:sz w:val="19"/>
                 <w:szCs w:val="19"/>
               </w:rPr>
-              <w:t>Observado en la app</w:t>
+              <w:t xml:space="preserve">Observado en la app</w:t>
             </w:r>
           </w:p>
         </w:tc>
@@ -4524,7 +4967,7 @@
                 <w:sz w:val="19"/>
                 <w:szCs w:val="19"/>
               </w:rPr>
-              <w:t>Decisión y acción solicitada</w:t>
+              <w:t xml:space="preserve">Respuesta del equipo funcional (20/10) y decisión</w:t>
             </w:r>
           </w:p>
         </w:tc>
@@ -4599,10 +5042,16 @@
             </w:tcMar>
           </w:tcPr>
           <w:p>
-            <w:r>
-              <w:rPr>
-                <w:sz w:val="19"/>
-                <w:szCs w:val="19"/>
+            <w:pPr>
+              <w:rPr>
+                <w:lang w:val="es-MX"/>
+              </w:rPr>
+            </w:pPr>
+            <w:r>
+              <w:rPr>
+                <w:sz w:val="19"/>
+                <w:szCs w:val="19"/>
+                <w:lang w:val="es-MX"/>
               </w:rPr>
               <w:t>Tipo y últimos 4 dígitos: "Cuenta ahorros **** 5038"</w:t>
             </w:r>
@@ -4625,10 +5074,16 @@
             </w:tcMar>
           </w:tcPr>
           <w:p>
-            <w:r>
-              <w:rPr>
-                <w:sz w:val="19"/>
-                <w:szCs w:val="19"/>
+            <w:pPr>
+              <w:rPr>
+                <w:lang w:val="es-MX"/>
+              </w:rPr>
+            </w:pPr>
+            <w:r>
+              <w:rPr>
+                <w:sz w:val="19"/>
+                <w:szCs w:val="19"/>
+                <w:lang w:val="es-MX"/>
               </w:rPr>
               <w:t>Título "Cuentas de ahorro **** 1234" (en plural) en los 4 clientes</w:t>
             </w:r>
@@ -4651,12 +5106,18 @@
             </w:tcMar>
           </w:tcPr>
           <w:p>
-            <w:r>
-              <w:rPr>
-                <w:sz w:val="19"/>
-                <w:szCs w:val="19"/>
-              </w:rPr>
-              <w:t>Se valida el texto observado. Confirmar cuál es el texto correcto</w:t>
+            <w:pPr>
+              <w:rPr>
+                <w:lang w:val="es-MX"/>
+              </w:rPr>
+            </w:pPr>
+            <w:r>
+              <w:rPr>
+                <w:sz w:val="19"/>
+                <w:szCs w:val="19"/>
+                <w:lang w:val="es-MX"/>
+              </w:rPr>
+              <w:t xml:space="preserve">Confirmado: el texto correcto es el de la app. Se valida "Cuentas de ahorro"</w:t>
             </w:r>
           </w:p>
         </w:tc>
@@ -4734,10 +5195,16 @@
             </w:tcMar>
           </w:tcPr>
           <w:p>
-            <w:r>
-              <w:rPr>
-                <w:sz w:val="19"/>
-                <w:szCs w:val="19"/>
+            <w:pPr>
+              <w:rPr>
+                <w:lang w:val="es-MX"/>
+              </w:rPr>
+            </w:pPr>
+            <w:r>
+              <w:rPr>
+                <w:sz w:val="19"/>
+                <w:szCs w:val="19"/>
+                <w:lang w:val="es-MX"/>
               </w:rPr>
               <w:t>Etiqueta de categoría "Ahorro con propósito" en un contenedor gris</w:t>
             </w:r>
@@ -4761,12 +5228,18 @@
             </w:tcMar>
           </w:tcPr>
           <w:p>
-            <w:r>
-              <w:rPr>
-                <w:sz w:val="19"/>
-                <w:szCs w:val="19"/>
-              </w:rPr>
-              <w:t>La etiqueta gris muestra el nombre de la cuenta (por ejemplo "Mi cuenta pn")</w:t>
+            <w:pPr>
+              <w:rPr>
+                <w:lang w:val="es-MX"/>
+              </w:rPr>
+            </w:pPr>
+            <w:r>
+              <w:rPr>
+                <w:sz w:val="19"/>
+                <w:szCs w:val="19"/>
+                <w:lang w:val="es-MX"/>
+              </w:rPr>
+              <w:t xml:space="preserve">La etiqueta gris muestra el nombre de la cuenta (por ejemplo "Mi cuenta pn")</w:t>
             </w:r>
           </w:p>
         </w:tc>
@@ -4792,8 +5265,16 @@
               <w:rPr>
                 <w:sz w:val="19"/>
                 <w:szCs w:val="19"/>
-              </w:rPr>
-              <w:t>Se valida que la etiqueta exista. Confirmar qué debe mostrar</w:t>
+                <w:lang w:val="es-MX"/>
+              </w:rPr>
+              <w:t xml:space="preserve">Confirmado: solo se valida que la etiqueta exista; su texto cambia según la cuenta</w:t>
+            </w:r>
+            <w:r>
+              <w:rPr>
+                <w:sz w:val="19"/>
+                <w:szCs w:val="19"/>
+              </w:rPr>
+              <w:t/>
             </w:r>
           </w:p>
         </w:tc>
@@ -4821,6 +5302,7 @@
                 <w:sz w:val="19"/>
                 <w:szCs w:val="19"/>
               </w:rPr>
+              <w:lastRenderedPageBreak/>
               <w:t>3</w:t>
             </w:r>
           </w:p>
@@ -4873,7 +5355,7 @@
                 <w:sz w:val="19"/>
                 <w:szCs w:val="19"/>
               </w:rPr>
-              <w:t>Saldo con formato "$ 26,000,000,00"</w:t>
+              <w:t xml:space="preserve">Saldo con formato "$ 26,000,000,00"</w:t>
             </w:r>
           </w:p>
         </w:tc>
@@ -4898,8 +5380,16 @@
               <w:rPr>
                 <w:sz w:val="19"/>
                 <w:szCs w:val="19"/>
-              </w:rPr>
-              <w:t>Formato "$22.746.864,51": punto de miles, coma decimal, sin espacio. El ejemplo del caso mezcla separadores</w:t>
+                <w:lang w:val="es-MX"/>
+              </w:rPr>
+              <w:t xml:space="preserve">Formato "$22.746.864,51": punto de miles, coma decimal, sin espacio. </w:t>
+            </w:r>
+            <w:r>
+              <w:rPr>
+                <w:sz w:val="19"/>
+                <w:szCs w:val="19"/>
+              </w:rPr>
+              <w:t xml:space="preserve">El ejemplo del caso mezcla separadores</w:t>
             </w:r>
           </w:p>
         </w:tc>
@@ -4920,12 +5410,18 @@
             </w:tcMar>
           </w:tcPr>
           <w:p>
-            <w:r>
-              <w:rPr>
-                <w:sz w:val="19"/>
-                <w:szCs w:val="19"/>
-              </w:rPr>
-              <w:t>Se valida el formato observado. Corregir el ejemplo en los casos</w:t>
+            <w:pPr>
+              <w:rPr>
+                <w:lang w:val="es-MX"/>
+              </w:rPr>
+            </w:pPr>
+            <w:r>
+              <w:rPr>
+                <w:sz w:val="19"/>
+                <w:szCs w:val="19"/>
+                <w:lang w:val="es-MX"/>
+              </w:rPr>
+              <w:t xml:space="preserve">Confirmado: el formato correcto es "$22.746.864,51"</w:t>
             </w:r>
           </w:p>
         </w:tc>
@@ -5003,10 +5499,16 @@
             </w:tcMar>
           </w:tcPr>
           <w:p>
-            <w:r>
-              <w:rPr>
-                <w:sz w:val="19"/>
-                <w:szCs w:val="19"/>
+            <w:pPr>
+              <w:rPr>
+                <w:lang w:val="es-MX"/>
+              </w:rPr>
+            </w:pPr>
+            <w:r>
+              <w:rPr>
+                <w:sz w:val="19"/>
+                <w:szCs w:val="19"/>
+                <w:lang w:val="es-MX"/>
               </w:rPr>
               <w:t>Título del producto "Libre inversión"</w:t>
             </w:r>
@@ -5030,10 +5532,16 @@
             </w:tcMar>
           </w:tcPr>
           <w:p>
-            <w:r>
-              <w:rPr>
-                <w:sz w:val="19"/>
-                <w:szCs w:val="19"/>
+            <w:pPr>
+              <w:rPr>
+                <w:lang w:val="es-MX"/>
+              </w:rPr>
+            </w:pPr>
+            <w:r>
+              <w:rPr>
+                <w:sz w:val="19"/>
+                <w:szCs w:val="19"/>
+                <w:lang w:val="es-MX"/>
               </w:rPr>
               <w:t>Ningún crédito se titula "Libre inversión": todos aparecen como "Préstamos" (4 de 4 clientes)</w:t>
             </w:r>
@@ -5057,12 +5565,18 @@
             </w:tcMar>
           </w:tcPr>
           <w:p>
-            <w:r>
-              <w:rPr>
-                <w:sz w:val="19"/>
-                <w:szCs w:val="19"/>
-              </w:rPr>
-              <w:t>Se validan las tarjetas "Préstamos". Confirmar cómo se identifica un crédito de libre inversión</w:t>
+            <w:pPr>
+              <w:rPr>
+                <w:lang w:val="es-MX"/>
+              </w:rPr>
+            </w:pPr>
+            <w:r>
+              <w:rPr>
+                <w:sz w:val="19"/>
+                <w:szCs w:val="19"/>
+                <w:lang w:val="es-MX"/>
+              </w:rPr>
+              <w:t xml:space="preserve">Confirmado: todas las tarjetas de la sección créditos son "Préstamos"</w:t>
             </w:r>
           </w:p>
         </w:tc>
@@ -5137,10 +5651,16 @@
             </w:tcMar>
           </w:tcPr>
           <w:p>
-            <w:r>
-              <w:rPr>
-                <w:sz w:val="19"/>
-                <w:szCs w:val="19"/>
+            <w:pPr>
+              <w:rPr>
+                <w:lang w:val="es-MX"/>
+              </w:rPr>
+            </w:pPr>
+            <w:r>
+              <w:rPr>
+                <w:sz w:val="19"/>
+                <w:szCs w:val="19"/>
+                <w:lang w:val="es-MX"/>
               </w:rPr>
               <w:t>Estados "Cuota venció Hoy" (punto rojo) y "Cuota vence 24 Oct" (punto verde)</w:t>
             </w:r>
@@ -5163,12 +5683,18 @@
             </w:tcMar>
           </w:tcPr>
           <w:p>
-            <w:r>
-              <w:rPr>
-                <w:sz w:val="19"/>
-                <w:szCs w:val="19"/>
-              </w:rPr>
-              <w:t>"Cuota vencio 1 Jun" (sin tilde) con punto rojo. No se observó ninguna cuota vigente: los créditos de prueba están en mora</w:t>
+            <w:pPr>
+              <w:rPr>
+                <w:lang w:val="es-MX"/>
+              </w:rPr>
+            </w:pPr>
+            <w:r>
+              <w:rPr>
+                <w:sz w:val="19"/>
+                <w:szCs w:val="19"/>
+                <w:lang w:val="es-MX"/>
+              </w:rPr>
+              <w:t xml:space="preserve">"Cuota vencio 1 Jun" (sin tilde) con punto rojo. No se observó ninguna cuota vigente: los créditos de prueba están en mora</w:t>
             </w:r>
           </w:p>
         </w:tc>
@@ -5189,12 +5715,18 @@
             </w:tcMar>
           </w:tcPr>
           <w:p>
-            <w:r>
-              <w:rPr>
-                <w:sz w:val="19"/>
-                <w:szCs w:val="19"/>
-              </w:rPr>
-              <w:t>Se valida el estado vencido observado. Corregir la tilde y entregar un cliente con cuota vigente</w:t>
+            <w:pPr>
+              <w:rPr>
+                <w:lang w:val="es-MX"/>
+              </w:rPr>
+            </w:pPr>
+            <w:r>
+              <w:rPr>
+                <w:sz w:val="19"/>
+                <w:szCs w:val="19"/>
+                <w:lang w:val="es-MX"/>
+              </w:rPr>
+              <w:t xml:space="preserve">Confirmado: se valida el estado vencido observado</w:t>
             </w:r>
           </w:p>
         </w:tc>
@@ -5272,10 +5804,16 @@
             </w:tcMar>
           </w:tcPr>
           <w:p>
-            <w:r>
-              <w:rPr>
-                <w:sz w:val="19"/>
-                <w:szCs w:val="19"/>
+            <w:pPr>
+              <w:rPr>
+                <w:lang w:val="es-MX"/>
+              </w:rPr>
+            </w:pPr>
+            <w:r>
+              <w:rPr>
+                <w:sz w:val="19"/>
+                <w:szCs w:val="19"/>
+                <w:lang w:val="es-MX"/>
               </w:rPr>
               <w:t>Texto "Crédito rotativo" con etiqueta verde "Cupo aprobado"</w:t>
             </w:r>
@@ -5299,12 +5837,18 @@
             </w:tcMar>
           </w:tcPr>
           <w:p>
-            <w:r>
-              <w:rPr>
-                <w:sz w:val="19"/>
-                <w:szCs w:val="19"/>
-              </w:rPr>
-              <w:t>"Credito Rotativo" (sin tilde, R mayúscula) con "Cupo aprobado". El monto es el mismo en los 4 clientes, incluido un cliente CE sin créditos en la sábana</w:t>
+            <w:pPr>
+              <w:rPr>
+                <w:lang w:val="es-MX"/>
+              </w:rPr>
+            </w:pPr>
+            <w:r>
+              <w:rPr>
+                <w:sz w:val="19"/>
+                <w:szCs w:val="19"/>
+                <w:lang w:val="es-MX"/>
+              </w:rPr>
+              <w:t xml:space="preserve">"Credito Rotativo" (sin tilde, R mayúscula) con "Cupo aprobado". El monto es el mismo en los 4 clientes, incluido un cliente CE sin créditos en la sábana</w:t>
             </w:r>
           </w:p>
         </w:tc>
@@ -5326,12 +5870,18 @@
             </w:tcMar>
           </w:tcPr>
           <w:p>
-            <w:r>
-              <w:rPr>
-                <w:sz w:val="19"/>
-                <w:szCs w:val="19"/>
-              </w:rPr>
-              <w:t>Se valida el texto observado. Confirmar la tilde y si el monto es un valor fijo del ambiente de certificación</w:t>
+            <w:pPr>
+              <w:rPr>
+                <w:lang w:val="es-MX"/>
+              </w:rPr>
+            </w:pPr>
+            <w:r>
+              <w:rPr>
+                <w:sz w:val="19"/>
+                <w:szCs w:val="19"/>
+                <w:lang w:val="es-MX"/>
+              </w:rPr>
+              <w:t xml:space="preserve">Es un mock: no se valida el monto. Se valida el texto y la etiqueta observados</w:t>
             </w:r>
           </w:p>
         </w:tc>
@@ -5432,12 +5982,18 @@
             </w:tcMar>
           </w:tcPr>
           <w:p>
-            <w:r>
-              <w:rPr>
-                <w:sz w:val="19"/>
-                <w:szCs w:val="19"/>
-              </w:rPr>
-              <w:t>Tarjeta adicional "Cupo rotativo $0,00 · Cuota vencio 1 Jun" (1 de 4 clientes), no descrita en ningún caso</w:t>
+            <w:pPr>
+              <w:rPr>
+                <w:lang w:val="es-MX"/>
+              </w:rPr>
+            </w:pPr>
+            <w:r>
+              <w:rPr>
+                <w:sz w:val="19"/>
+                <w:szCs w:val="19"/>
+                <w:lang w:val="es-MX"/>
+              </w:rPr>
+              <w:t xml:space="preserve">Tarjeta adicional "Cupo rotativo $0,00 · Cuota vencio 1 Jun" (1 de 4 clientes), no descrita en ningún caso</w:t>
             </w:r>
           </w:p>
         </w:tc>
@@ -5458,12 +6014,18 @@
             </w:tcMar>
           </w:tcPr>
           <w:p>
-            <w:r>
-              <w:rPr>
-                <w:sz w:val="19"/>
-                <w:szCs w:val="19"/>
-              </w:rPr>
-              <w:t>Definir si corresponde a 38708 o a otro caso</w:t>
+            <w:pPr>
+              <w:rPr>
+                <w:lang w:val="es-MX"/>
+              </w:rPr>
+            </w:pPr>
+            <w:r>
+              <w:rPr>
+                <w:sz w:val="19"/>
+                <w:szCs w:val="19"/>
+                <w:lang w:val="es-MX"/>
+              </w:rPr>
+              <w:t xml:space="preserve">Es un mock: no se valida por ahora</w:t>
             </w:r>
           </w:p>
         </w:tc>
@@ -5541,10 +6103,16 @@
             </w:tcMar>
           </w:tcPr>
           <w:p>
-            <w:r>
-              <w:rPr>
-                <w:sz w:val="19"/>
-                <w:szCs w:val="19"/>
+            <w:pPr>
+              <w:rPr>
+                <w:lang w:val="es-MX"/>
+              </w:rPr>
+            </w:pPr>
+            <w:r>
+              <w:rPr>
+                <w:sz w:val="19"/>
+                <w:szCs w:val="19"/>
+                <w:lang w:val="es-MX"/>
               </w:rPr>
               <w:t>En "Tus créditos", opción "crédito aprobado" con el saldo aprobado</w:t>
             </w:r>
@@ -5568,12 +6136,18 @@
             </w:tcMar>
           </w:tcPr>
           <w:p>
-            <w:r>
-              <w:rPr>
-                <w:sz w:val="19"/>
-                <w:szCs w:val="19"/>
-              </w:rPr>
-              <w:t>Banner en la parte superior: "Tienes un crédito pre-aprobado ¡Adquiérelo ya!", fuera de "Tus créditos" y sin monto (4 de 4 clientes)</w:t>
+            <w:pPr>
+              <w:rPr>
+                <w:lang w:val="es-MX"/>
+              </w:rPr>
+            </w:pPr>
+            <w:r>
+              <w:rPr>
+                <w:sz w:val="19"/>
+                <w:szCs w:val="19"/>
+                <w:lang w:val="es-MX"/>
+              </w:rPr>
+              <w:t xml:space="preserve">Banner en la parte superior: "Tienes un crédito pre-aprobado ¡Adquiérelo ya!", fuera de "Tus créditos" y sin monto (4 de 4 clientes)</w:t>
             </w:r>
           </w:p>
         </w:tc>
@@ -5599,8 +6173,16 @@
               <w:rPr>
                 <w:sz w:val="19"/>
                 <w:szCs w:val="19"/>
-              </w:rPr>
-              <w:t>Se valida el banner y se reporta que no muestra el saldo aprobado. Confirmar el diseño</w:t>
+                <w:lang w:val="es-MX"/>
+              </w:rPr>
+              <w:t xml:space="preserve">Confirmado: solo se valida que el banner exista</w:t>
+            </w:r>
+            <w:r>
+              <w:rPr>
+                <w:sz w:val="19"/>
+                <w:szCs w:val="19"/>
+              </w:rPr>
+              <w:t/>
             </w:r>
           </w:p>
         </w:tc>
@@ -5675,10 +6257,16 @@
             </w:tcMar>
           </w:tcPr>
           <w:p>
-            <w:r>
-              <w:rPr>
-                <w:sz w:val="19"/>
-                <w:szCs w:val="19"/>
+            <w:pPr>
+              <w:rPr>
+                <w:lang w:val="es-MX"/>
+              </w:rPr>
+            </w:pPr>
+            <w:r>
+              <w:rPr>
+                <w:sz w:val="19"/>
+                <w:szCs w:val="19"/>
+                <w:lang w:val="es-MX"/>
               </w:rPr>
               <w:t>Tarjeta de cuenta corriente en "Tus cuentas"</w:t>
             </w:r>
@@ -5701,10 +6289,16 @@
             </w:tcMar>
           </w:tcPr>
           <w:p>
-            <w:r>
-              <w:rPr>
-                <w:sz w:val="19"/>
-                <w:szCs w:val="19"/>
+            <w:pPr>
+              <w:rPr>
+                <w:lang w:val="es-MX"/>
+              </w:rPr>
+            </w:pPr>
+            <w:r>
+              <w:rPr>
+                <w:sz w:val="19"/>
+                <w:szCs w:val="19"/>
+                <w:lang w:val="es-MX"/>
               </w:rPr>
               <w:t>Ninguno de los 4 clientes tiene cuenta corriente</w:t>
             </w:r>
@@ -5727,12 +6321,18 @@
             </w:tcMar>
           </w:tcPr>
           <w:p>
-            <w:r>
-              <w:rPr>
-                <w:sz w:val="19"/>
-                <w:szCs w:val="19"/>
-              </w:rPr>
-              <w:t>Entregar un cliente de prueba con cuenta corriente</w:t>
+            <w:pPr>
+              <w:rPr>
+                <w:lang w:val="es-MX"/>
+              </w:rPr>
+            </w:pPr>
+            <w:r>
+              <w:rPr>
+                <w:sz w:val="19"/>
+                <w:szCs w:val="19"/>
+                <w:lang w:val="es-MX"/>
+              </w:rPr>
+              <w:t xml:space="preserve">Cliente entregado el 20/10: 38706 y 39562 exitosos (ver #18)</w:t>
             </w:r>
           </w:p>
         </w:tc>
@@ -5810,10 +6410,16 @@
             </w:tcMar>
           </w:tcPr>
           <w:p>
-            <w:r>
-              <w:rPr>
-                <w:sz w:val="19"/>
-                <w:szCs w:val="19"/>
+            <w:pPr>
+              <w:rPr>
+                <w:lang w:val="es-MX"/>
+              </w:rPr>
+            </w:pPr>
+            <w:r>
+              <w:rPr>
+                <w:sz w:val="19"/>
+                <w:szCs w:val="19"/>
+                <w:lang w:val="es-MX"/>
               </w:rPr>
               <w:t>Saldos iguales a la información real del cliente (backend)</w:t>
             </w:r>
@@ -5837,10 +6443,16 @@
             </w:tcMar>
           </w:tcPr>
           <w:p>
-            <w:r>
-              <w:rPr>
-                <w:sz w:val="19"/>
-                <w:szCs w:val="19"/>
+            <w:pPr>
+              <w:rPr>
+                <w:lang w:val="es-MX"/>
+              </w:rPr>
+            </w:pPr>
+            <w:r>
+              <w:rPr>
+                <w:sz w:val="19"/>
+                <w:szCs w:val="19"/>
+                <w:lang w:val="es-MX"/>
               </w:rPr>
               <w:t>Los montos del Home no coinciden con ninguna columna de saldo de la sábana (CAPITAL, SALDO_ACTUAL, VLR_XPAGAR, entre otras)</w:t>
             </w:r>
@@ -5868,8 +6480,16 @@
               <w:rPr>
                 <w:sz w:val="19"/>
                 <w:szCs w:val="19"/>
-              </w:rPr>
-              <w:t>El monto esperado se informará en la nueva columna Monto del archivo de control. Definir quién lo entrega desde el backend</w:t>
+                <w:lang w:val="es-MX"/>
+              </w:rPr>
+              <w:t xml:space="preserve">Saldos del backend entregados el 20/10. La comparación con el monto del control funciona</w:t>
+            </w:r>
+            <w:r>
+              <w:rPr>
+                <w:sz w:val="19"/>
+                <w:szCs w:val="19"/>
+              </w:rPr>
+              <w:t/>
             </w:r>
           </w:p>
         </w:tc>
@@ -5944,12 +6564,18 @@
             </w:tcMar>
           </w:tcPr>
           <w:p>
-            <w:r>
-              <w:rPr>
-                <w:sz w:val="19"/>
-                <w:szCs w:val="19"/>
-              </w:rPr>
-              <w:t>Skeletons (marcadores de carga) mientras se obtienen los saldos</w:t>
+            <w:pPr>
+              <w:rPr>
+                <w:lang w:val="es-MX"/>
+              </w:rPr>
+            </w:pPr>
+            <w:r>
+              <w:rPr>
+                <w:sz w:val="19"/>
+                <w:szCs w:val="19"/>
+                <w:lang w:val="es-MX"/>
+              </w:rPr>
+              <w:t xml:space="preserve">Skeletons (marcadores de carga) mientras se obtienen los saldos</w:t>
             </w:r>
           </w:p>
         </w:tc>
@@ -5970,12 +6596,18 @@
             </w:tcMar>
           </w:tcPr>
           <w:p>
-            <w:r>
-              <w:rPr>
-                <w:sz w:val="19"/>
-                <w:szCs w:val="19"/>
-              </w:rPr>
-              <w:t>Se observó el skeleton entre 3 y 4 segundos: primero el encabezado, los accesos y las secciones en gris, luego los productos</w:t>
+            <w:pPr>
+              <w:rPr>
+                <w:lang w:val="es-MX"/>
+              </w:rPr>
+            </w:pPr>
+            <w:r>
+              <w:rPr>
+                <w:sz w:val="19"/>
+                <w:szCs w:val="19"/>
+                <w:lang w:val="es-MX"/>
+              </w:rPr>
+              <w:t xml:space="preserve">Se observó el skeleton entre 3 y 4 segundos: primero el encabezado, los accesos y las secciones en gris, luego los productos</w:t>
             </w:r>
           </w:p>
         </w:tc>
@@ -5996,12 +6628,18 @@
             </w:tcMar>
           </w:tcPr>
           <w:p>
-            <w:r>
-              <w:rPr>
-                <w:sz w:val="19"/>
-                <w:szCs w:val="19"/>
-              </w:rPr>
-              <w:t>Automatizado: valida el indicador "Cargando..." en Tus cuentas y Tus créditos antes de los montos y deja la captura del skeleton. Si el backend responde muy rápido el skeleton puede no alcanzar a verse</w:t>
+            <w:pPr>
+              <w:rPr>
+                <w:lang w:val="es-MX"/>
+              </w:rPr>
+            </w:pPr>
+            <w:r>
+              <w:rPr>
+                <w:sz w:val="19"/>
+                <w:szCs w:val="19"/>
+                <w:lang w:val="es-MX"/>
+              </w:rPr>
+              <w:t xml:space="preserve">Confirmado: es el comportamiento normal; lo importante es que carguen los datos</w:t>
             </w:r>
           </w:p>
         </w:tc>
@@ -6092,14 +6730,18 @@
               <w:rPr>
                 <w:sz w:val="19"/>
                 <w:szCs w:val="19"/>
-              </w:rPr>
-            </w:pPr>
-            <w:r>
-              <w:rPr>
-                <w:sz w:val="19"/>
-                <w:szCs w:val="19"/>
-              </w:rPr>
-              <w:t>Texto "Los movimientos listados corresponden a las últimas 20 transacciones realizadas en su producto"</w:t>
+                <w:lang w:val="es-MX"/>
+              </w:rPr>
+            </w:pPr>
+            <w:r>
+              <w:rPr>
+                <w:sz w:val="19"/>
+                <w:szCs w:val="19"/>
+                <w:lang w:val="es-MX"/>
+              </w:rPr>
+              <w:t xml:space="preserve">Texto "Los movimientos listados corresponden a las últimas 20 </w:t>
+              <w:lastRenderedPageBreak/>
+              <w:t>transacciones realizadas en su producto"</w:t>
             </w:r>
           </w:p>
         </w:tc>
@@ -6124,14 +6766,19 @@
               <w:rPr>
                 <w:sz w:val="19"/>
                 <w:szCs w:val="19"/>
-              </w:rPr>
-            </w:pPr>
-            <w:r>
-              <w:rPr>
-                <w:sz w:val="19"/>
-                <w:szCs w:val="19"/>
-              </w:rPr>
-              <w:t>Texto "Los movimientos mostrados corresponden a las últimas 20 transacciones realizadas en tu producto" (S23, 19/10)</w:t>
+                <w:lang w:val="es-MX"/>
+              </w:rPr>
+            </w:pPr>
+            <w:r>
+              <w:rPr>
+                <w:sz w:val="19"/>
+                <w:szCs w:val="19"/>
+                <w:lang w:val="es-MX"/>
+              </w:rPr>
+              <w:lastRenderedPageBreak/>
+              <w:t xml:space="preserve">Texto "Los movimientos mostrados corresponden a las últimas 20 transacciones </w:t>
+              <w:lastRenderedPageBreak/>
+              <w:t>realizadas en tu producto" (S23, 19/10)</w:t>
             </w:r>
           </w:p>
         </w:tc>
@@ -6156,14 +6803,17 @@
               <w:rPr>
                 <w:sz w:val="19"/>
                 <w:szCs w:val="19"/>
-              </w:rPr>
-            </w:pPr>
-            <w:r>
-              <w:rPr>
-                <w:sz w:val="19"/>
-                <w:szCs w:val="19"/>
-              </w:rPr>
-              <w:t>Se aceptan ambos textos. Confirmar cuál es el correcto</w:t>
+                <w:lang w:val="es-MX"/>
+              </w:rPr>
+            </w:pPr>
+            <w:r>
+              <w:rPr>
+                <w:sz w:val="19"/>
+                <w:szCs w:val="19"/>
+                <w:lang w:val="es-MX"/>
+              </w:rPr>
+              <w:lastRenderedPageBreak/>
+              <w:t xml:space="preserve">Confirmado: el texto correcto es el de la app</w:t>
             </w:r>
           </w:p>
         </w:tc>
@@ -6254,12 +6904,14 @@
               <w:rPr>
                 <w:sz w:val="19"/>
                 <w:szCs w:val="19"/>
-              </w:rPr>
-            </w:pPr>
-            <w:r>
-              <w:rPr>
-                <w:sz w:val="19"/>
-                <w:szCs w:val="19"/>
+                <w:lang w:val="es-MX"/>
+              </w:rPr>
+            </w:pPr>
+            <w:r>
+              <w:rPr>
+                <w:sz w:val="19"/>
+                <w:szCs w:val="19"/>
+                <w:lang w:val="es-MX"/>
               </w:rPr>
               <w:t>Pantalla "Detalle de Cuenta" con la opción "Compartir" en la esquina superior derecha</w:t>
             </w:r>
@@ -6292,8 +6944,16 @@
               <w:rPr>
                 <w:sz w:val="19"/>
                 <w:szCs w:val="19"/>
-              </w:rPr>
-              <w:t>Título "Cuenta"; el botón "Compartir cuenta" está junto al tipo y número de la cuenta. Acción rápida: solo "Tus llaves" (Bre-B, ¡Próximamente!)</w:t>
+                <w:lang w:val="es-MX"/>
+              </w:rPr>
+              <w:t xml:space="preserve">Título "Cuenta"; el botón "Compartir cuenta" está junto al tipo y número de la cuenta. </w:t>
+            </w:r>
+            <w:r>
+              <w:rPr>
+                <w:sz w:val="19"/>
+                <w:szCs w:val="19"/>
+              </w:rPr>
+              <w:t xml:space="preserve">Acción rápida: solo "Tus llaves" (Bre-B, ¡Próximamente!)</w:t>
             </w:r>
           </w:p>
         </w:tc>
@@ -6318,14 +6978,16 @@
               <w:rPr>
                 <w:sz w:val="19"/>
                 <w:szCs w:val="19"/>
-              </w:rPr>
-            </w:pPr>
-            <w:r>
-              <w:rPr>
-                <w:sz w:val="19"/>
-                <w:szCs w:val="19"/>
-              </w:rPr>
-              <w:t>Se valida lo observado. Confirmar el diseño</w:t>
+                <w:lang w:val="es-MX"/>
+              </w:rPr>
+            </w:pPr>
+            <w:r>
+              <w:rPr>
+                <w:sz w:val="19"/>
+                <w:szCs w:val="19"/>
+                <w:lang w:val="es-MX"/>
+              </w:rPr>
+              <w:t xml:space="preserve">Confirmado: se valida lo observado</w:t>
             </w:r>
           </w:p>
         </w:tc>
@@ -6416,12 +7078,14 @@
               <w:rPr>
                 <w:sz w:val="19"/>
                 <w:szCs w:val="19"/>
-              </w:rPr>
-            </w:pPr>
-            <w:r>
-              <w:rPr>
-                <w:sz w:val="19"/>
-                <w:szCs w:val="19"/>
+                <w:lang w:val="es-MX"/>
+              </w:rPr>
+            </w:pPr>
+            <w:r>
+              <w:rPr>
+                <w:sz w:val="19"/>
+                <w:szCs w:val="19"/>
+                <w:lang w:val="es-MX"/>
               </w:rPr>
               <w:t>Movimiento con fecha "05 May 2026 - 12:30 pm" y monto "$ 3,700,000,00"</w:t>
             </w:r>
@@ -6448,14 +7112,16 @@
               <w:rPr>
                 <w:sz w:val="19"/>
                 <w:szCs w:val="19"/>
-              </w:rPr>
-            </w:pPr>
-            <w:r>
-              <w:rPr>
-                <w:sz w:val="19"/>
-                <w:szCs w:val="19"/>
-              </w:rPr>
-              <w:t>Fecha "13 Oct.. 2026 - 08:06 p.m" (doble punto en el mes) y monto "-,00" (con signo en los débitos)</w:t>
+                <w:lang w:val="es-MX"/>
+              </w:rPr>
+            </w:pPr>
+            <w:r>
+              <w:rPr>
+                <w:sz w:val="19"/>
+                <w:szCs w:val="19"/>
+                <w:lang w:val="es-MX"/>
+              </w:rPr>
+              <w:t xml:space="preserve">Fecha "13 Oct.. 2026 - 08:06 p.m" (doble punto en el mes) y monto "-,00" (con signo en los débitos)</w:t>
             </w:r>
           </w:p>
         </w:tc>
@@ -6480,14 +7146,16 @@
               <w:rPr>
                 <w:sz w:val="19"/>
                 <w:szCs w:val="19"/>
-              </w:rPr>
-            </w:pPr>
-            <w:r>
-              <w:rPr>
-                <w:sz w:val="19"/>
-                <w:szCs w:val="19"/>
-              </w:rPr>
-              <w:t>Se aceptan los formatos observados. Corregir el doble punto en la app o el ejemplo del caso</w:t>
+                <w:lang w:val="es-MX"/>
+              </w:rPr>
+            </w:pPr>
+            <w:r>
+              <w:rPr>
+                <w:sz w:val="19"/>
+                <w:szCs w:val="19"/>
+                <w:lang w:val="es-MX"/>
+              </w:rPr>
+              <w:t xml:space="preserve">Confirmado: se dejan los formatos observados</w:t>
             </w:r>
           </w:p>
         </w:tc>
@@ -6578,12 +7246,14 @@
               <w:rPr>
                 <w:sz w:val="19"/>
                 <w:szCs w:val="19"/>
-              </w:rPr>
-            </w:pPr>
-            <w:r>
-              <w:rPr>
-                <w:sz w:val="19"/>
-                <w:szCs w:val="19"/>
+                <w:lang w:val="es-MX"/>
+              </w:rPr>
+            </w:pPr>
+            <w:r>
+              <w:rPr>
+                <w:sz w:val="19"/>
+                <w:szCs w:val="19"/>
+                <w:lang w:val="es-MX"/>
               </w:rPr>
               <w:t>Monto, tipo, cuenta de origen, cuenta de destino (si aplica), fecha, hora y número de referencia</w:t>
             </w:r>
@@ -6610,12 +7280,14 @@
               <w:rPr>
                 <w:sz w:val="19"/>
                 <w:szCs w:val="19"/>
-              </w:rPr>
-            </w:pPr>
-            <w:r>
-              <w:rPr>
-                <w:sz w:val="19"/>
-                <w:szCs w:val="19"/>
+                <w:lang w:val="es-MX"/>
+              </w:rPr>
+            </w:pPr>
+            <w:r>
+              <w:rPr>
+                <w:sz w:val="19"/>
+                <w:szCs w:val="19"/>
+                <w:lang w:val="es-MX"/>
               </w:rPr>
               <w:t>Muestra "MONTO ENVIADO", monto, fecha y hora, "Comprobante N°" y descripción. No muestra cuenta de origen ni de destino y el comprobante sale en ceros (000000000000)</w:t>
             </w:r>
@@ -6648,8 +7320,16 @@
               <w:rPr>
                 <w:sz w:val="19"/>
                 <w:szCs w:val="19"/>
-              </w:rPr>
-              <w:t>Se valida lo que muestra; origen, destino y comprobante quedan como observación. Confirmar el diseño y el número de comprobante</w:t>
+                <w:lang w:val="es-MX"/>
+              </w:rPr>
+              <w:t xml:space="preserve">Aprobado</w:t>
+            </w:r>
+            <w:r>
+              <w:rPr>
+                <w:sz w:val="19"/>
+                <w:szCs w:val="19"/>
+              </w:rPr>
+              <w:t/>
             </w:r>
           </w:p>
         </w:tc>
@@ -6740,12 +7420,14 @@
               <w:rPr>
                 <w:sz w:val="19"/>
                 <w:szCs w:val="19"/>
-              </w:rPr>
-            </w:pPr>
-            <w:r>
-              <w:rPr>
-                <w:sz w:val="19"/>
-                <w:szCs w:val="19"/>
+                <w:lang w:val="es-MX"/>
+              </w:rPr>
+            </w:pPr>
+            <w:r>
+              <w:rPr>
+                <w:sz w:val="19"/>
+                <w:szCs w:val="19"/>
+                <w:lang w:val="es-MX"/>
               </w:rPr>
               <w:t>La imagen se descarga y se verifica en la galería o carpeta de archivos</w:t>
             </w:r>
@@ -6772,14 +7454,16 @@
               <w:rPr>
                 <w:sz w:val="19"/>
                 <w:szCs w:val="19"/>
-              </w:rPr>
-            </w:pPr>
-            <w:r>
-              <w:rPr>
-                <w:sz w:val="19"/>
-                <w:szCs w:val="19"/>
-              </w:rPr>
-              <w:t>Aviso "Tu comprobante se descargó correctamente." y la imagen queda en Documents como comprobante-&lt;N°&gt;.png</w:t>
+                <w:lang w:val="es-MX"/>
+              </w:rPr>
+            </w:pPr>
+            <w:r>
+              <w:rPr>
+                <w:sz w:val="19"/>
+                <w:szCs w:val="19"/>
+                <w:lang w:val="es-MX"/>
+              </w:rPr>
+              <w:t xml:space="preserve">Aviso "Tu comprobante se descargó correctamente." y la imagen queda en Documents como comprobante-&lt;N°&gt;.png</w:t>
             </w:r>
           </w:p>
         </w:tc>
@@ -6810,8 +7494,16 @@
               <w:rPr>
                 <w:sz w:val="19"/>
                 <w:szCs w:val="19"/>
-              </w:rPr>
-              <w:t>Se valida el archivo en Documents. Confirmar la ubicación esperada</w:t>
+                <w:lang w:val="es-MX"/>
+              </w:rPr>
+              <w:t xml:space="preserve">Confirmado: la ubicación depende del celular (en algunos queda en la galería). En el S23 se valida en Documents</w:t>
+            </w:r>
+            <w:r>
+              <w:rPr>
+                <w:sz w:val="19"/>
+                <w:szCs w:val="19"/>
+              </w:rPr>
+              <w:t/>
             </w:r>
           </w:p>
         </w:tc>
@@ -6902,12 +7594,14 @@
               <w:rPr>
                 <w:sz w:val="19"/>
                 <w:szCs w:val="19"/>
-              </w:rPr>
-            </w:pPr>
-            <w:r>
-              <w:rPr>
-                <w:sz w:val="19"/>
-                <w:szCs w:val="19"/>
+                <w:lang w:val="es-MX"/>
+              </w:rPr>
+            </w:pPr>
+            <w:r>
+              <w:rPr>
+                <w:sz w:val="19"/>
+                <w:szCs w:val="19"/>
+                <w:lang w:val="es-MX"/>
               </w:rPr>
               <w:t>39567: se muestran las últimas 20 transacciones. 39568: solo los movimientos del último mes</w:t>
             </w:r>
@@ -6934,12 +7628,14 @@
               <w:rPr>
                 <w:sz w:val="19"/>
                 <w:szCs w:val="19"/>
-              </w:rPr>
-            </w:pPr>
-            <w:r>
-              <w:rPr>
-                <w:sz w:val="19"/>
-                <w:szCs w:val="19"/>
+                <w:lang w:val="es-MX"/>
+              </w:rPr>
+            </w:pPr>
+            <w:r>
+              <w:rPr>
+                <w:sz w:val="19"/>
+                <w:szCs w:val="19"/>
+                <w:lang w:val="es-MX"/>
               </w:rPr>
               <w:t>El aviso dice "Los movimientos mostrados corresponden a las últimas 20 transacciones", pero la app muestra solo los del último mes: un cliente con 85 transacciones (30 en abril) ve 3</w:t>
             </w:r>
@@ -6966,20 +7662,196 @@
               <w:rPr>
                 <w:sz w:val="19"/>
                 <w:szCs w:val="19"/>
-              </w:rPr>
-            </w:pPr>
-            <w:r>
-              <w:rPr>
-                <w:sz w:val="19"/>
-                <w:szCs w:val="19"/>
-              </w:rPr>
-              <w:t>Se validan ambas reglas (máximo 20 y último mes). Corregir el texto del aviso para que mencione el periodo</w:t>
+                <w:lang w:val="es-MX"/>
+              </w:rPr>
+            </w:pPr>
+            <w:r>
+              <w:rPr>
+                <w:sz w:val="19"/>
+                <w:szCs w:val="19"/>
+                <w:lang w:val="es-MX"/>
+              </w:rPr>
+              <w:t xml:space="preserve">Confirmado: solo se visualizan los movimientos de los últimos 30 días. Se validan ambas reglas</w:t>
+            </w:r>
+          </w:p>
+        </w:tc>
+      </w:tr>
+      <w:tr>
+        <w:tc>
+          <w:tcPr>
+            <w:tcW w:w="500" w:type="dxa"/>
+            <w:tcBorders>
+              <w:top w:val="single" w:sz="4" w:space="0" w:color="BFBFBF"/>
+              <w:left w:val="single" w:sz="4" w:space="0" w:color="BFBFBF"/>
+              <w:bottom w:val="single" w:sz="4" w:space="0" w:color="BFBFBF"/>
+              <w:right w:val="single" w:sz="4" w:space="0" w:color="BFBFBF"/>
+            </w:tcBorders>
+            <w:tcMar>
+              <w:top w:w="60" w:type="dxa"/>
+              <w:left w:w="100" w:type="dxa"/>
+              <w:bottom w:w="60" w:type="dxa"/>
+              <w:right w:w="100" w:type="dxa"/>
+            </w:tcMar>
+          </w:tcPr>
+          <w:p>
+            <w:pPr>
+              <w:rPr>
+                <w:sz w:val="19"/>
+                <w:szCs w:val="19"/>
+              </w:rPr>
+            </w:pPr>
+            <w:r>
+              <w:rPr>
+                <w:sz w:val="19"/>
+                <w:szCs w:val="19"/>
+              </w:rPr>
+              <w:t>18</w:t>
+            </w:r>
+          </w:p>
+        </w:tc>
+        <w:tc>
+          <w:tcPr>
+            <w:tcW w:w="1000" w:type="dxa"/>
+            <w:tcBorders>
+              <w:top w:val="single" w:sz="4" w:space="0" w:color="BFBFBF"/>
+              <w:left w:val="single" w:sz="4" w:space="0" w:color="BFBFBF"/>
+              <w:bottom w:val="single" w:sz="4" w:space="0" w:color="BFBFBF"/>
+              <w:right w:val="single" w:sz="4" w:space="0" w:color="BFBFBF"/>
+            </w:tcBorders>
+            <w:tcMar>
+              <w:top w:w="60" w:type="dxa"/>
+              <w:left w:w="100" w:type="dxa"/>
+              <w:bottom w:w="60" w:type="dxa"/>
+              <w:right w:w="100" w:type="dxa"/>
+            </w:tcMar>
+          </w:tcPr>
+          <w:p>
+            <w:pPr>
+              <w:rPr>
+                <w:sz w:val="19"/>
+                <w:szCs w:val="19"/>
+              </w:rPr>
+            </w:pPr>
+            <w:r>
+              <w:rPr>
+                <w:sz w:val="19"/>
+                <w:szCs w:val="19"/>
+              </w:rPr>
+              <w:t>38706, 39562</w:t>
+            </w:r>
+          </w:p>
+        </w:tc>
+        <w:tc>
+          <w:tcPr>
+            <w:tcW w:w="2700" w:type="dxa"/>
+            <w:tcBorders>
+              <w:top w:val="single" w:sz="4" w:space="0" w:color="BFBFBF"/>
+              <w:left w:val="single" w:sz="4" w:space="0" w:color="BFBFBF"/>
+              <w:bottom w:val="single" w:sz="4" w:space="0" w:color="BFBFBF"/>
+              <w:right w:val="single" w:sz="4" w:space="0" w:color="BFBFBF"/>
+            </w:tcBorders>
+            <w:tcMar>
+              <w:top w:w="60" w:type="dxa"/>
+              <w:left w:w="100" w:type="dxa"/>
+              <w:bottom w:w="60" w:type="dxa"/>
+              <w:right w:w="100" w:type="dxa"/>
+            </w:tcMar>
+          </w:tcPr>
+          <w:p>
+            <w:pPr>
+              <w:rPr>
+                <w:sz w:val="19"/>
+                <w:szCs w:val="19"/>
+                <w:lang w:val="es-MX"/>
+              </w:rPr>
+            </w:pPr>
+            <w:r>
+              <w:rPr>
+                <w:sz w:val="19"/>
+                <w:szCs w:val="19"/>
+                <w:lang w:val="es-MX"/>
+              </w:rPr>
+              <w:t>Tarjeta de cuenta corriente en "Tus cuentas"</w:t>
+            </w:r>
+          </w:p>
+        </w:tc>
+        <w:tc>
+          <w:tcPr>
+            <w:tcW w:w="2900" w:type="dxa"/>
+            <w:tcBorders>
+              <w:top w:val="single" w:sz="4" w:space="0" w:color="BFBFBF"/>
+              <w:left w:val="single" w:sz="4" w:space="0" w:color="BFBFBF"/>
+              <w:bottom w:val="single" w:sz="4" w:space="0" w:color="BFBFBF"/>
+              <w:right w:val="single" w:sz="4" w:space="0" w:color="BFBFBF"/>
+            </w:tcBorders>
+            <w:tcMar>
+              <w:top w:w="60" w:type="dxa"/>
+              <w:left w:w="100" w:type="dxa"/>
+              <w:bottom w:w="60" w:type="dxa"/>
+              <w:right w:w="100" w:type="dxa"/>
+            </w:tcMar>
+          </w:tcPr>
+          <w:p>
+            <w:pPr>
+              <w:rPr>
+                <w:sz w:val="19"/>
+                <w:szCs w:val="19"/>
+                <w:lang w:val="es-MX"/>
+              </w:rPr>
+            </w:pPr>
+            <w:r>
+              <w:rPr>
+                <w:sz w:val="19"/>
+                <w:szCs w:val="19"/>
+                <w:lang w:val="es-MX"/>
+              </w:rPr>
+              <w:t>Título "Cuentas corrientes **** 0568" (en plural, como "Cuentas de ahorro"), 20/10</w:t>
+            </w:r>
+          </w:p>
+        </w:tc>
+        <w:tc>
+          <w:tcPr>
+            <w:tcW w:w="2260" w:type="dxa"/>
+            <w:tcBorders>
+              <w:top w:val="single" w:sz="4" w:space="0" w:color="BFBFBF"/>
+              <w:left w:val="single" w:sz="4" w:space="0" w:color="BFBFBF"/>
+              <w:bottom w:val="single" w:sz="4" w:space="0" w:color="BFBFBF"/>
+              <w:right w:val="single" w:sz="4" w:space="0" w:color="BFBFBF"/>
+            </w:tcBorders>
+            <w:tcMar>
+              <w:top w:w="60" w:type="dxa"/>
+              <w:left w:w="100" w:type="dxa"/>
+              <w:bottom w:w="60" w:type="dxa"/>
+              <w:right w:w="100" w:type="dxa"/>
+            </w:tcMar>
+          </w:tcPr>
+          <w:p>
+            <w:pPr>
+              <w:rPr>
+                <w:sz w:val="19"/>
+                <w:szCs w:val="19"/>
+                <w:lang w:val="es-MX"/>
+              </w:rPr>
+            </w:pPr>
+            <w:r>
+              <w:rPr>
+                <w:sz w:val="19"/>
+                <w:szCs w:val="19"/>
+                <w:lang w:val="es-MX"/>
+              </w:rPr>
+              <w:t xml:space="preserve">Se valida el texto de la app (criterio de la respuesta #1)</w:t>
             </w:r>
           </w:p>
         </w:tc>
       </w:tr>
     </w:tbl>
-    <w:p/>
+    <w:p>
+      <w:pPr>
+        <w:rPr>
+          <w:lang w:val="es-MX"/>
+        </w:rPr>
+      </w:pPr>
+    </w:p>
     <w:sectPr>
       <w:footerReference w:type="default" r:id="rId7"/>
       <w:pgSz w:w="12240" w:h="15840"/>
@@ -7015,12 +7887,16 @@
   <w:p>
     <w:pPr>
       <w:jc w:val="right"/>
+      <w:rPr>
+        <w:lang w:val="es-MX"/>
+      </w:rPr>
     </w:pPr>
     <w:r>
       <w:rPr>
         <w:color w:val="808080"/>
         <w:sz w:val="16"/>
         <w:szCs w:val="16"/>
+        <w:lang w:val="es-MX"/>
       </w:rPr>
       <w:t xml:space="preserve">GreenSQA · Automatización App Mi Banco · Página </w:t>
     </w:r>
@@ -7037,6 +7913,7 @@
         <w:color w:val="808080"/>
         <w:sz w:val="16"/>
         <w:szCs w:val="16"/>
+        <w:lang w:val="es-MX"/>
       </w:rPr>
       <w:instrText>PAGE</w:instrText>
     </w:r>
@@ -7054,6 +7931,7 @@
         <w:color w:val="808080"/>
         <w:sz w:val="16"/>
         <w:szCs w:val="16"/>
+        <w:lang w:val="es-MX"/>
       </w:rPr>
       <w:t>1</w:t>
     </w:r>

</xml_diff>

<commit_message>
Consolidado v6: solo estado de construccion, notas generales y pendientes abiertos
Se retiran fechas de ejecucion, datos puntuales y el control de cambios ya
respondido por el equipo funcional.

Co-Authored-By: Claude Opus 5.5 <noreply@anthropic.com>
</commit_message>
<xml_diff>
--- a/Casos de Prueba/Consolidacion_Casos_de_Prueba.docx
+++ b/Casos de Prueba/Consolidacion_Casos_de_Prueba.docx
@@ -36,7 +36,7 @@
           <w:color w:val="595959"/>
           <w:lang w:val="es-MX"/>
         </w:rPr>
-        <w:t xml:space="preserve">App Mi Banco · Procesos Registro, Autenticación, Home y Cuentas · Versión 5 · 20 de octubre de 2026</w:t>
+        <w:t xml:space="preserve">App Mi Banco · Procesos Registro, Autenticación, Home y Cuentas · Versión 6 · 20 de octubre de 2026</w:t>
       </w:r>
     </w:p>
     <w:p>
@@ -80,28 +80,6 @@
           <w:lang w:val="es-MX"/>
         </w:rPr>
         <w:t xml:space="preserve">Fuentes: "Proyecto App_Autenticación y Registro.xlsx" (11 casos), "Proyecto App_Home.xlsx" (14 casos) y "Proyecto App_Cuentas (Inclu. 7x24).xlsx" (13 casos), exportados de Azure DevOps.</w:t>
-      </w:r>
-    </w:p>
-    <w:p>
-      <w:pPr>
-        <w:spacing w:after="120"/>
-        <w:rPr>
-          <w:lang w:val="es-MX"/>
-        </w:rPr>
-      </w:pPr>
-      <w:r>
-        <w:rPr>
-          <w:b/>
-          <w:bCs/>
-          <w:lang w:val="es-MX"/>
-        </w:rPr>
-        <w:t xml:space="preserve">Importante: </w:t>
-      </w:r>
-      <w:r>
-        <w:rPr>
-          <w:lang w:val="es-MX"/>
-        </w:rPr>
-        <w:t xml:space="preserve">las agrupaciones, el caso descartado y las verificaciones manuales son una propuesta de GreenSQA construida a partir del texto de cada caso en Azure. El equipo funcional las aprobó el 20/10/2026.</w:t>
       </w:r>
     </w:p>
     <w:p>
@@ -563,14 +541,14 @@
                 <w:szCs w:val="19"/>
                 <w:lang w:val="es-MX"/>
               </w:rPr>
-              <w:t xml:space="preserve">Construido; ejecutado con éxito en CC. </w:t>
-            </w:r>
-            <w:r>
-              <w:rPr>
-                <w:sz w:val="19"/>
-                <w:szCs w:val="19"/>
-              </w:rPr>
-              <w:t xml:space="preserve">CE bloqueado por datos</w:t>
+              <w:t xml:space="preserve">Construido</w:t>
+            </w:r>
+            <w:r>
+              <w:rPr>
+                <w:sz w:val="19"/>
+                <w:szCs w:val="19"/>
+              </w:rPr>
+              <w:t/>
             </w:r>
           </w:p>
         </w:tc>
@@ -725,7 +703,7 @@
                 <w:szCs w:val="19"/>
                 <w:lang w:val="es-MX"/>
               </w:rPr>
-              <w:t>Construido; requiere línea asociada al cliente</w:t>
+              <w:t xml:space="preserve">Construido. Requiere un dispositivo real con la línea asociada al cliente</w:t>
             </w:r>
           </w:p>
         </w:tc>
@@ -1483,7 +1461,7 @@
                 <w:szCs w:val="19"/>
                 <w:lang w:val="es-MX"/>
               </w:rPr>
-              <w:t xml:space="preserve">Tipo de producto; requiere un cliente que tenga ese producto. 38709 valida los saldos de esas mismas tarjetas. 39561 a 39565 son duplicados de 38705 a 38709 (confirmado por el equipo funcional el 20/10)</w:t>
+              <w:t xml:space="preserve">Tipo de producto; requiere un cliente que tenga ese producto. 38709 valida los saldos de esas mismas tarjetas. 39561 a 39565 son duplicados de 38705 a 38709</w:t>
             </w:r>
             <w:r>
               <w:rPr>
@@ -1522,7 +1500,7 @@
                 <w:szCs w:val="19"/>
                 <w:lang w:val="es-MX"/>
               </w:rPr>
-              <w:t xml:space="preserve">Construido y ejecutado con éxito: 38705, 38706, 38707, 38708, 38702, 38709, 39561, 39562, 39563 y 39564. 39565 usa el mismo escenario de 38709; su ejecución del 20/10 no se completó por indisponibilidad del ambiente (503)</w:t>
+              <w:t xml:space="preserve">Construido. El saldo esperado de 38709 y 39565 se informa en la columna Monto del control</w:t>
             </w:r>
           </w:p>
         </w:tc>
@@ -1665,7 +1643,7 @@
                 <w:szCs w:val="19"/>
                 <w:lang w:val="es-MX"/>
               </w:rPr>
-              <w:t>Construido; (2 campañas). Con una sola campaña, el deslizamiento queda como observación</w:t>
+              <w:t xml:space="preserve">Construido. Con una sola campaña, el deslizamiento queda como observación</w:t>
             </w:r>
           </w:p>
         </w:tc>
@@ -1809,7 +1787,7 @@
                 <w:szCs w:val="19"/>
                 <w:lang w:val="es-MX"/>
               </w:rPr>
-              <w:t xml:space="preserve">Construido; (lectura de la página por DevTools)</w:t>
+              <w:t xml:space="preserve">Construido. El skeleton se lee desde la página (DevTools del WebView); si el backend responde muy rápido puede no alcanzar a verse</w:t>
             </w:r>
           </w:p>
         </w:tc>
@@ -1973,7 +1951,7 @@
                 <w:szCs w:val="19"/>
                 <w:lang w:val="es-MX"/>
               </w:rPr>
-              <w:t xml:space="preserve">Construido; (cliente sin movimientos) y   cliente con movimientos</w:t>
+              <w:t xml:space="preserve">Construido. Valida la lista de movimientos o el aviso de que no hay movimientos</w:t>
             </w:r>
           </w:p>
         </w:tc>
@@ -2156,7 +2134,7 @@
                 <w:szCs w:val="19"/>
                 <w:lang w:val="es-MX"/>
               </w:rPr>
-              <w:t>Construido; El corte en 20 queda como observación: requiere un cliente con más de 20 movimientos en los últimos 30 días</w:t>
+              <w:t xml:space="preserve">Construido. Con menos de 20 movimientos en los últimos 30 días el corte queda como observación</w:t>
             </w:r>
           </w:p>
         </w:tc>
@@ -2327,9 +2305,9 @@
                 <w:lang w:val="es-MX"/>
               </w:rPr>
               <w:lastRenderedPageBreak/>
-              <w:t xml:space="preserve">Construido; Exclusión comprobada </w:t>
+              <w:t xml:space="preserve">Construido. La app solo muestra los movimientos de los últimos 30 días</w:t>
               <w:lastRenderedPageBreak/>
-              <w:t>con un cliente de 85 transacciones (30 en abril de 2026): la app solo muestra las del último mes</w:t>
+              <w:t/>
             </w:r>
           </w:p>
         </w:tc>
@@ -2494,7 +2472,7 @@
                 <w:szCs w:val="19"/>
                 <w:lang w:val="es-MX"/>
               </w:rPr>
-              <w:t>Construido; Sin cuenta de origen ni destino en la app y comprobante en ceros: observaciones</w:t>
+              <w:t xml:space="preserve">Construido. La app no muestra cuenta de origen ni de destino: queda como observación</w:t>
             </w:r>
           </w:p>
         </w:tc>
@@ -2699,7 +2677,7 @@
         <w:rPr>
           <w:lang w:val="es-MX"/>
         </w:rPr>
-        <w:t xml:space="preserve">4. Caso descartado (aprobado el 20/10/2026)</w:t>
+        <w:t xml:space="preserve">4. Caso descartado</w:t>
       </w:r>
     </w:p>
     <w:p>
@@ -2715,108 +2693,13 @@
           <w:bCs/>
           <w:lang w:val="es-MX"/>
         </w:rPr>
-        <w:t xml:space="preserve">38701 – Visualización de componentes de la pantalla. </w:t>
+        <w:t xml:space="preserve">38701 – Visualización de componentes de la pantalla: se cierra como cubierto por los casos de cada componente del Home: saludo (38699), último ingreso (38700), accesos (38703, 38704, 38711) y productos (38705 a 38708).</w:t>
       </w:r>
       <w:r>
         <w:rPr>
           <w:lang w:val="es-MX"/>
         </w:rPr>
-        <w:t>Recomendación de GreenSQA, a partir de su texto en Azure:</w:t>
-      </w:r>
-    </w:p>
-    <w:p>
-      <w:pPr>
-        <w:pStyle w:val="Prrafodelista"/>
-        <w:numPr>
-          <w:ilvl w:val="0"/>
-          <w:numId w:val="2"/>
-        </w:numPr>
-        <w:spacing w:after="60"/>
-        <w:rPr>
-          <w:lang w:val="es-MX"/>
-        </w:rPr>
-      </w:pPr>
-      <w:r>
-        <w:rPr>
-          <w:b/>
-          <w:bCs/>
-          <w:lang w:val="es-MX"/>
-        </w:rPr>
-        <w:t xml:space="preserve">Título genérico: </w:t>
-      </w:r>
-      <w:r>
-        <w:rPr>
-          <w:lang w:val="es-MX"/>
-        </w:rPr>
-        <w:t>no indica qué componentes se validan.</w:t>
-      </w:r>
-    </w:p>
-    <w:p>
-      <w:pPr>
-        <w:pStyle w:val="Prrafodelista"/>
-        <w:numPr>
-          <w:ilvl w:val="0"/>
-          <w:numId w:val="2"/>
-        </w:numPr>
-        <w:spacing w:after="60"/>
-        <w:rPr>
-          <w:lang w:val="es-MX"/>
-        </w:rPr>
-      </w:pPr>
-      <w:r>
-        <w:rPr>
-          <w:b/>
-          <w:bCs/>
-          <w:lang w:val="es-MX"/>
-        </w:rPr>
-        <w:t xml:space="preserve">Pasos genéricos: </w:t>
-      </w:r>
-      <w:r>
-        <w:rPr>
-          <w:lang w:val="es-MX"/>
-        </w:rPr>
-        <w:t>"Validar que la pantalla, opción o componente requerido se encuentre disponible y habilitado" y "Validar los textos, componentes, datos y estados visuales mostrados", sin nombrar ningún elemento.</w:t>
-      </w:r>
-    </w:p>
-    <w:p>
-      <w:pPr>
-        <w:pStyle w:val="Prrafodelista"/>
-        <w:numPr>
-          <w:ilvl w:val="0"/>
-          <w:numId w:val="2"/>
-        </w:numPr>
-        <w:spacing w:after="60"/>
-        <w:rPr>
-          <w:lang w:val="es-MX"/>
-        </w:rPr>
-      </w:pPr>
-      <w:r>
-        <w:rPr>
-          <w:b/>
-          <w:bCs/>
-          <w:lang w:val="es-MX"/>
-        </w:rPr>
-        <w:t xml:space="preserve">Precondición de otra pantalla: </w:t>
-      </w:r>
-      <w:r>
-        <w:rPr>
-          <w:lang w:val="es-MX"/>
-        </w:rPr>
-        <w:t xml:space="preserve">"usuario ingresa a la app y visualiza formulario de logueo", que corresponde al login y no al Home.</w:t>
-      </w:r>
-    </w:p>
-    <w:p>
-      <w:pPr>
-        <w:spacing w:after="120"/>
-        <w:rPr>
-          <w:lang w:val="es-MX"/>
-        </w:rPr>
-      </w:pPr>
-      <w:r>
-        <w:rPr>
-          <w:lang w:val="es-MX"/>
-        </w:rPr>
-        <w:t xml:space="preserve">Cada componente del Home ya tiene su propio caso: saludo (38699), último ingreso (38700), accesos (38703, 38704, 38711) y productos (38705 a 38708). El equipo funcional aprobó cerrarlo como cubierto por esos casos.</w:t>
+        <w:t/>
       </w:r>
     </w:p>
     <w:p>
@@ -2845,7 +2728,7 @@
         <w:rPr>
           <w:lang w:val="es-MX"/>
         </w:rPr>
-        <w:t xml:space="preserve">Los casos de logs quedan excluidos de esta etapa por decisión del proyecto (aprobado el 20/10/2026), porque requieren acceso al servicio de logs:</w:t>
+        <w:t xml:space="preserve">Los casos de logs quedan excluidos de esta etapa porque requieren acceso al servicio de logs:</w:t>
       </w:r>
     </w:p>
     <w:tbl>
@@ -3136,7 +3019,7 @@
                 <w:szCs w:val="19"/>
                 <w:lang w:val="es-MX"/>
               </w:rPr>
-              <w:t>Fuera por ahora. Por la secuencia 38502/38503/38504 parece la variante CE de 38500, aunque su texto no menciona CE; conviene corregir el título en Azure</w:t>
+              <w:t xml:space="preserve">Fuera por ahora: requiere acceso al servicio de logs</w:t>
             </w:r>
           </w:p>
         </w:tc>
@@ -3576,7 +3459,7 @@
                 <w:szCs w:val="19"/>
                 <w:lang w:val="es-MX"/>
               </w:rPr>
-              <w:t>Sin acceso a la base de datos solo se valida presencia y formato; la verificación en BD queda manual o pendiente de acceso</w:t>
+              <w:t xml:space="preserve">Se valida que el banner exista; la verificación en BD queda manual o pendiente de acceso</w:t>
             </w:r>
           </w:p>
         </w:tc>
@@ -3668,7 +3551,7 @@
                 <w:szCs w:val="19"/>
                 <w:lang w:val="es-MX"/>
               </w:rPr>
-              <w:t>Igual que 38702. La sábana de cartera es una foto del 23/09/2026 y no sirve como referencia de saldos</w:t>
+              <w:t xml:space="preserve">El saldo esperado se informa en la columna Monto del control y se compara con el de la tarjeta; la verificación de los estados contra el backend queda manual o pendiente de acceso</w:t>
             </w:r>
           </w:p>
         </w:tc>
@@ -4565,178 +4448,7 @@
         <w:rPr>
           <w:lang w:val="es-MX"/>
         </w:rPr>
-        <w:t xml:space="preserve">Cuenta corriente y cuota: resuelto. Con el cliente entregado el 20/10, 38706 y 39562 se ejecutaron con éxito; 38707 ya se había ejecutado con éxito (cuota vencida, que es lo que se valida según la respuesta #5).</w:t>
-      </w:r>
-    </w:p>
-    <w:p>
-      <w:pPr>
-        <w:pStyle w:val="Prrafodelista"/>
-        <w:numPr>
-          <w:ilvl w:val="0"/>
-          <w:numId w:val="2"/>
-        </w:numPr>
-        <w:spacing w:after="60"/>
-        <w:rPr>
-          <w:lang w:val="es-MX"/>
-        </w:rPr>
-      </w:pPr>
-      <w:r>
-        <w:rPr>
-          <w:lang w:val="es-MX"/>
-        </w:rPr>
-        <w:t>Claves de dos clientes registrados que la app rechazó (Datos incorrectos): quedaron FALLIDO en el listado hasta revisarlas o recuperarlas.</w:t>
-      </w:r>
-    </w:p>
-    <w:p>
-      <w:pPr>
-        <w:pStyle w:val="Prrafodelista"/>
-        <w:numPr>
-          <w:ilvl w:val="0"/>
-          <w:numId w:val="2"/>
-        </w:numPr>
-        <w:spacing w:after="60"/>
-        <w:rPr>
-          <w:lang w:val="es-MX"/>
-        </w:rPr>
-      </w:pPr>
-      <w:r>
-        <w:rPr>
-          <w:lang w:val="es-MX"/>
-        </w:rPr>
-        <w:t xml:space="preserve">Monto esperado (38709): resuelto. La comparación del saldo de la tarjeta con el monto informado en el control ya se ejecutó con éxito.</w:t>
-      </w:r>
-    </w:p>
-    <w:p>
-      <w:pPr>
-        <w:pStyle w:val="Prrafodelista"/>
-        <w:numPr>
-          <w:ilvl w:val="0"/>
-          <w:numId w:val="2"/>
-        </w:numPr>
-        <w:spacing w:after="60"/>
-      </w:pPr>
-      <w:r>
-        <w:rPr>
-          <w:lang w:val="es-MX"/>
-        </w:rPr>
-        <w:t xml:space="preserve">Datos de clientes con Cédula de Extranjería (CE): hay un solo cliente CE registrado, que sirve para 38520. </w:t>
-      </w:r>
-      <w:r>
-        <w:t xml:space="preserve">Faltan clientes CE disponibles (sin registrar) para 38502 y 38503.</w:t>
-      </w:r>
-    </w:p>
-    <w:p>
-      <w:pPr>
-        <w:pStyle w:val="Prrafodelista"/>
-        <w:numPr>
-          <w:ilvl w:val="0"/>
-          <w:numId w:val="2"/>
-        </w:numPr>
-        <w:spacing w:after="60"/>
-        <w:rPr>
-          <w:lang w:val="es-MX"/>
-        </w:rPr>
-      </w:pPr>
-      <w:r>
-        <w:rPr>
-          <w:lang w:val="es-MX"/>
-        </w:rPr>
-        <w:t>Casos de SMS (38499, 38503): confirmado que se envían SMS reales al número registrado del cliente. Se necesitan dispositivos reales con una línea asignada y clientes de prueba asociados a esa línea, sin registrar en la app.</w:t>
-      </w:r>
-    </w:p>
-    <w:p>
-      <w:pPr>
-        <w:pStyle w:val="Prrafodelista"/>
-        <w:numPr>
-          <w:ilvl w:val="0"/>
-          <w:numId w:val="2"/>
-        </w:numPr>
-        <w:spacing w:after="60"/>
-        <w:rPr>
-          <w:lang w:val="es-MX"/>
-        </w:rPr>
-      </w:pPr>
-      <w:r>
-        <w:rPr>
-          <w:lang w:val="es-MX"/>
-        </w:rPr>
-        <w:t>Conexión de los dispositivos reales: desde un celular ubicado fuera de Colombia todas las validaciones respondieron "Validación fallida". Falta confirmar si es un bloqueo por ubicación; si lo es, el dispositivo debe conectarse con una VPN ubicada en Colombia.</w:t>
-      </w:r>
-    </w:p>
-    <w:p>
-      <w:pPr>
-        <w:pStyle w:val="Prrafodelista"/>
-        <w:numPr>
-          <w:ilvl w:val="0"/>
-          <w:numId w:val="2"/>
-        </w:numPr>
-        <w:spacing w:after="60"/>
-        <w:rPr>
-          <w:lang w:val="es-MX"/>
-        </w:rPr>
-      </w:pPr>
-      <w:r>
-        <w:rPr>
-          <w:lang w:val="es-MX"/>
-        </w:rPr>
-        <w:t>Corrección del título de 38504 en Azure para que indique que es la variante CE.</w:t>
-      </w:r>
-    </w:p>
-    <w:p>
-      <w:pPr>
-        <w:pStyle w:val="Prrafodelista"/>
-        <w:numPr>
-          <w:ilvl w:val="0"/>
-          <w:numId w:val="2"/>
-        </w:numPr>
-        <w:spacing w:after="60"/>
-        <w:rPr>
-          <w:lang w:val="es-MX"/>
-        </w:rPr>
-      </w:pPr>
-      <w:r>
-        <w:rPr>
-          <w:lang w:val="es-MX"/>
-        </w:rPr>
-        <w:t xml:space="preserve">Duplicados: resuelto el 20/10. 39561 a 39565 son duplicados de 38705 a 38709; se pueden marcar así en Azure.</w:t>
-      </w:r>
-    </w:p>
-    <w:p>
-      <w:pPr>
-        <w:pStyle w:val="Prrafodelista"/>
-        <w:numPr>
-          <w:ilvl w:val="0"/>
-          <w:numId w:val="2"/>
-        </w:numPr>
-        <w:spacing w:after="60"/>
-        <w:rPr>
-          <w:lang w:val="es-MX"/>
-        </w:rPr>
-      </w:pPr>
-      <w:r>
-        <w:rPr>
-          <w:lang w:val="es-MX"/>
-        </w:rPr>
-        <w:t xml:space="preserve">Clientes con movimientos recibidos el 19/10: cubren 39566, 39568, 39571, 39572 y 39573. Para comprobar el corte en 20 (39567, 39569, 39570) falta un cliente con más de 20 movimientos en los últimos 30 días: la app solo muestra los movimientos de ese periodo. Los clientes reenviados el 20/10 son los mismos del 19/10 y no cumplen esa condición (8 y 3 movimientos en el periodo).</w:t>
-      </w:r>
-    </w:p>
-    <w:p>
-      <w:pPr>
-        <w:pStyle w:val="Prrafodelista"/>
-        <w:numPr>
-          <w:ilvl w:val="0"/>
-          <w:numId w:val="2"/>
-        </w:numPr>
-        <w:spacing w:after="60"/>
-        <w:rPr>
-          <w:lang w:val="es-MX"/>
-        </w:rPr>
-      </w:pPr>
-      <w:r>
-        <w:rPr>
-          <w:lang w:val="es-MX"/>
-        </w:rPr>
-        <w:t xml:space="preserve">39569: resuelto el 20/10. Se valida en el detalle de cuenta; es igual a 39570.</w:t>
+        <w:t xml:space="preserve">Corte en 20 movimientos (39567, 39569, 39570): falta un cliente con más de 20 movimientos en los últimos 30 días para comprobarlo. La app solo muestra los movimientos de ese periodo.</w:t>
       </w:r>
     </w:p>
     <w:p>
@@ -4758,3093 +4470,6 @@
         <w:t>39566: confirmar qué significa "ID 10 / ID 11 según el tipo", que no es visible en la app.</w:t>
       </w:r>
     </w:p>
-    <w:p>
-      <w:pPr>
-        <w:pStyle w:val="Ttulo1"/>
-        <w:spacing w:before="280" w:after="120"/>
-        <w:rPr>
-          <w:lang w:val="es-MX"/>
-        </w:rPr>
-      </w:pPr>
-      <w:r>
-        <w:rPr>
-          <w:lang w:val="es-MX"/>
-        </w:rPr>
-        <w:t>9. Control de cambios para el equipo funcional</w:t>
-      </w:r>
-    </w:p>
-    <w:p>
-      <w:pPr>
-        <w:spacing w:after="120"/>
-        <w:rPr>
-          <w:lang w:val="es-MX"/>
-        </w:rPr>
-      </w:pPr>
-      <w:r>
-        <w:rPr>
-          <w:lang w:val="es-MX"/>
-        </w:rPr>
-        <w:t xml:space="preserve">Diferencias entre el texto de los casos y lo que muestra la app, observadas desde el 12/10/2026 en el ambiente de certificación. La última columna registra la respuesta del equipo funcional del 20/10/2026: en todos los casos se valida lo que muestra la app.</w:t>
-      </w:r>
-    </w:p>
-    <w:tbl>
-      <w:tblPr>
-        <w:tblW w:w="9360" w:type="dxa"/>
-        <w:tblBorders>
-          <w:top w:val="single" w:sz="4" w:space="0" w:color="auto"/>
-          <w:left w:val="single" w:sz="4" w:space="0" w:color="auto"/>
-          <w:bottom w:val="single" w:sz="4" w:space="0" w:color="auto"/>
-          <w:right w:val="single" w:sz="4" w:space="0" w:color="auto"/>
-          <w:insideH w:val="single" w:sz="4" w:space="0" w:color="auto"/>
-          <w:insideV w:val="single" w:sz="4" w:space="0" w:color="auto"/>
-        </w:tblBorders>
-        <w:tblCellMar>
-          <w:left w:w="10" w:type="dxa"/>
-          <w:right w:w="10" w:type="dxa"/>
-        </w:tblCellMar>
-        <w:tblLook w:val="0000" w:firstRow="0" w:lastRow="0" w:firstColumn="0" w:lastColumn="0" w:noHBand="0" w:noVBand="0"/>
-      </w:tblPr>
-      <w:tblGrid>
-        <w:gridCol w:w="500"/>
-        <w:gridCol w:w="1000"/>
-        <w:gridCol w:w="2700"/>
-        <w:gridCol w:w="2900"/>
-        <w:gridCol w:w="2260"/>
-      </w:tblGrid>
-      <w:tr>
-        <w:trPr>
-          <w:tblHeader/>
-        </w:trPr>
-        <w:tc>
-          <w:tcPr>
-            <w:tcW w:w="500" w:type="dxa"/>
-            <w:tcBorders>
-              <w:top w:val="single" w:sz="4" w:space="0" w:color="BFBFBF"/>
-              <w:left w:val="single" w:sz="4" w:space="0" w:color="BFBFBF"/>
-              <w:bottom w:val="single" w:sz="4" w:space="0" w:color="BFBFBF"/>
-              <w:right w:val="single" w:sz="4" w:space="0" w:color="BFBFBF"/>
-            </w:tcBorders>
-            <w:shd w:val="clear" w:color="auto" w:fill="00843D"/>
-            <w:tcMar>
-              <w:top w:w="60" w:type="dxa"/>
-              <w:left w:w="100" w:type="dxa"/>
-              <w:bottom w:w="60" w:type="dxa"/>
-              <w:right w:w="100" w:type="dxa"/>
-            </w:tcMar>
-          </w:tcPr>
-          <w:p>
-            <w:r>
-              <w:rPr>
-                <w:b/>
-                <w:bCs/>
-                <w:color w:val="FFFFFF"/>
-                <w:sz w:val="19"/>
-                <w:szCs w:val="19"/>
-              </w:rPr>
-              <w:t>#</w:t>
-            </w:r>
-          </w:p>
-        </w:tc>
-        <w:tc>
-          <w:tcPr>
-            <w:tcW w:w="1000" w:type="dxa"/>
-            <w:tcBorders>
-              <w:top w:val="single" w:sz="4" w:space="0" w:color="BFBFBF"/>
-              <w:left w:val="single" w:sz="4" w:space="0" w:color="BFBFBF"/>
-              <w:bottom w:val="single" w:sz="4" w:space="0" w:color="BFBFBF"/>
-              <w:right w:val="single" w:sz="4" w:space="0" w:color="BFBFBF"/>
-            </w:tcBorders>
-            <w:shd w:val="clear" w:color="auto" w:fill="00843D"/>
-            <w:tcMar>
-              <w:top w:w="60" w:type="dxa"/>
-              <w:left w:w="100" w:type="dxa"/>
-              <w:bottom w:w="60" w:type="dxa"/>
-              <w:right w:w="100" w:type="dxa"/>
-            </w:tcMar>
-          </w:tcPr>
-          <w:p>
-            <w:r>
-              <w:rPr>
-                <w:b/>
-                <w:bCs/>
-                <w:color w:val="FFFFFF"/>
-                <w:sz w:val="19"/>
-                <w:szCs w:val="19"/>
-              </w:rPr>
-              <w:t>Caso</w:t>
-            </w:r>
-          </w:p>
-        </w:tc>
-        <w:tc>
-          <w:tcPr>
-            <w:tcW w:w="2700" w:type="dxa"/>
-            <w:tcBorders>
-              <w:top w:val="single" w:sz="4" w:space="0" w:color="BFBFBF"/>
-              <w:left w:val="single" w:sz="4" w:space="0" w:color="BFBFBF"/>
-              <w:bottom w:val="single" w:sz="4" w:space="0" w:color="BFBFBF"/>
-              <w:right w:val="single" w:sz="4" w:space="0" w:color="BFBFBF"/>
-            </w:tcBorders>
-            <w:shd w:val="clear" w:color="auto" w:fill="00843D"/>
-            <w:tcMar>
-              <w:top w:w="60" w:type="dxa"/>
-              <w:left w:w="100" w:type="dxa"/>
-              <w:bottom w:w="60" w:type="dxa"/>
-              <w:right w:w="100" w:type="dxa"/>
-            </w:tcMar>
-          </w:tcPr>
-          <w:p>
-            <w:pPr>
-              <w:rPr>
-                <w:lang w:val="es-MX"/>
-              </w:rPr>
-            </w:pPr>
-            <w:r>
-              <w:rPr>
-                <w:b/>
-                <w:bCs/>
-                <w:color w:val="FFFFFF"/>
-                <w:sz w:val="19"/>
-                <w:szCs w:val="19"/>
-                <w:lang w:val="es-MX"/>
-              </w:rPr>
-              <w:t>Texto del caso en Azure</w:t>
-            </w:r>
-          </w:p>
-        </w:tc>
-        <w:tc>
-          <w:tcPr>
-            <w:tcW w:w="2900" w:type="dxa"/>
-            <w:tcBorders>
-              <w:top w:val="single" w:sz="4" w:space="0" w:color="BFBFBF"/>
-              <w:left w:val="single" w:sz="4" w:space="0" w:color="BFBFBF"/>
-              <w:bottom w:val="single" w:sz="4" w:space="0" w:color="BFBFBF"/>
-              <w:right w:val="single" w:sz="4" w:space="0" w:color="BFBFBF"/>
-            </w:tcBorders>
-            <w:shd w:val="clear" w:color="auto" w:fill="00843D"/>
-            <w:tcMar>
-              <w:top w:w="60" w:type="dxa"/>
-              <w:left w:w="100" w:type="dxa"/>
-              <w:bottom w:w="60" w:type="dxa"/>
-              <w:right w:w="100" w:type="dxa"/>
-            </w:tcMar>
-          </w:tcPr>
-          <w:p>
-            <w:r>
-              <w:rPr>
-                <w:b/>
-                <w:bCs/>
-                <w:color w:val="FFFFFF"/>
-                <w:sz w:val="19"/>
-                <w:szCs w:val="19"/>
-              </w:rPr>
-              <w:t xml:space="preserve">Observado en la app</w:t>
-            </w:r>
-          </w:p>
-        </w:tc>
-        <w:tc>
-          <w:tcPr>
-            <w:tcW w:w="2260" w:type="dxa"/>
-            <w:tcBorders>
-              <w:top w:val="single" w:sz="4" w:space="0" w:color="BFBFBF"/>
-              <w:left w:val="single" w:sz="4" w:space="0" w:color="BFBFBF"/>
-              <w:bottom w:val="single" w:sz="4" w:space="0" w:color="BFBFBF"/>
-              <w:right w:val="single" w:sz="4" w:space="0" w:color="BFBFBF"/>
-            </w:tcBorders>
-            <w:shd w:val="clear" w:color="auto" w:fill="00843D"/>
-            <w:tcMar>
-              <w:top w:w="60" w:type="dxa"/>
-              <w:left w:w="100" w:type="dxa"/>
-              <w:bottom w:w="60" w:type="dxa"/>
-              <w:right w:w="100" w:type="dxa"/>
-            </w:tcMar>
-          </w:tcPr>
-          <w:p>
-            <w:r>
-              <w:rPr>
-                <w:b/>
-                <w:bCs/>
-                <w:color w:val="FFFFFF"/>
-                <w:sz w:val="19"/>
-                <w:szCs w:val="19"/>
-              </w:rPr>
-              <w:t xml:space="preserve">Respuesta del equipo funcional (20/10) y decisión</w:t>
-            </w:r>
-          </w:p>
-        </w:tc>
-      </w:tr>
-      <w:tr>
-        <w:tc>
-          <w:tcPr>
-            <w:tcW w:w="500" w:type="dxa"/>
-            <w:tcBorders>
-              <w:top w:val="single" w:sz="4" w:space="0" w:color="BFBFBF"/>
-              <w:left w:val="single" w:sz="4" w:space="0" w:color="BFBFBF"/>
-              <w:bottom w:val="single" w:sz="4" w:space="0" w:color="BFBFBF"/>
-              <w:right w:val="single" w:sz="4" w:space="0" w:color="BFBFBF"/>
-            </w:tcBorders>
-            <w:tcMar>
-              <w:top w:w="60" w:type="dxa"/>
-              <w:left w:w="100" w:type="dxa"/>
-              <w:bottom w:w="60" w:type="dxa"/>
-              <w:right w:w="100" w:type="dxa"/>
-            </w:tcMar>
-          </w:tcPr>
-          <w:p>
-            <w:r>
-              <w:rPr>
-                <w:sz w:val="19"/>
-                <w:szCs w:val="19"/>
-              </w:rPr>
-              <w:t>1</w:t>
-            </w:r>
-          </w:p>
-        </w:tc>
-        <w:tc>
-          <w:tcPr>
-            <w:tcW w:w="1000" w:type="dxa"/>
-            <w:tcBorders>
-              <w:top w:val="single" w:sz="4" w:space="0" w:color="BFBFBF"/>
-              <w:left w:val="single" w:sz="4" w:space="0" w:color="BFBFBF"/>
-              <w:bottom w:val="single" w:sz="4" w:space="0" w:color="BFBFBF"/>
-              <w:right w:val="single" w:sz="4" w:space="0" w:color="BFBFBF"/>
-            </w:tcBorders>
-            <w:tcMar>
-              <w:top w:w="60" w:type="dxa"/>
-              <w:left w:w="100" w:type="dxa"/>
-              <w:bottom w:w="60" w:type="dxa"/>
-              <w:right w:w="100" w:type="dxa"/>
-            </w:tcMar>
-          </w:tcPr>
-          <w:p>
-            <w:r>
-              <w:rPr>
-                <w:sz w:val="19"/>
-                <w:szCs w:val="19"/>
-              </w:rPr>
-              <w:t>38705, 39561</w:t>
-            </w:r>
-          </w:p>
-        </w:tc>
-        <w:tc>
-          <w:tcPr>
-            <w:tcW w:w="2700" w:type="dxa"/>
-            <w:tcBorders>
-              <w:top w:val="single" w:sz="4" w:space="0" w:color="BFBFBF"/>
-              <w:left w:val="single" w:sz="4" w:space="0" w:color="BFBFBF"/>
-              <w:bottom w:val="single" w:sz="4" w:space="0" w:color="BFBFBF"/>
-              <w:right w:val="single" w:sz="4" w:space="0" w:color="BFBFBF"/>
-            </w:tcBorders>
-            <w:tcMar>
-              <w:top w:w="60" w:type="dxa"/>
-              <w:left w:w="100" w:type="dxa"/>
-              <w:bottom w:w="60" w:type="dxa"/>
-              <w:right w:w="100" w:type="dxa"/>
-            </w:tcMar>
-          </w:tcPr>
-          <w:p>
-            <w:pPr>
-              <w:rPr>
-                <w:lang w:val="es-MX"/>
-              </w:rPr>
-            </w:pPr>
-            <w:r>
-              <w:rPr>
-                <w:sz w:val="19"/>
-                <w:szCs w:val="19"/>
-                <w:lang w:val="es-MX"/>
-              </w:rPr>
-              <w:t>Tipo y últimos 4 dígitos: "Cuenta ahorros **** 5038"</w:t>
-            </w:r>
-          </w:p>
-        </w:tc>
-        <w:tc>
-          <w:tcPr>
-            <w:tcW w:w="2900" w:type="dxa"/>
-            <w:tcBorders>
-              <w:top w:val="single" w:sz="4" w:space="0" w:color="BFBFBF"/>
-              <w:left w:val="single" w:sz="4" w:space="0" w:color="BFBFBF"/>
-              <w:bottom w:val="single" w:sz="4" w:space="0" w:color="BFBFBF"/>
-              <w:right w:val="single" w:sz="4" w:space="0" w:color="BFBFBF"/>
-            </w:tcBorders>
-            <w:tcMar>
-              <w:top w:w="60" w:type="dxa"/>
-              <w:left w:w="100" w:type="dxa"/>
-              <w:bottom w:w="60" w:type="dxa"/>
-              <w:right w:w="100" w:type="dxa"/>
-            </w:tcMar>
-          </w:tcPr>
-          <w:p>
-            <w:pPr>
-              <w:rPr>
-                <w:lang w:val="es-MX"/>
-              </w:rPr>
-            </w:pPr>
-            <w:r>
-              <w:rPr>
-                <w:sz w:val="19"/>
-                <w:szCs w:val="19"/>
-                <w:lang w:val="es-MX"/>
-              </w:rPr>
-              <w:t>Título "Cuentas de ahorro **** 1234" (en plural) en los 4 clientes</w:t>
-            </w:r>
-          </w:p>
-        </w:tc>
-        <w:tc>
-          <w:tcPr>
-            <w:tcW w:w="2260" w:type="dxa"/>
-            <w:tcBorders>
-              <w:top w:val="single" w:sz="4" w:space="0" w:color="BFBFBF"/>
-              <w:left w:val="single" w:sz="4" w:space="0" w:color="BFBFBF"/>
-              <w:bottom w:val="single" w:sz="4" w:space="0" w:color="BFBFBF"/>
-              <w:right w:val="single" w:sz="4" w:space="0" w:color="BFBFBF"/>
-            </w:tcBorders>
-            <w:tcMar>
-              <w:top w:w="60" w:type="dxa"/>
-              <w:left w:w="100" w:type="dxa"/>
-              <w:bottom w:w="60" w:type="dxa"/>
-              <w:right w:w="100" w:type="dxa"/>
-            </w:tcMar>
-          </w:tcPr>
-          <w:p>
-            <w:pPr>
-              <w:rPr>
-                <w:lang w:val="es-MX"/>
-              </w:rPr>
-            </w:pPr>
-            <w:r>
-              <w:rPr>
-                <w:sz w:val="19"/>
-                <w:szCs w:val="19"/>
-                <w:lang w:val="es-MX"/>
-              </w:rPr>
-              <w:t xml:space="preserve">Confirmado: el texto correcto es el de la app. Se valida "Cuentas de ahorro"</w:t>
-            </w:r>
-          </w:p>
-        </w:tc>
-      </w:tr>
-      <w:tr>
-        <w:tc>
-          <w:tcPr>
-            <w:tcW w:w="500" w:type="dxa"/>
-            <w:tcBorders>
-              <w:top w:val="single" w:sz="4" w:space="0" w:color="BFBFBF"/>
-              <w:left w:val="single" w:sz="4" w:space="0" w:color="BFBFBF"/>
-              <w:bottom w:val="single" w:sz="4" w:space="0" w:color="BFBFBF"/>
-              <w:right w:val="single" w:sz="4" w:space="0" w:color="BFBFBF"/>
-            </w:tcBorders>
-            <w:shd w:val="clear" w:color="auto" w:fill="F2F2F2"/>
-            <w:tcMar>
-              <w:top w:w="60" w:type="dxa"/>
-              <w:left w:w="100" w:type="dxa"/>
-              <w:bottom w:w="60" w:type="dxa"/>
-              <w:right w:w="100" w:type="dxa"/>
-            </w:tcMar>
-          </w:tcPr>
-          <w:p>
-            <w:r>
-              <w:rPr>
-                <w:sz w:val="19"/>
-                <w:szCs w:val="19"/>
-              </w:rPr>
-              <w:t>2</w:t>
-            </w:r>
-          </w:p>
-        </w:tc>
-        <w:tc>
-          <w:tcPr>
-            <w:tcW w:w="1000" w:type="dxa"/>
-            <w:tcBorders>
-              <w:top w:val="single" w:sz="4" w:space="0" w:color="BFBFBF"/>
-              <w:left w:val="single" w:sz="4" w:space="0" w:color="BFBFBF"/>
-              <w:bottom w:val="single" w:sz="4" w:space="0" w:color="BFBFBF"/>
-              <w:right w:val="single" w:sz="4" w:space="0" w:color="BFBFBF"/>
-            </w:tcBorders>
-            <w:shd w:val="clear" w:color="auto" w:fill="F2F2F2"/>
-            <w:tcMar>
-              <w:top w:w="60" w:type="dxa"/>
-              <w:left w:w="100" w:type="dxa"/>
-              <w:bottom w:w="60" w:type="dxa"/>
-              <w:right w:w="100" w:type="dxa"/>
-            </w:tcMar>
-          </w:tcPr>
-          <w:p>
-            <w:r>
-              <w:rPr>
-                <w:sz w:val="19"/>
-                <w:szCs w:val="19"/>
-              </w:rPr>
-              <w:t>38705, 39561</w:t>
-            </w:r>
-          </w:p>
-        </w:tc>
-        <w:tc>
-          <w:tcPr>
-            <w:tcW w:w="2700" w:type="dxa"/>
-            <w:tcBorders>
-              <w:top w:val="single" w:sz="4" w:space="0" w:color="BFBFBF"/>
-              <w:left w:val="single" w:sz="4" w:space="0" w:color="BFBFBF"/>
-              <w:bottom w:val="single" w:sz="4" w:space="0" w:color="BFBFBF"/>
-              <w:right w:val="single" w:sz="4" w:space="0" w:color="BFBFBF"/>
-            </w:tcBorders>
-            <w:shd w:val="clear" w:color="auto" w:fill="F2F2F2"/>
-            <w:tcMar>
-              <w:top w:w="60" w:type="dxa"/>
-              <w:left w:w="100" w:type="dxa"/>
-              <w:bottom w:w="60" w:type="dxa"/>
-              <w:right w:w="100" w:type="dxa"/>
-            </w:tcMar>
-          </w:tcPr>
-          <w:p>
-            <w:pPr>
-              <w:rPr>
-                <w:lang w:val="es-MX"/>
-              </w:rPr>
-            </w:pPr>
-            <w:r>
-              <w:rPr>
-                <w:sz w:val="19"/>
-                <w:szCs w:val="19"/>
-                <w:lang w:val="es-MX"/>
-              </w:rPr>
-              <w:t>Etiqueta de categoría "Ahorro con propósito" en un contenedor gris</w:t>
-            </w:r>
-          </w:p>
-        </w:tc>
-        <w:tc>
-          <w:tcPr>
-            <w:tcW w:w="2900" w:type="dxa"/>
-            <w:tcBorders>
-              <w:top w:val="single" w:sz="4" w:space="0" w:color="BFBFBF"/>
-              <w:left w:val="single" w:sz="4" w:space="0" w:color="BFBFBF"/>
-              <w:bottom w:val="single" w:sz="4" w:space="0" w:color="BFBFBF"/>
-              <w:right w:val="single" w:sz="4" w:space="0" w:color="BFBFBF"/>
-            </w:tcBorders>
-            <w:shd w:val="clear" w:color="auto" w:fill="F2F2F2"/>
-            <w:tcMar>
-              <w:top w:w="60" w:type="dxa"/>
-              <w:left w:w="100" w:type="dxa"/>
-              <w:bottom w:w="60" w:type="dxa"/>
-              <w:right w:w="100" w:type="dxa"/>
-            </w:tcMar>
-          </w:tcPr>
-          <w:p>
-            <w:pPr>
-              <w:rPr>
-                <w:lang w:val="es-MX"/>
-              </w:rPr>
-            </w:pPr>
-            <w:r>
-              <w:rPr>
-                <w:sz w:val="19"/>
-                <w:szCs w:val="19"/>
-                <w:lang w:val="es-MX"/>
-              </w:rPr>
-              <w:t xml:space="preserve">La etiqueta gris muestra el nombre de la cuenta (por ejemplo "Mi cuenta pn")</w:t>
-            </w:r>
-          </w:p>
-        </w:tc>
-        <w:tc>
-          <w:tcPr>
-            <w:tcW w:w="2260" w:type="dxa"/>
-            <w:tcBorders>
-              <w:top w:val="single" w:sz="4" w:space="0" w:color="BFBFBF"/>
-              <w:left w:val="single" w:sz="4" w:space="0" w:color="BFBFBF"/>
-              <w:bottom w:val="single" w:sz="4" w:space="0" w:color="BFBFBF"/>
-              <w:right w:val="single" w:sz="4" w:space="0" w:color="BFBFBF"/>
-            </w:tcBorders>
-            <w:shd w:val="clear" w:color="auto" w:fill="F2F2F2"/>
-            <w:tcMar>
-              <w:top w:w="60" w:type="dxa"/>
-              <w:left w:w="100" w:type="dxa"/>
-              <w:bottom w:w="60" w:type="dxa"/>
-              <w:right w:w="100" w:type="dxa"/>
-            </w:tcMar>
-          </w:tcPr>
-          <w:p>
-            <w:r>
-              <w:rPr>
-                <w:sz w:val="19"/>
-                <w:szCs w:val="19"/>
-                <w:lang w:val="es-MX"/>
-              </w:rPr>
-              <w:t xml:space="preserve">Confirmado: solo se valida que la etiqueta exista; su texto cambia según la cuenta</w:t>
-            </w:r>
-            <w:r>
-              <w:rPr>
-                <w:sz w:val="19"/>
-                <w:szCs w:val="19"/>
-              </w:rPr>
-              <w:t/>
-            </w:r>
-          </w:p>
-        </w:tc>
-      </w:tr>
-      <w:tr>
-        <w:tc>
-          <w:tcPr>
-            <w:tcW w:w="500" w:type="dxa"/>
-            <w:tcBorders>
-              <w:top w:val="single" w:sz="4" w:space="0" w:color="BFBFBF"/>
-              <w:left w:val="single" w:sz="4" w:space="0" w:color="BFBFBF"/>
-              <w:bottom w:val="single" w:sz="4" w:space="0" w:color="BFBFBF"/>
-              <w:right w:val="single" w:sz="4" w:space="0" w:color="BFBFBF"/>
-            </w:tcBorders>
-            <w:tcMar>
-              <w:top w:w="60" w:type="dxa"/>
-              <w:left w:w="100" w:type="dxa"/>
-              <w:bottom w:w="60" w:type="dxa"/>
-              <w:right w:w="100" w:type="dxa"/>
-            </w:tcMar>
-          </w:tcPr>
-          <w:p>
-            <w:r>
-              <w:rPr>
-                <w:sz w:val="19"/>
-                <w:szCs w:val="19"/>
-              </w:rPr>
-              <w:lastRenderedPageBreak/>
-              <w:t>3</w:t>
-            </w:r>
-          </w:p>
-        </w:tc>
-        <w:tc>
-          <w:tcPr>
-            <w:tcW w:w="1000" w:type="dxa"/>
-            <w:tcBorders>
-              <w:top w:val="single" w:sz="4" w:space="0" w:color="BFBFBF"/>
-              <w:left w:val="single" w:sz="4" w:space="0" w:color="BFBFBF"/>
-              <w:bottom w:val="single" w:sz="4" w:space="0" w:color="BFBFBF"/>
-              <w:right w:val="single" w:sz="4" w:space="0" w:color="BFBFBF"/>
-            </w:tcBorders>
-            <w:tcMar>
-              <w:top w:w="60" w:type="dxa"/>
-              <w:left w:w="100" w:type="dxa"/>
-              <w:bottom w:w="60" w:type="dxa"/>
-              <w:right w:w="100" w:type="dxa"/>
-            </w:tcMar>
-          </w:tcPr>
-          <w:p>
-            <w:r>
-              <w:rPr>
-                <w:sz w:val="19"/>
-                <w:szCs w:val="19"/>
-              </w:rPr>
-              <w:t>38705 a 38709, 39561 a 39565</w:t>
-            </w:r>
-          </w:p>
-        </w:tc>
-        <w:tc>
-          <w:tcPr>
-            <w:tcW w:w="2700" w:type="dxa"/>
-            <w:tcBorders>
-              <w:top w:val="single" w:sz="4" w:space="0" w:color="BFBFBF"/>
-              <w:left w:val="single" w:sz="4" w:space="0" w:color="BFBFBF"/>
-              <w:bottom w:val="single" w:sz="4" w:space="0" w:color="BFBFBF"/>
-              <w:right w:val="single" w:sz="4" w:space="0" w:color="BFBFBF"/>
-            </w:tcBorders>
-            <w:tcMar>
-              <w:top w:w="60" w:type="dxa"/>
-              <w:left w:w="100" w:type="dxa"/>
-              <w:bottom w:w="60" w:type="dxa"/>
-              <w:right w:w="100" w:type="dxa"/>
-            </w:tcMar>
-          </w:tcPr>
-          <w:p>
-            <w:r>
-              <w:rPr>
-                <w:sz w:val="19"/>
-                <w:szCs w:val="19"/>
-              </w:rPr>
-              <w:t xml:space="preserve">Saldo con formato "$ 26,000,000,00"</w:t>
-            </w:r>
-          </w:p>
-        </w:tc>
-        <w:tc>
-          <w:tcPr>
-            <w:tcW w:w="2900" w:type="dxa"/>
-            <w:tcBorders>
-              <w:top w:val="single" w:sz="4" w:space="0" w:color="BFBFBF"/>
-              <w:left w:val="single" w:sz="4" w:space="0" w:color="BFBFBF"/>
-              <w:bottom w:val="single" w:sz="4" w:space="0" w:color="BFBFBF"/>
-              <w:right w:val="single" w:sz="4" w:space="0" w:color="BFBFBF"/>
-            </w:tcBorders>
-            <w:tcMar>
-              <w:top w:w="60" w:type="dxa"/>
-              <w:left w:w="100" w:type="dxa"/>
-              <w:bottom w:w="60" w:type="dxa"/>
-              <w:right w:w="100" w:type="dxa"/>
-            </w:tcMar>
-          </w:tcPr>
-          <w:p>
-            <w:r>
-              <w:rPr>
-                <w:sz w:val="19"/>
-                <w:szCs w:val="19"/>
-                <w:lang w:val="es-MX"/>
-              </w:rPr>
-              <w:t xml:space="preserve">Formato "$22.746.864,51": punto de miles, coma decimal, sin espacio. </w:t>
-            </w:r>
-            <w:r>
-              <w:rPr>
-                <w:sz w:val="19"/>
-                <w:szCs w:val="19"/>
-              </w:rPr>
-              <w:t xml:space="preserve">El ejemplo del caso mezcla separadores</w:t>
-            </w:r>
-          </w:p>
-        </w:tc>
-        <w:tc>
-          <w:tcPr>
-            <w:tcW w:w="2260" w:type="dxa"/>
-            <w:tcBorders>
-              <w:top w:val="single" w:sz="4" w:space="0" w:color="BFBFBF"/>
-              <w:left w:val="single" w:sz="4" w:space="0" w:color="BFBFBF"/>
-              <w:bottom w:val="single" w:sz="4" w:space="0" w:color="BFBFBF"/>
-              <w:right w:val="single" w:sz="4" w:space="0" w:color="BFBFBF"/>
-            </w:tcBorders>
-            <w:tcMar>
-              <w:top w:w="60" w:type="dxa"/>
-              <w:left w:w="100" w:type="dxa"/>
-              <w:bottom w:w="60" w:type="dxa"/>
-              <w:right w:w="100" w:type="dxa"/>
-            </w:tcMar>
-          </w:tcPr>
-          <w:p>
-            <w:pPr>
-              <w:rPr>
-                <w:lang w:val="es-MX"/>
-              </w:rPr>
-            </w:pPr>
-            <w:r>
-              <w:rPr>
-                <w:sz w:val="19"/>
-                <w:szCs w:val="19"/>
-                <w:lang w:val="es-MX"/>
-              </w:rPr>
-              <w:t xml:space="preserve">Confirmado: el formato correcto es "$22.746.864,51"</w:t>
-            </w:r>
-          </w:p>
-        </w:tc>
-      </w:tr>
-      <w:tr>
-        <w:tc>
-          <w:tcPr>
-            <w:tcW w:w="500" w:type="dxa"/>
-            <w:tcBorders>
-              <w:top w:val="single" w:sz="4" w:space="0" w:color="BFBFBF"/>
-              <w:left w:val="single" w:sz="4" w:space="0" w:color="BFBFBF"/>
-              <w:bottom w:val="single" w:sz="4" w:space="0" w:color="BFBFBF"/>
-              <w:right w:val="single" w:sz="4" w:space="0" w:color="BFBFBF"/>
-            </w:tcBorders>
-            <w:shd w:val="clear" w:color="auto" w:fill="F2F2F2"/>
-            <w:tcMar>
-              <w:top w:w="60" w:type="dxa"/>
-              <w:left w:w="100" w:type="dxa"/>
-              <w:bottom w:w="60" w:type="dxa"/>
-              <w:right w:w="100" w:type="dxa"/>
-            </w:tcMar>
-          </w:tcPr>
-          <w:p>
-            <w:r>
-              <w:rPr>
-                <w:sz w:val="19"/>
-                <w:szCs w:val="19"/>
-              </w:rPr>
-              <w:t>4</w:t>
-            </w:r>
-          </w:p>
-        </w:tc>
-        <w:tc>
-          <w:tcPr>
-            <w:tcW w:w="1000" w:type="dxa"/>
-            <w:tcBorders>
-              <w:top w:val="single" w:sz="4" w:space="0" w:color="BFBFBF"/>
-              <w:left w:val="single" w:sz="4" w:space="0" w:color="BFBFBF"/>
-              <w:bottom w:val="single" w:sz="4" w:space="0" w:color="BFBFBF"/>
-              <w:right w:val="single" w:sz="4" w:space="0" w:color="BFBFBF"/>
-            </w:tcBorders>
-            <w:shd w:val="clear" w:color="auto" w:fill="F2F2F2"/>
-            <w:tcMar>
-              <w:top w:w="60" w:type="dxa"/>
-              <w:left w:w="100" w:type="dxa"/>
-              <w:bottom w:w="60" w:type="dxa"/>
-              <w:right w:w="100" w:type="dxa"/>
-            </w:tcMar>
-          </w:tcPr>
-          <w:p>
-            <w:r>
-              <w:rPr>
-                <w:sz w:val="19"/>
-                <w:szCs w:val="19"/>
-              </w:rPr>
-              <w:t>38707, 39563</w:t>
-            </w:r>
-          </w:p>
-        </w:tc>
-        <w:tc>
-          <w:tcPr>
-            <w:tcW w:w="2700" w:type="dxa"/>
-            <w:tcBorders>
-              <w:top w:val="single" w:sz="4" w:space="0" w:color="BFBFBF"/>
-              <w:left w:val="single" w:sz="4" w:space="0" w:color="BFBFBF"/>
-              <w:bottom w:val="single" w:sz="4" w:space="0" w:color="BFBFBF"/>
-              <w:right w:val="single" w:sz="4" w:space="0" w:color="BFBFBF"/>
-            </w:tcBorders>
-            <w:shd w:val="clear" w:color="auto" w:fill="F2F2F2"/>
-            <w:tcMar>
-              <w:top w:w="60" w:type="dxa"/>
-              <w:left w:w="100" w:type="dxa"/>
-              <w:bottom w:w="60" w:type="dxa"/>
-              <w:right w:w="100" w:type="dxa"/>
-            </w:tcMar>
-          </w:tcPr>
-          <w:p>
-            <w:pPr>
-              <w:rPr>
-                <w:lang w:val="es-MX"/>
-              </w:rPr>
-            </w:pPr>
-            <w:r>
-              <w:rPr>
-                <w:sz w:val="19"/>
-                <w:szCs w:val="19"/>
-                <w:lang w:val="es-MX"/>
-              </w:rPr>
-              <w:t>Título del producto "Libre inversión"</w:t>
-            </w:r>
-          </w:p>
-        </w:tc>
-        <w:tc>
-          <w:tcPr>
-            <w:tcW w:w="2900" w:type="dxa"/>
-            <w:tcBorders>
-              <w:top w:val="single" w:sz="4" w:space="0" w:color="BFBFBF"/>
-              <w:left w:val="single" w:sz="4" w:space="0" w:color="BFBFBF"/>
-              <w:bottom w:val="single" w:sz="4" w:space="0" w:color="BFBFBF"/>
-              <w:right w:val="single" w:sz="4" w:space="0" w:color="BFBFBF"/>
-            </w:tcBorders>
-            <w:shd w:val="clear" w:color="auto" w:fill="F2F2F2"/>
-            <w:tcMar>
-              <w:top w:w="60" w:type="dxa"/>
-              <w:left w:w="100" w:type="dxa"/>
-              <w:bottom w:w="60" w:type="dxa"/>
-              <w:right w:w="100" w:type="dxa"/>
-            </w:tcMar>
-          </w:tcPr>
-          <w:p>
-            <w:pPr>
-              <w:rPr>
-                <w:lang w:val="es-MX"/>
-              </w:rPr>
-            </w:pPr>
-            <w:r>
-              <w:rPr>
-                <w:sz w:val="19"/>
-                <w:szCs w:val="19"/>
-                <w:lang w:val="es-MX"/>
-              </w:rPr>
-              <w:t>Ningún crédito se titula "Libre inversión": todos aparecen como "Préstamos" (4 de 4 clientes)</w:t>
-            </w:r>
-          </w:p>
-        </w:tc>
-        <w:tc>
-          <w:tcPr>
-            <w:tcW w:w="2260" w:type="dxa"/>
-            <w:tcBorders>
-              <w:top w:val="single" w:sz="4" w:space="0" w:color="BFBFBF"/>
-              <w:left w:val="single" w:sz="4" w:space="0" w:color="BFBFBF"/>
-              <w:bottom w:val="single" w:sz="4" w:space="0" w:color="BFBFBF"/>
-              <w:right w:val="single" w:sz="4" w:space="0" w:color="BFBFBF"/>
-            </w:tcBorders>
-            <w:shd w:val="clear" w:color="auto" w:fill="F2F2F2"/>
-            <w:tcMar>
-              <w:top w:w="60" w:type="dxa"/>
-              <w:left w:w="100" w:type="dxa"/>
-              <w:bottom w:w="60" w:type="dxa"/>
-              <w:right w:w="100" w:type="dxa"/>
-            </w:tcMar>
-          </w:tcPr>
-          <w:p>
-            <w:pPr>
-              <w:rPr>
-                <w:lang w:val="es-MX"/>
-              </w:rPr>
-            </w:pPr>
-            <w:r>
-              <w:rPr>
-                <w:sz w:val="19"/>
-                <w:szCs w:val="19"/>
-                <w:lang w:val="es-MX"/>
-              </w:rPr>
-              <w:t xml:space="preserve">Confirmado: todas las tarjetas de la sección créditos son "Préstamos"</w:t>
-            </w:r>
-          </w:p>
-        </w:tc>
-      </w:tr>
-      <w:tr>
-        <w:tc>
-          <w:tcPr>
-            <w:tcW w:w="500" w:type="dxa"/>
-            <w:tcBorders>
-              <w:top w:val="single" w:sz="4" w:space="0" w:color="BFBFBF"/>
-              <w:left w:val="single" w:sz="4" w:space="0" w:color="BFBFBF"/>
-              <w:bottom w:val="single" w:sz="4" w:space="0" w:color="BFBFBF"/>
-              <w:right w:val="single" w:sz="4" w:space="0" w:color="BFBFBF"/>
-            </w:tcBorders>
-            <w:tcMar>
-              <w:top w:w="60" w:type="dxa"/>
-              <w:left w:w="100" w:type="dxa"/>
-              <w:bottom w:w="60" w:type="dxa"/>
-              <w:right w:w="100" w:type="dxa"/>
-            </w:tcMar>
-          </w:tcPr>
-          <w:p>
-            <w:r>
-              <w:rPr>
-                <w:sz w:val="19"/>
-                <w:szCs w:val="19"/>
-              </w:rPr>
-              <w:t>5</w:t>
-            </w:r>
-          </w:p>
-        </w:tc>
-        <w:tc>
-          <w:tcPr>
-            <w:tcW w:w="1000" w:type="dxa"/>
-            <w:tcBorders>
-              <w:top w:val="single" w:sz="4" w:space="0" w:color="BFBFBF"/>
-              <w:left w:val="single" w:sz="4" w:space="0" w:color="BFBFBF"/>
-              <w:bottom w:val="single" w:sz="4" w:space="0" w:color="BFBFBF"/>
-              <w:right w:val="single" w:sz="4" w:space="0" w:color="BFBFBF"/>
-            </w:tcBorders>
-            <w:tcMar>
-              <w:top w:w="60" w:type="dxa"/>
-              <w:left w:w="100" w:type="dxa"/>
-              <w:bottom w:w="60" w:type="dxa"/>
-              <w:right w:w="100" w:type="dxa"/>
-            </w:tcMar>
-          </w:tcPr>
-          <w:p>
-            <w:r>
-              <w:rPr>
-                <w:sz w:val="19"/>
-                <w:szCs w:val="19"/>
-              </w:rPr>
-              <w:t>38707, 39563</w:t>
-            </w:r>
-          </w:p>
-        </w:tc>
-        <w:tc>
-          <w:tcPr>
-            <w:tcW w:w="2700" w:type="dxa"/>
-            <w:tcBorders>
-              <w:top w:val="single" w:sz="4" w:space="0" w:color="BFBFBF"/>
-              <w:left w:val="single" w:sz="4" w:space="0" w:color="BFBFBF"/>
-              <w:bottom w:val="single" w:sz="4" w:space="0" w:color="BFBFBF"/>
-              <w:right w:val="single" w:sz="4" w:space="0" w:color="BFBFBF"/>
-            </w:tcBorders>
-            <w:tcMar>
-              <w:top w:w="60" w:type="dxa"/>
-              <w:left w:w="100" w:type="dxa"/>
-              <w:bottom w:w="60" w:type="dxa"/>
-              <w:right w:w="100" w:type="dxa"/>
-            </w:tcMar>
-          </w:tcPr>
-          <w:p>
-            <w:pPr>
-              <w:rPr>
-                <w:lang w:val="es-MX"/>
-              </w:rPr>
-            </w:pPr>
-            <w:r>
-              <w:rPr>
-                <w:sz w:val="19"/>
-                <w:szCs w:val="19"/>
-                <w:lang w:val="es-MX"/>
-              </w:rPr>
-              <w:t>Estados "Cuota venció Hoy" (punto rojo) y "Cuota vence 24 Oct" (punto verde)</w:t>
-            </w:r>
-          </w:p>
-        </w:tc>
-        <w:tc>
-          <w:tcPr>
-            <w:tcW w:w="2900" w:type="dxa"/>
-            <w:tcBorders>
-              <w:top w:val="single" w:sz="4" w:space="0" w:color="BFBFBF"/>
-              <w:left w:val="single" w:sz="4" w:space="0" w:color="BFBFBF"/>
-              <w:bottom w:val="single" w:sz="4" w:space="0" w:color="BFBFBF"/>
-              <w:right w:val="single" w:sz="4" w:space="0" w:color="BFBFBF"/>
-            </w:tcBorders>
-            <w:tcMar>
-              <w:top w:w="60" w:type="dxa"/>
-              <w:left w:w="100" w:type="dxa"/>
-              <w:bottom w:w="60" w:type="dxa"/>
-              <w:right w:w="100" w:type="dxa"/>
-            </w:tcMar>
-          </w:tcPr>
-          <w:p>
-            <w:pPr>
-              <w:rPr>
-                <w:lang w:val="es-MX"/>
-              </w:rPr>
-            </w:pPr>
-            <w:r>
-              <w:rPr>
-                <w:sz w:val="19"/>
-                <w:szCs w:val="19"/>
-                <w:lang w:val="es-MX"/>
-              </w:rPr>
-              <w:t xml:space="preserve">"Cuota vencio 1 Jun" (sin tilde) con punto rojo. No se observó ninguna cuota vigente: los créditos de prueba están en mora</w:t>
-            </w:r>
-          </w:p>
-        </w:tc>
-        <w:tc>
-          <w:tcPr>
-            <w:tcW w:w="2260" w:type="dxa"/>
-            <w:tcBorders>
-              <w:top w:val="single" w:sz="4" w:space="0" w:color="BFBFBF"/>
-              <w:left w:val="single" w:sz="4" w:space="0" w:color="BFBFBF"/>
-              <w:bottom w:val="single" w:sz="4" w:space="0" w:color="BFBFBF"/>
-              <w:right w:val="single" w:sz="4" w:space="0" w:color="BFBFBF"/>
-            </w:tcBorders>
-            <w:tcMar>
-              <w:top w:w="60" w:type="dxa"/>
-              <w:left w:w="100" w:type="dxa"/>
-              <w:bottom w:w="60" w:type="dxa"/>
-              <w:right w:w="100" w:type="dxa"/>
-            </w:tcMar>
-          </w:tcPr>
-          <w:p>
-            <w:pPr>
-              <w:rPr>
-                <w:lang w:val="es-MX"/>
-              </w:rPr>
-            </w:pPr>
-            <w:r>
-              <w:rPr>
-                <w:sz w:val="19"/>
-                <w:szCs w:val="19"/>
-                <w:lang w:val="es-MX"/>
-              </w:rPr>
-              <w:t xml:space="preserve">Confirmado: se valida el estado vencido observado</w:t>
-            </w:r>
-          </w:p>
-        </w:tc>
-      </w:tr>
-      <w:tr>
-        <w:tc>
-          <w:tcPr>
-            <w:tcW w:w="500" w:type="dxa"/>
-            <w:tcBorders>
-              <w:top w:val="single" w:sz="4" w:space="0" w:color="BFBFBF"/>
-              <w:left w:val="single" w:sz="4" w:space="0" w:color="BFBFBF"/>
-              <w:bottom w:val="single" w:sz="4" w:space="0" w:color="BFBFBF"/>
-              <w:right w:val="single" w:sz="4" w:space="0" w:color="BFBFBF"/>
-            </w:tcBorders>
-            <w:shd w:val="clear" w:color="auto" w:fill="F2F2F2"/>
-            <w:tcMar>
-              <w:top w:w="60" w:type="dxa"/>
-              <w:left w:w="100" w:type="dxa"/>
-              <w:bottom w:w="60" w:type="dxa"/>
-              <w:right w:w="100" w:type="dxa"/>
-            </w:tcMar>
-          </w:tcPr>
-          <w:p>
-            <w:r>
-              <w:rPr>
-                <w:sz w:val="19"/>
-                <w:szCs w:val="19"/>
-              </w:rPr>
-              <w:t>6</w:t>
-            </w:r>
-          </w:p>
-        </w:tc>
-        <w:tc>
-          <w:tcPr>
-            <w:tcW w:w="1000" w:type="dxa"/>
-            <w:tcBorders>
-              <w:top w:val="single" w:sz="4" w:space="0" w:color="BFBFBF"/>
-              <w:left w:val="single" w:sz="4" w:space="0" w:color="BFBFBF"/>
-              <w:bottom w:val="single" w:sz="4" w:space="0" w:color="BFBFBF"/>
-              <w:right w:val="single" w:sz="4" w:space="0" w:color="BFBFBF"/>
-            </w:tcBorders>
-            <w:shd w:val="clear" w:color="auto" w:fill="F2F2F2"/>
-            <w:tcMar>
-              <w:top w:w="60" w:type="dxa"/>
-              <w:left w:w="100" w:type="dxa"/>
-              <w:bottom w:w="60" w:type="dxa"/>
-              <w:right w:w="100" w:type="dxa"/>
-            </w:tcMar>
-          </w:tcPr>
-          <w:p>
-            <w:r>
-              <w:rPr>
-                <w:sz w:val="19"/>
-                <w:szCs w:val="19"/>
-              </w:rPr>
-              <w:t>38708, 39564</w:t>
-            </w:r>
-          </w:p>
-        </w:tc>
-        <w:tc>
-          <w:tcPr>
-            <w:tcW w:w="2700" w:type="dxa"/>
-            <w:tcBorders>
-              <w:top w:val="single" w:sz="4" w:space="0" w:color="BFBFBF"/>
-              <w:left w:val="single" w:sz="4" w:space="0" w:color="BFBFBF"/>
-              <w:bottom w:val="single" w:sz="4" w:space="0" w:color="BFBFBF"/>
-              <w:right w:val="single" w:sz="4" w:space="0" w:color="BFBFBF"/>
-            </w:tcBorders>
-            <w:shd w:val="clear" w:color="auto" w:fill="F2F2F2"/>
-            <w:tcMar>
-              <w:top w:w="60" w:type="dxa"/>
-              <w:left w:w="100" w:type="dxa"/>
-              <w:bottom w:w="60" w:type="dxa"/>
-              <w:right w:w="100" w:type="dxa"/>
-            </w:tcMar>
-          </w:tcPr>
-          <w:p>
-            <w:pPr>
-              <w:rPr>
-                <w:lang w:val="es-MX"/>
-              </w:rPr>
-            </w:pPr>
-            <w:r>
-              <w:rPr>
-                <w:sz w:val="19"/>
-                <w:szCs w:val="19"/>
-                <w:lang w:val="es-MX"/>
-              </w:rPr>
-              <w:t>Texto "Crédito rotativo" con etiqueta verde "Cupo aprobado"</w:t>
-            </w:r>
-          </w:p>
-        </w:tc>
-        <w:tc>
-          <w:tcPr>
-            <w:tcW w:w="2900" w:type="dxa"/>
-            <w:tcBorders>
-              <w:top w:val="single" w:sz="4" w:space="0" w:color="BFBFBF"/>
-              <w:left w:val="single" w:sz="4" w:space="0" w:color="BFBFBF"/>
-              <w:bottom w:val="single" w:sz="4" w:space="0" w:color="BFBFBF"/>
-              <w:right w:val="single" w:sz="4" w:space="0" w:color="BFBFBF"/>
-            </w:tcBorders>
-            <w:shd w:val="clear" w:color="auto" w:fill="F2F2F2"/>
-            <w:tcMar>
-              <w:top w:w="60" w:type="dxa"/>
-              <w:left w:w="100" w:type="dxa"/>
-              <w:bottom w:w="60" w:type="dxa"/>
-              <w:right w:w="100" w:type="dxa"/>
-            </w:tcMar>
-          </w:tcPr>
-          <w:p>
-            <w:pPr>
-              <w:rPr>
-                <w:lang w:val="es-MX"/>
-              </w:rPr>
-            </w:pPr>
-            <w:r>
-              <w:rPr>
-                <w:sz w:val="19"/>
-                <w:szCs w:val="19"/>
-                <w:lang w:val="es-MX"/>
-              </w:rPr>
-              <w:t xml:space="preserve">"Credito Rotativo" (sin tilde, R mayúscula) con "Cupo aprobado". El monto es el mismo en los 4 clientes, incluido un cliente CE sin créditos en la sábana</w:t>
-            </w:r>
-          </w:p>
-        </w:tc>
-        <w:tc>
-          <w:tcPr>
-            <w:tcW w:w="2260" w:type="dxa"/>
-            <w:tcBorders>
-              <w:top w:val="single" w:sz="4" w:space="0" w:color="BFBFBF"/>
-              <w:left w:val="single" w:sz="4" w:space="0" w:color="BFBFBF"/>
-              <w:bottom w:val="single" w:sz="4" w:space="0" w:color="BFBFBF"/>
-              <w:right w:val="single" w:sz="4" w:space="0" w:color="BFBFBF"/>
-            </w:tcBorders>
-            <w:shd w:val="clear" w:color="auto" w:fill="F2F2F2"/>
-            <w:tcMar>
-              <w:top w:w="60" w:type="dxa"/>
-              <w:left w:w="100" w:type="dxa"/>
-              <w:bottom w:w="60" w:type="dxa"/>
-              <w:right w:w="100" w:type="dxa"/>
-            </w:tcMar>
-          </w:tcPr>
-          <w:p>
-            <w:pPr>
-              <w:rPr>
-                <w:lang w:val="es-MX"/>
-              </w:rPr>
-            </w:pPr>
-            <w:r>
-              <w:rPr>
-                <w:sz w:val="19"/>
-                <w:szCs w:val="19"/>
-                <w:lang w:val="es-MX"/>
-              </w:rPr>
-              <w:t xml:space="preserve">Es un mock: no se valida el monto. Se valida el texto y la etiqueta observados</w:t>
-            </w:r>
-          </w:p>
-        </w:tc>
-      </w:tr>
-      <w:tr>
-        <w:tc>
-          <w:tcPr>
-            <w:tcW w:w="500" w:type="dxa"/>
-            <w:tcBorders>
-              <w:top w:val="single" w:sz="4" w:space="0" w:color="BFBFBF"/>
-              <w:left w:val="single" w:sz="4" w:space="0" w:color="BFBFBF"/>
-              <w:bottom w:val="single" w:sz="4" w:space="0" w:color="BFBFBF"/>
-              <w:right w:val="single" w:sz="4" w:space="0" w:color="BFBFBF"/>
-            </w:tcBorders>
-            <w:tcMar>
-              <w:top w:w="60" w:type="dxa"/>
-              <w:left w:w="100" w:type="dxa"/>
-              <w:bottom w:w="60" w:type="dxa"/>
-              <w:right w:w="100" w:type="dxa"/>
-            </w:tcMar>
-          </w:tcPr>
-          <w:p>
-            <w:r>
-              <w:rPr>
-                <w:sz w:val="19"/>
-                <w:szCs w:val="19"/>
-              </w:rPr>
-              <w:t>7</w:t>
-            </w:r>
-          </w:p>
-        </w:tc>
-        <w:tc>
-          <w:tcPr>
-            <w:tcW w:w="1000" w:type="dxa"/>
-            <w:tcBorders>
-              <w:top w:val="single" w:sz="4" w:space="0" w:color="BFBFBF"/>
-              <w:left w:val="single" w:sz="4" w:space="0" w:color="BFBFBF"/>
-              <w:bottom w:val="single" w:sz="4" w:space="0" w:color="BFBFBF"/>
-              <w:right w:val="single" w:sz="4" w:space="0" w:color="BFBFBF"/>
-            </w:tcBorders>
-            <w:tcMar>
-              <w:top w:w="60" w:type="dxa"/>
-              <w:left w:w="100" w:type="dxa"/>
-              <w:bottom w:w="60" w:type="dxa"/>
-              <w:right w:w="100" w:type="dxa"/>
-            </w:tcMar>
-          </w:tcPr>
-          <w:p>
-            <w:r>
-              <w:rPr>
-                <w:sz w:val="19"/>
-                <w:szCs w:val="19"/>
-              </w:rPr>
-              <w:t>38708, 39564</w:t>
-            </w:r>
-          </w:p>
-        </w:tc>
-        <w:tc>
-          <w:tcPr>
-            <w:tcW w:w="2700" w:type="dxa"/>
-            <w:tcBorders>
-              <w:top w:val="single" w:sz="4" w:space="0" w:color="BFBFBF"/>
-              <w:left w:val="single" w:sz="4" w:space="0" w:color="BFBFBF"/>
-              <w:bottom w:val="single" w:sz="4" w:space="0" w:color="BFBFBF"/>
-              <w:right w:val="single" w:sz="4" w:space="0" w:color="BFBFBF"/>
-            </w:tcBorders>
-            <w:tcMar>
-              <w:top w:w="60" w:type="dxa"/>
-              <w:left w:w="100" w:type="dxa"/>
-              <w:bottom w:w="60" w:type="dxa"/>
-              <w:right w:w="100" w:type="dxa"/>
-            </w:tcMar>
-          </w:tcPr>
-          <w:p>
-            <w:r>
-              <w:rPr>
-                <w:sz w:val="19"/>
-                <w:szCs w:val="19"/>
-              </w:rPr>
-              <w:t>—</w:t>
-            </w:r>
-          </w:p>
-        </w:tc>
-        <w:tc>
-          <w:tcPr>
-            <w:tcW w:w="2900" w:type="dxa"/>
-            <w:tcBorders>
-              <w:top w:val="single" w:sz="4" w:space="0" w:color="BFBFBF"/>
-              <w:left w:val="single" w:sz="4" w:space="0" w:color="BFBFBF"/>
-              <w:bottom w:val="single" w:sz="4" w:space="0" w:color="BFBFBF"/>
-              <w:right w:val="single" w:sz="4" w:space="0" w:color="BFBFBF"/>
-            </w:tcBorders>
-            <w:tcMar>
-              <w:top w:w="60" w:type="dxa"/>
-              <w:left w:w="100" w:type="dxa"/>
-              <w:bottom w:w="60" w:type="dxa"/>
-              <w:right w:w="100" w:type="dxa"/>
-            </w:tcMar>
-          </w:tcPr>
-          <w:p>
-            <w:pPr>
-              <w:rPr>
-                <w:lang w:val="es-MX"/>
-              </w:rPr>
-            </w:pPr>
-            <w:r>
-              <w:rPr>
-                <w:sz w:val="19"/>
-                <w:szCs w:val="19"/>
-                <w:lang w:val="es-MX"/>
-              </w:rPr>
-              <w:t xml:space="preserve">Tarjeta adicional "Cupo rotativo $0,00 · Cuota vencio 1 Jun" (1 de 4 clientes), no descrita en ningún caso</w:t>
-            </w:r>
-          </w:p>
-        </w:tc>
-        <w:tc>
-          <w:tcPr>
-            <w:tcW w:w="2260" w:type="dxa"/>
-            <w:tcBorders>
-              <w:top w:val="single" w:sz="4" w:space="0" w:color="BFBFBF"/>
-              <w:left w:val="single" w:sz="4" w:space="0" w:color="BFBFBF"/>
-              <w:bottom w:val="single" w:sz="4" w:space="0" w:color="BFBFBF"/>
-              <w:right w:val="single" w:sz="4" w:space="0" w:color="BFBFBF"/>
-            </w:tcBorders>
-            <w:tcMar>
-              <w:top w:w="60" w:type="dxa"/>
-              <w:left w:w="100" w:type="dxa"/>
-              <w:bottom w:w="60" w:type="dxa"/>
-              <w:right w:w="100" w:type="dxa"/>
-            </w:tcMar>
-          </w:tcPr>
-          <w:p>
-            <w:pPr>
-              <w:rPr>
-                <w:lang w:val="es-MX"/>
-              </w:rPr>
-            </w:pPr>
-            <w:r>
-              <w:rPr>
-                <w:sz w:val="19"/>
-                <w:szCs w:val="19"/>
-                <w:lang w:val="es-MX"/>
-              </w:rPr>
-              <w:t xml:space="preserve">Es un mock: no se valida por ahora</w:t>
-            </w:r>
-          </w:p>
-        </w:tc>
-      </w:tr>
-      <w:tr>
-        <w:tc>
-          <w:tcPr>
-            <w:tcW w:w="500" w:type="dxa"/>
-            <w:tcBorders>
-              <w:top w:val="single" w:sz="4" w:space="0" w:color="BFBFBF"/>
-              <w:left w:val="single" w:sz="4" w:space="0" w:color="BFBFBF"/>
-              <w:bottom w:val="single" w:sz="4" w:space="0" w:color="BFBFBF"/>
-              <w:right w:val="single" w:sz="4" w:space="0" w:color="BFBFBF"/>
-            </w:tcBorders>
-            <w:shd w:val="clear" w:color="auto" w:fill="F2F2F2"/>
-            <w:tcMar>
-              <w:top w:w="60" w:type="dxa"/>
-              <w:left w:w="100" w:type="dxa"/>
-              <w:bottom w:w="60" w:type="dxa"/>
-              <w:right w:w="100" w:type="dxa"/>
-            </w:tcMar>
-          </w:tcPr>
-          <w:p>
-            <w:r>
-              <w:rPr>
-                <w:sz w:val="19"/>
-                <w:szCs w:val="19"/>
-              </w:rPr>
-              <w:t>8</w:t>
-            </w:r>
-          </w:p>
-        </w:tc>
-        <w:tc>
-          <w:tcPr>
-            <w:tcW w:w="1000" w:type="dxa"/>
-            <w:tcBorders>
-              <w:top w:val="single" w:sz="4" w:space="0" w:color="BFBFBF"/>
-              <w:left w:val="single" w:sz="4" w:space="0" w:color="BFBFBF"/>
-              <w:bottom w:val="single" w:sz="4" w:space="0" w:color="BFBFBF"/>
-              <w:right w:val="single" w:sz="4" w:space="0" w:color="BFBFBF"/>
-            </w:tcBorders>
-            <w:shd w:val="clear" w:color="auto" w:fill="F2F2F2"/>
-            <w:tcMar>
-              <w:top w:w="60" w:type="dxa"/>
-              <w:left w:w="100" w:type="dxa"/>
-              <w:bottom w:w="60" w:type="dxa"/>
-              <w:right w:w="100" w:type="dxa"/>
-            </w:tcMar>
-          </w:tcPr>
-          <w:p>
-            <w:r>
-              <w:rPr>
-                <w:sz w:val="19"/>
-                <w:szCs w:val="19"/>
-              </w:rPr>
-              <w:t>38702</w:t>
-            </w:r>
-          </w:p>
-        </w:tc>
-        <w:tc>
-          <w:tcPr>
-            <w:tcW w:w="2700" w:type="dxa"/>
-            <w:tcBorders>
-              <w:top w:val="single" w:sz="4" w:space="0" w:color="BFBFBF"/>
-              <w:left w:val="single" w:sz="4" w:space="0" w:color="BFBFBF"/>
-              <w:bottom w:val="single" w:sz="4" w:space="0" w:color="BFBFBF"/>
-              <w:right w:val="single" w:sz="4" w:space="0" w:color="BFBFBF"/>
-            </w:tcBorders>
-            <w:shd w:val="clear" w:color="auto" w:fill="F2F2F2"/>
-            <w:tcMar>
-              <w:top w:w="60" w:type="dxa"/>
-              <w:left w:w="100" w:type="dxa"/>
-              <w:bottom w:w="60" w:type="dxa"/>
-              <w:right w:w="100" w:type="dxa"/>
-            </w:tcMar>
-          </w:tcPr>
-          <w:p>
-            <w:pPr>
-              <w:rPr>
-                <w:lang w:val="es-MX"/>
-              </w:rPr>
-            </w:pPr>
-            <w:r>
-              <w:rPr>
-                <w:sz w:val="19"/>
-                <w:szCs w:val="19"/>
-                <w:lang w:val="es-MX"/>
-              </w:rPr>
-              <w:t>En "Tus créditos", opción "crédito aprobado" con el saldo aprobado</w:t>
-            </w:r>
-          </w:p>
-        </w:tc>
-        <w:tc>
-          <w:tcPr>
-            <w:tcW w:w="2900" w:type="dxa"/>
-            <w:tcBorders>
-              <w:top w:val="single" w:sz="4" w:space="0" w:color="BFBFBF"/>
-              <w:left w:val="single" w:sz="4" w:space="0" w:color="BFBFBF"/>
-              <w:bottom w:val="single" w:sz="4" w:space="0" w:color="BFBFBF"/>
-              <w:right w:val="single" w:sz="4" w:space="0" w:color="BFBFBF"/>
-            </w:tcBorders>
-            <w:shd w:val="clear" w:color="auto" w:fill="F2F2F2"/>
-            <w:tcMar>
-              <w:top w:w="60" w:type="dxa"/>
-              <w:left w:w="100" w:type="dxa"/>
-              <w:bottom w:w="60" w:type="dxa"/>
-              <w:right w:w="100" w:type="dxa"/>
-            </w:tcMar>
-          </w:tcPr>
-          <w:p>
-            <w:pPr>
-              <w:rPr>
-                <w:lang w:val="es-MX"/>
-              </w:rPr>
-            </w:pPr>
-            <w:r>
-              <w:rPr>
-                <w:sz w:val="19"/>
-                <w:szCs w:val="19"/>
-                <w:lang w:val="es-MX"/>
-              </w:rPr>
-              <w:t xml:space="preserve">Banner en la parte superior: "Tienes un crédito pre-aprobado ¡Adquiérelo ya!", fuera de "Tus créditos" y sin monto (4 de 4 clientes)</w:t>
-            </w:r>
-          </w:p>
-        </w:tc>
-        <w:tc>
-          <w:tcPr>
-            <w:tcW w:w="2260" w:type="dxa"/>
-            <w:tcBorders>
-              <w:top w:val="single" w:sz="4" w:space="0" w:color="BFBFBF"/>
-              <w:left w:val="single" w:sz="4" w:space="0" w:color="BFBFBF"/>
-              <w:bottom w:val="single" w:sz="4" w:space="0" w:color="BFBFBF"/>
-              <w:right w:val="single" w:sz="4" w:space="0" w:color="BFBFBF"/>
-            </w:tcBorders>
-            <w:shd w:val="clear" w:color="auto" w:fill="F2F2F2"/>
-            <w:tcMar>
-              <w:top w:w="60" w:type="dxa"/>
-              <w:left w:w="100" w:type="dxa"/>
-              <w:bottom w:w="60" w:type="dxa"/>
-              <w:right w:w="100" w:type="dxa"/>
-            </w:tcMar>
-          </w:tcPr>
-          <w:p>
-            <w:r>
-              <w:rPr>
-                <w:sz w:val="19"/>
-                <w:szCs w:val="19"/>
-                <w:lang w:val="es-MX"/>
-              </w:rPr>
-              <w:t xml:space="preserve">Confirmado: solo se valida que el banner exista</w:t>
-            </w:r>
-            <w:r>
-              <w:rPr>
-                <w:sz w:val="19"/>
-                <w:szCs w:val="19"/>
-              </w:rPr>
-              <w:t/>
-            </w:r>
-          </w:p>
-        </w:tc>
-      </w:tr>
-      <w:tr>
-        <w:tc>
-          <w:tcPr>
-            <w:tcW w:w="500" w:type="dxa"/>
-            <w:tcBorders>
-              <w:top w:val="single" w:sz="4" w:space="0" w:color="BFBFBF"/>
-              <w:left w:val="single" w:sz="4" w:space="0" w:color="BFBFBF"/>
-              <w:bottom w:val="single" w:sz="4" w:space="0" w:color="BFBFBF"/>
-              <w:right w:val="single" w:sz="4" w:space="0" w:color="BFBFBF"/>
-            </w:tcBorders>
-            <w:tcMar>
-              <w:top w:w="60" w:type="dxa"/>
-              <w:left w:w="100" w:type="dxa"/>
-              <w:bottom w:w="60" w:type="dxa"/>
-              <w:right w:w="100" w:type="dxa"/>
-            </w:tcMar>
-          </w:tcPr>
-          <w:p>
-            <w:r>
-              <w:rPr>
-                <w:sz w:val="19"/>
-                <w:szCs w:val="19"/>
-              </w:rPr>
-              <w:t>9</w:t>
-            </w:r>
-          </w:p>
-        </w:tc>
-        <w:tc>
-          <w:tcPr>
-            <w:tcW w:w="1000" w:type="dxa"/>
-            <w:tcBorders>
-              <w:top w:val="single" w:sz="4" w:space="0" w:color="BFBFBF"/>
-              <w:left w:val="single" w:sz="4" w:space="0" w:color="BFBFBF"/>
-              <w:bottom w:val="single" w:sz="4" w:space="0" w:color="BFBFBF"/>
-              <w:right w:val="single" w:sz="4" w:space="0" w:color="BFBFBF"/>
-            </w:tcBorders>
-            <w:tcMar>
-              <w:top w:w="60" w:type="dxa"/>
-              <w:left w:w="100" w:type="dxa"/>
-              <w:bottom w:w="60" w:type="dxa"/>
-              <w:right w:w="100" w:type="dxa"/>
-            </w:tcMar>
-          </w:tcPr>
-          <w:p>
-            <w:r>
-              <w:rPr>
-                <w:sz w:val="19"/>
-                <w:szCs w:val="19"/>
-              </w:rPr>
-              <w:t>38706, 39562</w:t>
-            </w:r>
-          </w:p>
-        </w:tc>
-        <w:tc>
-          <w:tcPr>
-            <w:tcW w:w="2700" w:type="dxa"/>
-            <w:tcBorders>
-              <w:top w:val="single" w:sz="4" w:space="0" w:color="BFBFBF"/>
-              <w:left w:val="single" w:sz="4" w:space="0" w:color="BFBFBF"/>
-              <w:bottom w:val="single" w:sz="4" w:space="0" w:color="BFBFBF"/>
-              <w:right w:val="single" w:sz="4" w:space="0" w:color="BFBFBF"/>
-            </w:tcBorders>
-            <w:tcMar>
-              <w:top w:w="60" w:type="dxa"/>
-              <w:left w:w="100" w:type="dxa"/>
-              <w:bottom w:w="60" w:type="dxa"/>
-              <w:right w:w="100" w:type="dxa"/>
-            </w:tcMar>
-          </w:tcPr>
-          <w:p>
-            <w:pPr>
-              <w:rPr>
-                <w:lang w:val="es-MX"/>
-              </w:rPr>
-            </w:pPr>
-            <w:r>
-              <w:rPr>
-                <w:sz w:val="19"/>
-                <w:szCs w:val="19"/>
-                <w:lang w:val="es-MX"/>
-              </w:rPr>
-              <w:t>Tarjeta de cuenta corriente en "Tus cuentas"</w:t>
-            </w:r>
-          </w:p>
-        </w:tc>
-        <w:tc>
-          <w:tcPr>
-            <w:tcW w:w="2900" w:type="dxa"/>
-            <w:tcBorders>
-              <w:top w:val="single" w:sz="4" w:space="0" w:color="BFBFBF"/>
-              <w:left w:val="single" w:sz="4" w:space="0" w:color="BFBFBF"/>
-              <w:bottom w:val="single" w:sz="4" w:space="0" w:color="BFBFBF"/>
-              <w:right w:val="single" w:sz="4" w:space="0" w:color="BFBFBF"/>
-            </w:tcBorders>
-            <w:tcMar>
-              <w:top w:w="60" w:type="dxa"/>
-              <w:left w:w="100" w:type="dxa"/>
-              <w:bottom w:w="60" w:type="dxa"/>
-              <w:right w:w="100" w:type="dxa"/>
-            </w:tcMar>
-          </w:tcPr>
-          <w:p>
-            <w:pPr>
-              <w:rPr>
-                <w:lang w:val="es-MX"/>
-              </w:rPr>
-            </w:pPr>
-            <w:r>
-              <w:rPr>
-                <w:sz w:val="19"/>
-                <w:szCs w:val="19"/>
-                <w:lang w:val="es-MX"/>
-              </w:rPr>
-              <w:t>Ninguno de los 4 clientes tiene cuenta corriente</w:t>
-            </w:r>
-          </w:p>
-        </w:tc>
-        <w:tc>
-          <w:tcPr>
-            <w:tcW w:w="2260" w:type="dxa"/>
-            <w:tcBorders>
-              <w:top w:val="single" w:sz="4" w:space="0" w:color="BFBFBF"/>
-              <w:left w:val="single" w:sz="4" w:space="0" w:color="BFBFBF"/>
-              <w:bottom w:val="single" w:sz="4" w:space="0" w:color="BFBFBF"/>
-              <w:right w:val="single" w:sz="4" w:space="0" w:color="BFBFBF"/>
-            </w:tcBorders>
-            <w:tcMar>
-              <w:top w:w="60" w:type="dxa"/>
-              <w:left w:w="100" w:type="dxa"/>
-              <w:bottom w:w="60" w:type="dxa"/>
-              <w:right w:w="100" w:type="dxa"/>
-            </w:tcMar>
-          </w:tcPr>
-          <w:p>
-            <w:pPr>
-              <w:rPr>
-                <w:lang w:val="es-MX"/>
-              </w:rPr>
-            </w:pPr>
-            <w:r>
-              <w:rPr>
-                <w:sz w:val="19"/>
-                <w:szCs w:val="19"/>
-                <w:lang w:val="es-MX"/>
-              </w:rPr>
-              <w:t xml:space="preserve">Cliente entregado el 20/10: 38706 y 39562 exitosos (ver #18)</w:t>
-            </w:r>
-          </w:p>
-        </w:tc>
-      </w:tr>
-      <w:tr>
-        <w:tc>
-          <w:tcPr>
-            <w:tcW w:w="500" w:type="dxa"/>
-            <w:tcBorders>
-              <w:top w:val="single" w:sz="4" w:space="0" w:color="BFBFBF"/>
-              <w:left w:val="single" w:sz="4" w:space="0" w:color="BFBFBF"/>
-              <w:bottom w:val="single" w:sz="4" w:space="0" w:color="BFBFBF"/>
-              <w:right w:val="single" w:sz="4" w:space="0" w:color="BFBFBF"/>
-            </w:tcBorders>
-            <w:shd w:val="clear" w:color="auto" w:fill="F2F2F2"/>
-            <w:tcMar>
-              <w:top w:w="60" w:type="dxa"/>
-              <w:left w:w="100" w:type="dxa"/>
-              <w:bottom w:w="60" w:type="dxa"/>
-              <w:right w:w="100" w:type="dxa"/>
-            </w:tcMar>
-          </w:tcPr>
-          <w:p>
-            <w:r>
-              <w:rPr>
-                <w:sz w:val="19"/>
-                <w:szCs w:val="19"/>
-              </w:rPr>
-              <w:t>10</w:t>
-            </w:r>
-          </w:p>
-        </w:tc>
-        <w:tc>
-          <w:tcPr>
-            <w:tcW w:w="1000" w:type="dxa"/>
-            <w:tcBorders>
-              <w:top w:val="single" w:sz="4" w:space="0" w:color="BFBFBF"/>
-              <w:left w:val="single" w:sz="4" w:space="0" w:color="BFBFBF"/>
-              <w:bottom w:val="single" w:sz="4" w:space="0" w:color="BFBFBF"/>
-              <w:right w:val="single" w:sz="4" w:space="0" w:color="BFBFBF"/>
-            </w:tcBorders>
-            <w:shd w:val="clear" w:color="auto" w:fill="F2F2F2"/>
-            <w:tcMar>
-              <w:top w:w="60" w:type="dxa"/>
-              <w:left w:w="100" w:type="dxa"/>
-              <w:bottom w:w="60" w:type="dxa"/>
-              <w:right w:w="100" w:type="dxa"/>
-            </w:tcMar>
-          </w:tcPr>
-          <w:p>
-            <w:r>
-              <w:rPr>
-                <w:sz w:val="19"/>
-                <w:szCs w:val="19"/>
-              </w:rPr>
-              <w:t>38709, 39565</w:t>
-            </w:r>
-          </w:p>
-        </w:tc>
-        <w:tc>
-          <w:tcPr>
-            <w:tcW w:w="2700" w:type="dxa"/>
-            <w:tcBorders>
-              <w:top w:val="single" w:sz="4" w:space="0" w:color="BFBFBF"/>
-              <w:left w:val="single" w:sz="4" w:space="0" w:color="BFBFBF"/>
-              <w:bottom w:val="single" w:sz="4" w:space="0" w:color="BFBFBF"/>
-              <w:right w:val="single" w:sz="4" w:space="0" w:color="BFBFBF"/>
-            </w:tcBorders>
-            <w:shd w:val="clear" w:color="auto" w:fill="F2F2F2"/>
-            <w:tcMar>
-              <w:top w:w="60" w:type="dxa"/>
-              <w:left w:w="100" w:type="dxa"/>
-              <w:bottom w:w="60" w:type="dxa"/>
-              <w:right w:w="100" w:type="dxa"/>
-            </w:tcMar>
-          </w:tcPr>
-          <w:p>
-            <w:pPr>
-              <w:rPr>
-                <w:lang w:val="es-MX"/>
-              </w:rPr>
-            </w:pPr>
-            <w:r>
-              <w:rPr>
-                <w:sz w:val="19"/>
-                <w:szCs w:val="19"/>
-                <w:lang w:val="es-MX"/>
-              </w:rPr>
-              <w:t>Saldos iguales a la información real del cliente (backend)</w:t>
-            </w:r>
-          </w:p>
-        </w:tc>
-        <w:tc>
-          <w:tcPr>
-            <w:tcW w:w="2900" w:type="dxa"/>
-            <w:tcBorders>
-              <w:top w:val="single" w:sz="4" w:space="0" w:color="BFBFBF"/>
-              <w:left w:val="single" w:sz="4" w:space="0" w:color="BFBFBF"/>
-              <w:bottom w:val="single" w:sz="4" w:space="0" w:color="BFBFBF"/>
-              <w:right w:val="single" w:sz="4" w:space="0" w:color="BFBFBF"/>
-            </w:tcBorders>
-            <w:shd w:val="clear" w:color="auto" w:fill="F2F2F2"/>
-            <w:tcMar>
-              <w:top w:w="60" w:type="dxa"/>
-              <w:left w:w="100" w:type="dxa"/>
-              <w:bottom w:w="60" w:type="dxa"/>
-              <w:right w:w="100" w:type="dxa"/>
-            </w:tcMar>
-          </w:tcPr>
-          <w:p>
-            <w:pPr>
-              <w:rPr>
-                <w:lang w:val="es-MX"/>
-              </w:rPr>
-            </w:pPr>
-            <w:r>
-              <w:rPr>
-                <w:sz w:val="19"/>
-                <w:szCs w:val="19"/>
-                <w:lang w:val="es-MX"/>
-              </w:rPr>
-              <w:t>Los montos del Home no coinciden con ninguna columna de saldo de la sábana (CAPITAL, SALDO_ACTUAL, VLR_XPAGAR, entre otras)</w:t>
-            </w:r>
-          </w:p>
-        </w:tc>
-        <w:tc>
-          <w:tcPr>
-            <w:tcW w:w="2260" w:type="dxa"/>
-            <w:tcBorders>
-              <w:top w:val="single" w:sz="4" w:space="0" w:color="BFBFBF"/>
-              <w:left w:val="single" w:sz="4" w:space="0" w:color="BFBFBF"/>
-              <w:bottom w:val="single" w:sz="4" w:space="0" w:color="BFBFBF"/>
-              <w:right w:val="single" w:sz="4" w:space="0" w:color="BFBFBF"/>
-            </w:tcBorders>
-            <w:shd w:val="clear" w:color="auto" w:fill="F2F2F2"/>
-            <w:tcMar>
-              <w:top w:w="60" w:type="dxa"/>
-              <w:left w:w="100" w:type="dxa"/>
-              <w:bottom w:w="60" w:type="dxa"/>
-              <w:right w:w="100" w:type="dxa"/>
-            </w:tcMar>
-          </w:tcPr>
-          <w:p>
-            <w:r>
-              <w:rPr>
-                <w:sz w:val="19"/>
-                <w:szCs w:val="19"/>
-                <w:lang w:val="es-MX"/>
-              </w:rPr>
-              <w:t xml:space="preserve">Saldos del backend entregados el 20/10. La comparación con el monto del control funciona</w:t>
-            </w:r>
-            <w:r>
-              <w:rPr>
-                <w:sz w:val="19"/>
-                <w:szCs w:val="19"/>
-              </w:rPr>
-              <w:t/>
-            </w:r>
-          </w:p>
-        </w:tc>
-      </w:tr>
-      <w:tr>
-        <w:tc>
-          <w:tcPr>
-            <w:tcW w:w="500" w:type="dxa"/>
-            <w:tcBorders>
-              <w:top w:val="single" w:sz="4" w:space="0" w:color="BFBFBF"/>
-              <w:left w:val="single" w:sz="4" w:space="0" w:color="BFBFBF"/>
-              <w:bottom w:val="single" w:sz="4" w:space="0" w:color="BFBFBF"/>
-              <w:right w:val="single" w:sz="4" w:space="0" w:color="BFBFBF"/>
-            </w:tcBorders>
-            <w:tcMar>
-              <w:top w:w="60" w:type="dxa"/>
-              <w:left w:w="100" w:type="dxa"/>
-              <w:bottom w:w="60" w:type="dxa"/>
-              <w:right w:w="100" w:type="dxa"/>
-            </w:tcMar>
-          </w:tcPr>
-          <w:p>
-            <w:r>
-              <w:rPr>
-                <w:sz w:val="19"/>
-                <w:szCs w:val="19"/>
-              </w:rPr>
-              <w:t>11</w:t>
-            </w:r>
-          </w:p>
-        </w:tc>
-        <w:tc>
-          <w:tcPr>
-            <w:tcW w:w="1000" w:type="dxa"/>
-            <w:tcBorders>
-              <w:top w:val="single" w:sz="4" w:space="0" w:color="BFBFBF"/>
-              <w:left w:val="single" w:sz="4" w:space="0" w:color="BFBFBF"/>
-              <w:bottom w:val="single" w:sz="4" w:space="0" w:color="BFBFBF"/>
-              <w:right w:val="single" w:sz="4" w:space="0" w:color="BFBFBF"/>
-            </w:tcBorders>
-            <w:tcMar>
-              <w:top w:w="60" w:type="dxa"/>
-              <w:left w:w="100" w:type="dxa"/>
-              <w:bottom w:w="60" w:type="dxa"/>
-              <w:right w:w="100" w:type="dxa"/>
-            </w:tcMar>
-          </w:tcPr>
-          <w:p>
-            <w:r>
-              <w:rPr>
-                <w:sz w:val="19"/>
-                <w:szCs w:val="19"/>
-              </w:rPr>
-              <w:t>38698</w:t>
-            </w:r>
-          </w:p>
-        </w:tc>
-        <w:tc>
-          <w:tcPr>
-            <w:tcW w:w="2700" w:type="dxa"/>
-            <w:tcBorders>
-              <w:top w:val="single" w:sz="4" w:space="0" w:color="BFBFBF"/>
-              <w:left w:val="single" w:sz="4" w:space="0" w:color="BFBFBF"/>
-              <w:bottom w:val="single" w:sz="4" w:space="0" w:color="BFBFBF"/>
-              <w:right w:val="single" w:sz="4" w:space="0" w:color="BFBFBF"/>
-            </w:tcBorders>
-            <w:tcMar>
-              <w:top w:w="60" w:type="dxa"/>
-              <w:left w:w="100" w:type="dxa"/>
-              <w:bottom w:w="60" w:type="dxa"/>
-              <w:right w:w="100" w:type="dxa"/>
-            </w:tcMar>
-          </w:tcPr>
-          <w:p>
-            <w:pPr>
-              <w:rPr>
-                <w:lang w:val="es-MX"/>
-              </w:rPr>
-            </w:pPr>
-            <w:r>
-              <w:rPr>
-                <w:sz w:val="19"/>
-                <w:szCs w:val="19"/>
-                <w:lang w:val="es-MX"/>
-              </w:rPr>
-              <w:t xml:space="preserve">Skeletons (marcadores de carga) mientras se obtienen los saldos</w:t>
-            </w:r>
-          </w:p>
-        </w:tc>
-        <w:tc>
-          <w:tcPr>
-            <w:tcW w:w="2900" w:type="dxa"/>
-            <w:tcBorders>
-              <w:top w:val="single" w:sz="4" w:space="0" w:color="BFBFBF"/>
-              <w:left w:val="single" w:sz="4" w:space="0" w:color="BFBFBF"/>
-              <w:bottom w:val="single" w:sz="4" w:space="0" w:color="BFBFBF"/>
-              <w:right w:val="single" w:sz="4" w:space="0" w:color="BFBFBF"/>
-            </w:tcBorders>
-            <w:tcMar>
-              <w:top w:w="60" w:type="dxa"/>
-              <w:left w:w="100" w:type="dxa"/>
-              <w:bottom w:w="60" w:type="dxa"/>
-              <w:right w:w="100" w:type="dxa"/>
-            </w:tcMar>
-          </w:tcPr>
-          <w:p>
-            <w:pPr>
-              <w:rPr>
-                <w:lang w:val="es-MX"/>
-              </w:rPr>
-            </w:pPr>
-            <w:r>
-              <w:rPr>
-                <w:sz w:val="19"/>
-                <w:szCs w:val="19"/>
-                <w:lang w:val="es-MX"/>
-              </w:rPr>
-              <w:t xml:space="preserve">Se observó el skeleton entre 3 y 4 segundos: primero el encabezado, los accesos y las secciones en gris, luego los productos</w:t>
-            </w:r>
-          </w:p>
-        </w:tc>
-        <w:tc>
-          <w:tcPr>
-            <w:tcW w:w="2260" w:type="dxa"/>
-            <w:tcBorders>
-              <w:top w:val="single" w:sz="4" w:space="0" w:color="BFBFBF"/>
-              <w:left w:val="single" w:sz="4" w:space="0" w:color="BFBFBF"/>
-              <w:bottom w:val="single" w:sz="4" w:space="0" w:color="BFBFBF"/>
-              <w:right w:val="single" w:sz="4" w:space="0" w:color="BFBFBF"/>
-            </w:tcBorders>
-            <w:tcMar>
-              <w:top w:w="60" w:type="dxa"/>
-              <w:left w:w="100" w:type="dxa"/>
-              <w:bottom w:w="60" w:type="dxa"/>
-              <w:right w:w="100" w:type="dxa"/>
-            </w:tcMar>
-          </w:tcPr>
-          <w:p>
-            <w:pPr>
-              <w:rPr>
-                <w:lang w:val="es-MX"/>
-              </w:rPr>
-            </w:pPr>
-            <w:r>
-              <w:rPr>
-                <w:sz w:val="19"/>
-                <w:szCs w:val="19"/>
-                <w:lang w:val="es-MX"/>
-              </w:rPr>
-              <w:t xml:space="preserve">Confirmado: es el comportamiento normal; lo importante es que carguen los datos</w:t>
-            </w:r>
-          </w:p>
-        </w:tc>
-      </w:tr>
-      <w:tr>
-        <w:tc>
-          <w:tcPr>
-            <w:tcW w:w="500" w:type="dxa"/>
-            <w:tcBorders>
-              <w:top w:val="single" w:sz="4" w:space="0" w:color="BFBFBF"/>
-              <w:left w:val="single" w:sz="4" w:space="0" w:color="BFBFBF"/>
-              <w:bottom w:val="single" w:sz="4" w:space="0" w:color="BFBFBF"/>
-              <w:right w:val="single" w:sz="4" w:space="0" w:color="BFBFBF"/>
-            </w:tcBorders>
-            <w:tcMar>
-              <w:top w:w="60" w:type="dxa"/>
-              <w:left w:w="100" w:type="dxa"/>
-              <w:bottom w:w="60" w:type="dxa"/>
-              <w:right w:w="100" w:type="dxa"/>
-            </w:tcMar>
-          </w:tcPr>
-          <w:p>
-            <w:pPr>
-              <w:rPr>
-                <w:sz w:val="19"/>
-                <w:szCs w:val="19"/>
-              </w:rPr>
-            </w:pPr>
-            <w:r>
-              <w:rPr>
-                <w:sz w:val="19"/>
-                <w:szCs w:val="19"/>
-              </w:rPr>
-              <w:t>12</w:t>
-            </w:r>
-          </w:p>
-        </w:tc>
-        <w:tc>
-          <w:tcPr>
-            <w:tcW w:w="1000" w:type="dxa"/>
-            <w:tcBorders>
-              <w:top w:val="single" w:sz="4" w:space="0" w:color="BFBFBF"/>
-              <w:left w:val="single" w:sz="4" w:space="0" w:color="BFBFBF"/>
-              <w:bottom w:val="single" w:sz="4" w:space="0" w:color="BFBFBF"/>
-              <w:right w:val="single" w:sz="4" w:space="0" w:color="BFBFBF"/>
-            </w:tcBorders>
-            <w:tcMar>
-              <w:top w:w="60" w:type="dxa"/>
-              <w:left w:w="100" w:type="dxa"/>
-              <w:bottom w:w="60" w:type="dxa"/>
-              <w:right w:w="100" w:type="dxa"/>
-            </w:tcMar>
-          </w:tcPr>
-          <w:p>
-            <w:pPr>
-              <w:rPr>
-                <w:sz w:val="19"/>
-                <w:szCs w:val="19"/>
-              </w:rPr>
-            </w:pPr>
-            <w:r>
-              <w:rPr>
-                <w:sz w:val="19"/>
-                <w:szCs w:val="19"/>
-              </w:rPr>
-              <w:t>39566</w:t>
-            </w:r>
-          </w:p>
-        </w:tc>
-        <w:tc>
-          <w:tcPr>
-            <w:tcW w:w="2700" w:type="dxa"/>
-            <w:tcBorders>
-              <w:top w:val="single" w:sz="4" w:space="0" w:color="BFBFBF"/>
-              <w:left w:val="single" w:sz="4" w:space="0" w:color="BFBFBF"/>
-              <w:bottom w:val="single" w:sz="4" w:space="0" w:color="BFBFBF"/>
-              <w:right w:val="single" w:sz="4" w:space="0" w:color="BFBFBF"/>
-            </w:tcBorders>
-            <w:tcMar>
-              <w:top w:w="60" w:type="dxa"/>
-              <w:left w:w="100" w:type="dxa"/>
-              <w:bottom w:w="60" w:type="dxa"/>
-              <w:right w:w="100" w:type="dxa"/>
-            </w:tcMar>
-          </w:tcPr>
-          <w:p>
-            <w:pPr>
-              <w:rPr>
-                <w:sz w:val="19"/>
-                <w:szCs w:val="19"/>
-                <w:lang w:val="es-MX"/>
-              </w:rPr>
-            </w:pPr>
-            <w:r>
-              <w:rPr>
-                <w:sz w:val="19"/>
-                <w:szCs w:val="19"/>
-                <w:lang w:val="es-MX"/>
-              </w:rPr>
-              <w:t xml:space="preserve">Texto "Los movimientos listados corresponden a las últimas 20 </w:t>
-              <w:lastRenderedPageBreak/>
-              <w:t>transacciones realizadas en su producto"</w:t>
-            </w:r>
-          </w:p>
-        </w:tc>
-        <w:tc>
-          <w:tcPr>
-            <w:tcW w:w="2900" w:type="dxa"/>
-            <w:tcBorders>
-              <w:top w:val="single" w:sz="4" w:space="0" w:color="BFBFBF"/>
-              <w:left w:val="single" w:sz="4" w:space="0" w:color="BFBFBF"/>
-              <w:bottom w:val="single" w:sz="4" w:space="0" w:color="BFBFBF"/>
-              <w:right w:val="single" w:sz="4" w:space="0" w:color="BFBFBF"/>
-            </w:tcBorders>
-            <w:tcMar>
-              <w:top w:w="60" w:type="dxa"/>
-              <w:left w:w="100" w:type="dxa"/>
-              <w:bottom w:w="60" w:type="dxa"/>
-              <w:right w:w="100" w:type="dxa"/>
-            </w:tcMar>
-          </w:tcPr>
-          <w:p>
-            <w:pPr>
-              <w:rPr>
-                <w:sz w:val="19"/>
-                <w:szCs w:val="19"/>
-                <w:lang w:val="es-MX"/>
-              </w:rPr>
-            </w:pPr>
-            <w:r>
-              <w:rPr>
-                <w:sz w:val="19"/>
-                <w:szCs w:val="19"/>
-                <w:lang w:val="es-MX"/>
-              </w:rPr>
-              <w:lastRenderedPageBreak/>
-              <w:t xml:space="preserve">Texto "Los movimientos mostrados corresponden a las últimas 20 transacciones </w:t>
-              <w:lastRenderedPageBreak/>
-              <w:t>realizadas en tu producto" (S23, 19/10)</w:t>
-            </w:r>
-          </w:p>
-        </w:tc>
-        <w:tc>
-          <w:tcPr>
-            <w:tcW w:w="2260" w:type="dxa"/>
-            <w:tcBorders>
-              <w:top w:val="single" w:sz="4" w:space="0" w:color="BFBFBF"/>
-              <w:left w:val="single" w:sz="4" w:space="0" w:color="BFBFBF"/>
-              <w:bottom w:val="single" w:sz="4" w:space="0" w:color="BFBFBF"/>
-              <w:right w:val="single" w:sz="4" w:space="0" w:color="BFBFBF"/>
-            </w:tcBorders>
-            <w:tcMar>
-              <w:top w:w="60" w:type="dxa"/>
-              <w:left w:w="100" w:type="dxa"/>
-              <w:bottom w:w="60" w:type="dxa"/>
-              <w:right w:w="100" w:type="dxa"/>
-            </w:tcMar>
-          </w:tcPr>
-          <w:p>
-            <w:pPr>
-              <w:rPr>
-                <w:sz w:val="19"/>
-                <w:szCs w:val="19"/>
-                <w:lang w:val="es-MX"/>
-              </w:rPr>
-            </w:pPr>
-            <w:r>
-              <w:rPr>
-                <w:sz w:val="19"/>
-                <w:szCs w:val="19"/>
-                <w:lang w:val="es-MX"/>
-              </w:rPr>
-              <w:lastRenderedPageBreak/>
-              <w:t xml:space="preserve">Confirmado: el texto correcto es el de la app</w:t>
-            </w:r>
-          </w:p>
-        </w:tc>
-      </w:tr>
-      <w:tr>
-        <w:tc>
-          <w:tcPr>
-            <w:tcW w:w="500" w:type="dxa"/>
-            <w:tcBorders>
-              <w:top w:val="single" w:sz="4" w:space="0" w:color="BFBFBF"/>
-              <w:left w:val="single" w:sz="4" w:space="0" w:color="BFBFBF"/>
-              <w:bottom w:val="single" w:sz="4" w:space="0" w:color="BFBFBF"/>
-              <w:right w:val="single" w:sz="4" w:space="0" w:color="BFBFBF"/>
-            </w:tcBorders>
-            <w:tcMar>
-              <w:top w:w="60" w:type="dxa"/>
-              <w:left w:w="100" w:type="dxa"/>
-              <w:bottom w:w="60" w:type="dxa"/>
-              <w:right w:w="100" w:type="dxa"/>
-            </w:tcMar>
-          </w:tcPr>
-          <w:p>
-            <w:pPr>
-              <w:rPr>
-                <w:sz w:val="19"/>
-                <w:szCs w:val="19"/>
-              </w:rPr>
-            </w:pPr>
-            <w:r>
-              <w:rPr>
-                <w:sz w:val="19"/>
-                <w:szCs w:val="19"/>
-              </w:rPr>
-              <w:t>13</w:t>
-            </w:r>
-          </w:p>
-        </w:tc>
-        <w:tc>
-          <w:tcPr>
-            <w:tcW w:w="1000" w:type="dxa"/>
-            <w:tcBorders>
-              <w:top w:val="single" w:sz="4" w:space="0" w:color="BFBFBF"/>
-              <w:left w:val="single" w:sz="4" w:space="0" w:color="BFBFBF"/>
-              <w:bottom w:val="single" w:sz="4" w:space="0" w:color="BFBFBF"/>
-              <w:right w:val="single" w:sz="4" w:space="0" w:color="BFBFBF"/>
-            </w:tcBorders>
-            <w:tcMar>
-              <w:top w:w="60" w:type="dxa"/>
-              <w:left w:w="100" w:type="dxa"/>
-              <w:bottom w:w="60" w:type="dxa"/>
-              <w:right w:w="100" w:type="dxa"/>
-            </w:tcMar>
-          </w:tcPr>
-          <w:p>
-            <w:pPr>
-              <w:rPr>
-                <w:sz w:val="19"/>
-                <w:szCs w:val="19"/>
-              </w:rPr>
-            </w:pPr>
-            <w:r>
-              <w:rPr>
-                <w:sz w:val="19"/>
-                <w:szCs w:val="19"/>
-              </w:rPr>
-              <w:t>39566</w:t>
-            </w:r>
-          </w:p>
-        </w:tc>
-        <w:tc>
-          <w:tcPr>
-            <w:tcW w:w="2700" w:type="dxa"/>
-            <w:tcBorders>
-              <w:top w:val="single" w:sz="4" w:space="0" w:color="BFBFBF"/>
-              <w:left w:val="single" w:sz="4" w:space="0" w:color="BFBFBF"/>
-              <w:bottom w:val="single" w:sz="4" w:space="0" w:color="BFBFBF"/>
-              <w:right w:val="single" w:sz="4" w:space="0" w:color="BFBFBF"/>
-            </w:tcBorders>
-            <w:tcMar>
-              <w:top w:w="60" w:type="dxa"/>
-              <w:left w:w="100" w:type="dxa"/>
-              <w:bottom w:w="60" w:type="dxa"/>
-              <w:right w:w="100" w:type="dxa"/>
-            </w:tcMar>
-          </w:tcPr>
-          <w:p>
-            <w:pPr>
-              <w:rPr>
-                <w:sz w:val="19"/>
-                <w:szCs w:val="19"/>
-                <w:lang w:val="es-MX"/>
-              </w:rPr>
-            </w:pPr>
-            <w:r>
-              <w:rPr>
-                <w:sz w:val="19"/>
-                <w:szCs w:val="19"/>
-                <w:lang w:val="es-MX"/>
-              </w:rPr>
-              <w:t>Pantalla "Detalle de Cuenta" con la opción "Compartir" en la esquina superior derecha</w:t>
-            </w:r>
-          </w:p>
-        </w:tc>
-        <w:tc>
-          <w:tcPr>
-            <w:tcW w:w="2900" w:type="dxa"/>
-            <w:tcBorders>
-              <w:top w:val="single" w:sz="4" w:space="0" w:color="BFBFBF"/>
-              <w:left w:val="single" w:sz="4" w:space="0" w:color="BFBFBF"/>
-              <w:bottom w:val="single" w:sz="4" w:space="0" w:color="BFBFBF"/>
-              <w:right w:val="single" w:sz="4" w:space="0" w:color="BFBFBF"/>
-            </w:tcBorders>
-            <w:tcMar>
-              <w:top w:w="60" w:type="dxa"/>
-              <w:left w:w="100" w:type="dxa"/>
-              <w:bottom w:w="60" w:type="dxa"/>
-              <w:right w:w="100" w:type="dxa"/>
-            </w:tcMar>
-          </w:tcPr>
-          <w:p>
-            <w:pPr>
-              <w:rPr>
-                <w:sz w:val="19"/>
-                <w:szCs w:val="19"/>
-              </w:rPr>
-            </w:pPr>
-            <w:r>
-              <w:rPr>
-                <w:sz w:val="19"/>
-                <w:szCs w:val="19"/>
-                <w:lang w:val="es-MX"/>
-              </w:rPr>
-              <w:t xml:space="preserve">Título "Cuenta"; el botón "Compartir cuenta" está junto al tipo y número de la cuenta. </w:t>
-            </w:r>
-            <w:r>
-              <w:rPr>
-                <w:sz w:val="19"/>
-                <w:szCs w:val="19"/>
-              </w:rPr>
-              <w:t xml:space="preserve">Acción rápida: solo "Tus llaves" (Bre-B, ¡Próximamente!)</w:t>
-            </w:r>
-          </w:p>
-        </w:tc>
-        <w:tc>
-          <w:tcPr>
-            <w:tcW w:w="2260" w:type="dxa"/>
-            <w:tcBorders>
-              <w:top w:val="single" w:sz="4" w:space="0" w:color="BFBFBF"/>
-              <w:left w:val="single" w:sz="4" w:space="0" w:color="BFBFBF"/>
-              <w:bottom w:val="single" w:sz="4" w:space="0" w:color="BFBFBF"/>
-              <w:right w:val="single" w:sz="4" w:space="0" w:color="BFBFBF"/>
-            </w:tcBorders>
-            <w:tcMar>
-              <w:top w:w="60" w:type="dxa"/>
-              <w:left w:w="100" w:type="dxa"/>
-              <w:bottom w:w="60" w:type="dxa"/>
-              <w:right w:w="100" w:type="dxa"/>
-            </w:tcMar>
-          </w:tcPr>
-          <w:p>
-            <w:pPr>
-              <w:rPr>
-                <w:sz w:val="19"/>
-                <w:szCs w:val="19"/>
-                <w:lang w:val="es-MX"/>
-              </w:rPr>
-            </w:pPr>
-            <w:r>
-              <w:rPr>
-                <w:sz w:val="19"/>
-                <w:szCs w:val="19"/>
-                <w:lang w:val="es-MX"/>
-              </w:rPr>
-              <w:t xml:space="preserve">Confirmado: se valida lo observado</w:t>
-            </w:r>
-          </w:p>
-        </w:tc>
-      </w:tr>
-      <w:tr>
-        <w:tc>
-          <w:tcPr>
-            <w:tcW w:w="500" w:type="dxa"/>
-            <w:tcBorders>
-              <w:top w:val="single" w:sz="4" w:space="0" w:color="BFBFBF"/>
-              <w:left w:val="single" w:sz="4" w:space="0" w:color="BFBFBF"/>
-              <w:bottom w:val="single" w:sz="4" w:space="0" w:color="BFBFBF"/>
-              <w:right w:val="single" w:sz="4" w:space="0" w:color="BFBFBF"/>
-            </w:tcBorders>
-            <w:tcMar>
-              <w:top w:w="60" w:type="dxa"/>
-              <w:left w:w="100" w:type="dxa"/>
-              <w:bottom w:w="60" w:type="dxa"/>
-              <w:right w:w="100" w:type="dxa"/>
-            </w:tcMar>
-          </w:tcPr>
-          <w:p>
-            <w:pPr>
-              <w:rPr>
-                <w:sz w:val="19"/>
-                <w:szCs w:val="19"/>
-              </w:rPr>
-            </w:pPr>
-            <w:r>
-              <w:rPr>
-                <w:sz w:val="19"/>
-                <w:szCs w:val="19"/>
-              </w:rPr>
-              <w:t>14</w:t>
-            </w:r>
-          </w:p>
-        </w:tc>
-        <w:tc>
-          <w:tcPr>
-            <w:tcW w:w="1000" w:type="dxa"/>
-            <w:tcBorders>
-              <w:top w:val="single" w:sz="4" w:space="0" w:color="BFBFBF"/>
-              <w:left w:val="single" w:sz="4" w:space="0" w:color="BFBFBF"/>
-              <w:bottom w:val="single" w:sz="4" w:space="0" w:color="BFBFBF"/>
-              <w:right w:val="single" w:sz="4" w:space="0" w:color="BFBFBF"/>
-            </w:tcBorders>
-            <w:tcMar>
-              <w:top w:w="60" w:type="dxa"/>
-              <w:left w:w="100" w:type="dxa"/>
-              <w:bottom w:w="60" w:type="dxa"/>
-              <w:right w:w="100" w:type="dxa"/>
-            </w:tcMar>
-          </w:tcPr>
-          <w:p>
-            <w:pPr>
-              <w:rPr>
-                <w:sz w:val="19"/>
-                <w:szCs w:val="19"/>
-              </w:rPr>
-            </w:pPr>
-            <w:r>
-              <w:rPr>
-                <w:sz w:val="19"/>
-                <w:szCs w:val="19"/>
-              </w:rPr>
-              <w:t>39566, 39567</w:t>
-            </w:r>
-          </w:p>
-        </w:tc>
-        <w:tc>
-          <w:tcPr>
-            <w:tcW w:w="2700" w:type="dxa"/>
-            <w:tcBorders>
-              <w:top w:val="single" w:sz="4" w:space="0" w:color="BFBFBF"/>
-              <w:left w:val="single" w:sz="4" w:space="0" w:color="BFBFBF"/>
-              <w:bottom w:val="single" w:sz="4" w:space="0" w:color="BFBFBF"/>
-              <w:right w:val="single" w:sz="4" w:space="0" w:color="BFBFBF"/>
-            </w:tcBorders>
-            <w:tcMar>
-              <w:top w:w="60" w:type="dxa"/>
-              <w:left w:w="100" w:type="dxa"/>
-              <w:bottom w:w="60" w:type="dxa"/>
-              <w:right w:w="100" w:type="dxa"/>
-            </w:tcMar>
-          </w:tcPr>
-          <w:p>
-            <w:pPr>
-              <w:rPr>
-                <w:sz w:val="19"/>
-                <w:szCs w:val="19"/>
-                <w:lang w:val="es-MX"/>
-              </w:rPr>
-            </w:pPr>
-            <w:r>
-              <w:rPr>
-                <w:sz w:val="19"/>
-                <w:szCs w:val="19"/>
-                <w:lang w:val="es-MX"/>
-              </w:rPr>
-              <w:t>Movimiento con fecha "05 May 2026 - 12:30 pm" y monto "$ 3,700,000,00"</w:t>
-            </w:r>
-          </w:p>
-        </w:tc>
-        <w:tc>
-          <w:tcPr>
-            <w:tcW w:w="2900" w:type="dxa"/>
-            <w:tcBorders>
-              <w:top w:val="single" w:sz="4" w:space="0" w:color="BFBFBF"/>
-              <w:left w:val="single" w:sz="4" w:space="0" w:color="BFBFBF"/>
-              <w:bottom w:val="single" w:sz="4" w:space="0" w:color="BFBFBF"/>
-              <w:right w:val="single" w:sz="4" w:space="0" w:color="BFBFBF"/>
-            </w:tcBorders>
-            <w:tcMar>
-              <w:top w:w="60" w:type="dxa"/>
-              <w:left w:w="100" w:type="dxa"/>
-              <w:bottom w:w="60" w:type="dxa"/>
-              <w:right w:w="100" w:type="dxa"/>
-            </w:tcMar>
-          </w:tcPr>
-          <w:p>
-            <w:pPr>
-              <w:rPr>
-                <w:sz w:val="19"/>
-                <w:szCs w:val="19"/>
-                <w:lang w:val="es-MX"/>
-              </w:rPr>
-            </w:pPr>
-            <w:r>
-              <w:rPr>
-                <w:sz w:val="19"/>
-                <w:szCs w:val="19"/>
-                <w:lang w:val="es-MX"/>
-              </w:rPr>
-              <w:t xml:space="preserve">Fecha "13 Oct.. 2026 - 08:06 p.m" (doble punto en el mes) y monto "-,00" (con signo en los débitos)</w:t>
-            </w:r>
-          </w:p>
-        </w:tc>
-        <w:tc>
-          <w:tcPr>
-            <w:tcW w:w="2260" w:type="dxa"/>
-            <w:tcBorders>
-              <w:top w:val="single" w:sz="4" w:space="0" w:color="BFBFBF"/>
-              <w:left w:val="single" w:sz="4" w:space="0" w:color="BFBFBF"/>
-              <w:bottom w:val="single" w:sz="4" w:space="0" w:color="BFBFBF"/>
-              <w:right w:val="single" w:sz="4" w:space="0" w:color="BFBFBF"/>
-            </w:tcBorders>
-            <w:tcMar>
-              <w:top w:w="60" w:type="dxa"/>
-              <w:left w:w="100" w:type="dxa"/>
-              <w:bottom w:w="60" w:type="dxa"/>
-              <w:right w:w="100" w:type="dxa"/>
-            </w:tcMar>
-          </w:tcPr>
-          <w:p>
-            <w:pPr>
-              <w:rPr>
-                <w:sz w:val="19"/>
-                <w:szCs w:val="19"/>
-                <w:lang w:val="es-MX"/>
-              </w:rPr>
-            </w:pPr>
-            <w:r>
-              <w:rPr>
-                <w:sz w:val="19"/>
-                <w:szCs w:val="19"/>
-                <w:lang w:val="es-MX"/>
-              </w:rPr>
-              <w:t xml:space="preserve">Confirmado: se dejan los formatos observados</w:t>
-            </w:r>
-          </w:p>
-        </w:tc>
-      </w:tr>
-      <w:tr>
-        <w:tc>
-          <w:tcPr>
-            <w:tcW w:w="500" w:type="dxa"/>
-            <w:tcBorders>
-              <w:top w:val="single" w:sz="4" w:space="0" w:color="BFBFBF"/>
-              <w:left w:val="single" w:sz="4" w:space="0" w:color="BFBFBF"/>
-              <w:bottom w:val="single" w:sz="4" w:space="0" w:color="BFBFBF"/>
-              <w:right w:val="single" w:sz="4" w:space="0" w:color="BFBFBF"/>
-            </w:tcBorders>
-            <w:tcMar>
-              <w:top w:w="60" w:type="dxa"/>
-              <w:left w:w="100" w:type="dxa"/>
-              <w:bottom w:w="60" w:type="dxa"/>
-              <w:right w:w="100" w:type="dxa"/>
-            </w:tcMar>
-          </w:tcPr>
-          <w:p>
-            <w:pPr>
-              <w:rPr>
-                <w:sz w:val="19"/>
-                <w:szCs w:val="19"/>
-              </w:rPr>
-            </w:pPr>
-            <w:r>
-              <w:rPr>
-                <w:sz w:val="19"/>
-                <w:szCs w:val="19"/>
-              </w:rPr>
-              <w:t>15</w:t>
-            </w:r>
-          </w:p>
-        </w:tc>
-        <w:tc>
-          <w:tcPr>
-            <w:tcW w:w="1000" w:type="dxa"/>
-            <w:tcBorders>
-              <w:top w:val="single" w:sz="4" w:space="0" w:color="BFBFBF"/>
-              <w:left w:val="single" w:sz="4" w:space="0" w:color="BFBFBF"/>
-              <w:bottom w:val="single" w:sz="4" w:space="0" w:color="BFBFBF"/>
-              <w:right w:val="single" w:sz="4" w:space="0" w:color="BFBFBF"/>
-            </w:tcBorders>
-            <w:tcMar>
-              <w:top w:w="60" w:type="dxa"/>
-              <w:left w:w="100" w:type="dxa"/>
-              <w:bottom w:w="60" w:type="dxa"/>
-              <w:right w:w="100" w:type="dxa"/>
-            </w:tcMar>
-          </w:tcPr>
-          <w:p>
-            <w:pPr>
-              <w:rPr>
-                <w:sz w:val="19"/>
-                <w:szCs w:val="19"/>
-              </w:rPr>
-            </w:pPr>
-            <w:r>
-              <w:rPr>
-                <w:sz w:val="19"/>
-                <w:szCs w:val="19"/>
-              </w:rPr>
-              <w:t>39571</w:t>
-            </w:r>
-          </w:p>
-        </w:tc>
-        <w:tc>
-          <w:tcPr>
-            <w:tcW w:w="2700" w:type="dxa"/>
-            <w:tcBorders>
-              <w:top w:val="single" w:sz="4" w:space="0" w:color="BFBFBF"/>
-              <w:left w:val="single" w:sz="4" w:space="0" w:color="BFBFBF"/>
-              <w:bottom w:val="single" w:sz="4" w:space="0" w:color="BFBFBF"/>
-              <w:right w:val="single" w:sz="4" w:space="0" w:color="BFBFBF"/>
-            </w:tcBorders>
-            <w:tcMar>
-              <w:top w:w="60" w:type="dxa"/>
-              <w:left w:w="100" w:type="dxa"/>
-              <w:bottom w:w="60" w:type="dxa"/>
-              <w:right w:w="100" w:type="dxa"/>
-            </w:tcMar>
-          </w:tcPr>
-          <w:p>
-            <w:pPr>
-              <w:rPr>
-                <w:sz w:val="19"/>
-                <w:szCs w:val="19"/>
-                <w:lang w:val="es-MX"/>
-              </w:rPr>
-            </w:pPr>
-            <w:r>
-              <w:rPr>
-                <w:sz w:val="19"/>
-                <w:szCs w:val="19"/>
-                <w:lang w:val="es-MX"/>
-              </w:rPr>
-              <w:t>Monto, tipo, cuenta de origen, cuenta de destino (si aplica), fecha, hora y número de referencia</w:t>
-            </w:r>
-          </w:p>
-        </w:tc>
-        <w:tc>
-          <w:tcPr>
-            <w:tcW w:w="2900" w:type="dxa"/>
-            <w:tcBorders>
-              <w:top w:val="single" w:sz="4" w:space="0" w:color="BFBFBF"/>
-              <w:left w:val="single" w:sz="4" w:space="0" w:color="BFBFBF"/>
-              <w:bottom w:val="single" w:sz="4" w:space="0" w:color="BFBFBF"/>
-              <w:right w:val="single" w:sz="4" w:space="0" w:color="BFBFBF"/>
-            </w:tcBorders>
-            <w:tcMar>
-              <w:top w:w="60" w:type="dxa"/>
-              <w:left w:w="100" w:type="dxa"/>
-              <w:bottom w:w="60" w:type="dxa"/>
-              <w:right w:w="100" w:type="dxa"/>
-            </w:tcMar>
-          </w:tcPr>
-          <w:p>
-            <w:pPr>
-              <w:rPr>
-                <w:sz w:val="19"/>
-                <w:szCs w:val="19"/>
-                <w:lang w:val="es-MX"/>
-              </w:rPr>
-            </w:pPr>
-            <w:r>
-              <w:rPr>
-                <w:sz w:val="19"/>
-                <w:szCs w:val="19"/>
-                <w:lang w:val="es-MX"/>
-              </w:rPr>
-              <w:t>Muestra "MONTO ENVIADO", monto, fecha y hora, "Comprobante N°" y descripción. No muestra cuenta de origen ni de destino y el comprobante sale en ceros (000000000000)</w:t>
-            </w:r>
-          </w:p>
-        </w:tc>
-        <w:tc>
-          <w:tcPr>
-            <w:tcW w:w="2260" w:type="dxa"/>
-            <w:tcBorders>
-              <w:top w:val="single" w:sz="4" w:space="0" w:color="BFBFBF"/>
-              <w:left w:val="single" w:sz="4" w:space="0" w:color="BFBFBF"/>
-              <w:bottom w:val="single" w:sz="4" w:space="0" w:color="BFBFBF"/>
-              <w:right w:val="single" w:sz="4" w:space="0" w:color="BFBFBF"/>
-            </w:tcBorders>
-            <w:tcMar>
-              <w:top w:w="60" w:type="dxa"/>
-              <w:left w:w="100" w:type="dxa"/>
-              <w:bottom w:w="60" w:type="dxa"/>
-              <w:right w:w="100" w:type="dxa"/>
-            </w:tcMar>
-          </w:tcPr>
-          <w:p>
-            <w:pPr>
-              <w:rPr>
-                <w:sz w:val="19"/>
-                <w:szCs w:val="19"/>
-              </w:rPr>
-            </w:pPr>
-            <w:r>
-              <w:rPr>
-                <w:sz w:val="19"/>
-                <w:szCs w:val="19"/>
-                <w:lang w:val="es-MX"/>
-              </w:rPr>
-              <w:t xml:space="preserve">Aprobado</w:t>
-            </w:r>
-            <w:r>
-              <w:rPr>
-                <w:sz w:val="19"/>
-                <w:szCs w:val="19"/>
-              </w:rPr>
-              <w:t/>
-            </w:r>
-          </w:p>
-        </w:tc>
-      </w:tr>
-      <w:tr>
-        <w:tc>
-          <w:tcPr>
-            <w:tcW w:w="500" w:type="dxa"/>
-            <w:tcBorders>
-              <w:top w:val="single" w:sz="4" w:space="0" w:color="BFBFBF"/>
-              <w:left w:val="single" w:sz="4" w:space="0" w:color="BFBFBF"/>
-              <w:bottom w:val="single" w:sz="4" w:space="0" w:color="BFBFBF"/>
-              <w:right w:val="single" w:sz="4" w:space="0" w:color="BFBFBF"/>
-            </w:tcBorders>
-            <w:tcMar>
-              <w:top w:w="60" w:type="dxa"/>
-              <w:left w:w="100" w:type="dxa"/>
-              <w:bottom w:w="60" w:type="dxa"/>
-              <w:right w:w="100" w:type="dxa"/>
-            </w:tcMar>
-          </w:tcPr>
-          <w:p>
-            <w:pPr>
-              <w:rPr>
-                <w:sz w:val="19"/>
-                <w:szCs w:val="19"/>
-              </w:rPr>
-            </w:pPr>
-            <w:r>
-              <w:rPr>
-                <w:sz w:val="19"/>
-                <w:szCs w:val="19"/>
-              </w:rPr>
-              <w:t>16</w:t>
-            </w:r>
-          </w:p>
-        </w:tc>
-        <w:tc>
-          <w:tcPr>
-            <w:tcW w:w="1000" w:type="dxa"/>
-            <w:tcBorders>
-              <w:top w:val="single" w:sz="4" w:space="0" w:color="BFBFBF"/>
-              <w:left w:val="single" w:sz="4" w:space="0" w:color="BFBFBF"/>
-              <w:bottom w:val="single" w:sz="4" w:space="0" w:color="BFBFBF"/>
-              <w:right w:val="single" w:sz="4" w:space="0" w:color="BFBFBF"/>
-            </w:tcBorders>
-            <w:tcMar>
-              <w:top w:w="60" w:type="dxa"/>
-              <w:left w:w="100" w:type="dxa"/>
-              <w:bottom w:w="60" w:type="dxa"/>
-              <w:right w:w="100" w:type="dxa"/>
-            </w:tcMar>
-          </w:tcPr>
-          <w:p>
-            <w:pPr>
-              <w:rPr>
-                <w:sz w:val="19"/>
-                <w:szCs w:val="19"/>
-              </w:rPr>
-            </w:pPr>
-            <w:r>
-              <w:rPr>
-                <w:sz w:val="19"/>
-                <w:szCs w:val="19"/>
-              </w:rPr>
-              <w:t>39572</w:t>
-            </w:r>
-          </w:p>
-        </w:tc>
-        <w:tc>
-          <w:tcPr>
-            <w:tcW w:w="2700" w:type="dxa"/>
-            <w:tcBorders>
-              <w:top w:val="single" w:sz="4" w:space="0" w:color="BFBFBF"/>
-              <w:left w:val="single" w:sz="4" w:space="0" w:color="BFBFBF"/>
-              <w:bottom w:val="single" w:sz="4" w:space="0" w:color="BFBFBF"/>
-              <w:right w:val="single" w:sz="4" w:space="0" w:color="BFBFBF"/>
-            </w:tcBorders>
-            <w:tcMar>
-              <w:top w:w="60" w:type="dxa"/>
-              <w:left w:w="100" w:type="dxa"/>
-              <w:bottom w:w="60" w:type="dxa"/>
-              <w:right w:w="100" w:type="dxa"/>
-            </w:tcMar>
-          </w:tcPr>
-          <w:p>
-            <w:pPr>
-              <w:rPr>
-                <w:sz w:val="19"/>
-                <w:szCs w:val="19"/>
-                <w:lang w:val="es-MX"/>
-              </w:rPr>
-            </w:pPr>
-            <w:r>
-              <w:rPr>
-                <w:sz w:val="19"/>
-                <w:szCs w:val="19"/>
-                <w:lang w:val="es-MX"/>
-              </w:rPr>
-              <w:t>La imagen se descarga y se verifica en la galería o carpeta de archivos</w:t>
-            </w:r>
-          </w:p>
-        </w:tc>
-        <w:tc>
-          <w:tcPr>
-            <w:tcW w:w="2900" w:type="dxa"/>
-            <w:tcBorders>
-              <w:top w:val="single" w:sz="4" w:space="0" w:color="BFBFBF"/>
-              <w:left w:val="single" w:sz="4" w:space="0" w:color="BFBFBF"/>
-              <w:bottom w:val="single" w:sz="4" w:space="0" w:color="BFBFBF"/>
-              <w:right w:val="single" w:sz="4" w:space="0" w:color="BFBFBF"/>
-            </w:tcBorders>
-            <w:tcMar>
-              <w:top w:w="60" w:type="dxa"/>
-              <w:left w:w="100" w:type="dxa"/>
-              <w:bottom w:w="60" w:type="dxa"/>
-              <w:right w:w="100" w:type="dxa"/>
-            </w:tcMar>
-          </w:tcPr>
-          <w:p>
-            <w:pPr>
-              <w:rPr>
-                <w:sz w:val="19"/>
-                <w:szCs w:val="19"/>
-                <w:lang w:val="es-MX"/>
-              </w:rPr>
-            </w:pPr>
-            <w:r>
-              <w:rPr>
-                <w:sz w:val="19"/>
-                <w:szCs w:val="19"/>
-                <w:lang w:val="es-MX"/>
-              </w:rPr>
-              <w:t xml:space="preserve">Aviso "Tu comprobante se descargó correctamente." y la imagen queda en Documents como comprobante-&lt;N°&gt;.png</w:t>
-            </w:r>
-          </w:p>
-        </w:tc>
-        <w:tc>
-          <w:tcPr>
-            <w:tcW w:w="2260" w:type="dxa"/>
-            <w:tcBorders>
-              <w:top w:val="single" w:sz="4" w:space="0" w:color="BFBFBF"/>
-              <w:left w:val="single" w:sz="4" w:space="0" w:color="BFBFBF"/>
-              <w:bottom w:val="single" w:sz="4" w:space="0" w:color="BFBFBF"/>
-              <w:right w:val="single" w:sz="4" w:space="0" w:color="BFBFBF"/>
-            </w:tcBorders>
-            <w:tcMar>
-              <w:top w:w="60" w:type="dxa"/>
-              <w:left w:w="100" w:type="dxa"/>
-              <w:bottom w:w="60" w:type="dxa"/>
-              <w:right w:w="100" w:type="dxa"/>
-            </w:tcMar>
-          </w:tcPr>
-          <w:p>
-            <w:pPr>
-              <w:rPr>
-                <w:sz w:val="19"/>
-                <w:szCs w:val="19"/>
-              </w:rPr>
-            </w:pPr>
-            <w:r>
-              <w:rPr>
-                <w:sz w:val="19"/>
-                <w:szCs w:val="19"/>
-                <w:lang w:val="es-MX"/>
-              </w:rPr>
-              <w:t xml:space="preserve">Confirmado: la ubicación depende del celular (en algunos queda en la galería). En el S23 se valida en Documents</w:t>
-            </w:r>
-            <w:r>
-              <w:rPr>
-                <w:sz w:val="19"/>
-                <w:szCs w:val="19"/>
-              </w:rPr>
-              <w:t/>
-            </w:r>
-          </w:p>
-        </w:tc>
-      </w:tr>
-      <w:tr>
-        <w:tc>
-          <w:tcPr>
-            <w:tcW w:w="500" w:type="dxa"/>
-            <w:tcBorders>
-              <w:top w:val="single" w:sz="4" w:space="0" w:color="BFBFBF"/>
-              <w:left w:val="single" w:sz="4" w:space="0" w:color="BFBFBF"/>
-              <w:bottom w:val="single" w:sz="4" w:space="0" w:color="BFBFBF"/>
-              <w:right w:val="single" w:sz="4" w:space="0" w:color="BFBFBF"/>
-            </w:tcBorders>
-            <w:tcMar>
-              <w:top w:w="60" w:type="dxa"/>
-              <w:left w:w="100" w:type="dxa"/>
-              <w:bottom w:w="60" w:type="dxa"/>
-              <w:right w:w="100" w:type="dxa"/>
-            </w:tcMar>
-          </w:tcPr>
-          <w:p>
-            <w:pPr>
-              <w:rPr>
-                <w:sz w:val="19"/>
-                <w:szCs w:val="19"/>
-              </w:rPr>
-            </w:pPr>
-            <w:r>
-              <w:rPr>
-                <w:sz w:val="19"/>
-                <w:szCs w:val="19"/>
-              </w:rPr>
-              <w:t>17</w:t>
-            </w:r>
-          </w:p>
-        </w:tc>
-        <w:tc>
-          <w:tcPr>
-            <w:tcW w:w="1000" w:type="dxa"/>
-            <w:tcBorders>
-              <w:top w:val="single" w:sz="4" w:space="0" w:color="BFBFBF"/>
-              <w:left w:val="single" w:sz="4" w:space="0" w:color="BFBFBF"/>
-              <w:bottom w:val="single" w:sz="4" w:space="0" w:color="BFBFBF"/>
-              <w:right w:val="single" w:sz="4" w:space="0" w:color="BFBFBF"/>
-            </w:tcBorders>
-            <w:tcMar>
-              <w:top w:w="60" w:type="dxa"/>
-              <w:left w:w="100" w:type="dxa"/>
-              <w:bottom w:w="60" w:type="dxa"/>
-              <w:right w:w="100" w:type="dxa"/>
-            </w:tcMar>
-          </w:tcPr>
-          <w:p>
-            <w:pPr>
-              <w:rPr>
-                <w:sz w:val="19"/>
-                <w:szCs w:val="19"/>
-              </w:rPr>
-            </w:pPr>
-            <w:r>
-              <w:rPr>
-                <w:sz w:val="19"/>
-                <w:szCs w:val="19"/>
-              </w:rPr>
-              <w:t>39567, 39568</w:t>
-            </w:r>
-          </w:p>
-        </w:tc>
-        <w:tc>
-          <w:tcPr>
-            <w:tcW w:w="2700" w:type="dxa"/>
-            <w:tcBorders>
-              <w:top w:val="single" w:sz="4" w:space="0" w:color="BFBFBF"/>
-              <w:left w:val="single" w:sz="4" w:space="0" w:color="BFBFBF"/>
-              <w:bottom w:val="single" w:sz="4" w:space="0" w:color="BFBFBF"/>
-              <w:right w:val="single" w:sz="4" w:space="0" w:color="BFBFBF"/>
-            </w:tcBorders>
-            <w:tcMar>
-              <w:top w:w="60" w:type="dxa"/>
-              <w:left w:w="100" w:type="dxa"/>
-              <w:bottom w:w="60" w:type="dxa"/>
-              <w:right w:w="100" w:type="dxa"/>
-            </w:tcMar>
-          </w:tcPr>
-          <w:p>
-            <w:pPr>
-              <w:rPr>
-                <w:sz w:val="19"/>
-                <w:szCs w:val="19"/>
-                <w:lang w:val="es-MX"/>
-              </w:rPr>
-            </w:pPr>
-            <w:r>
-              <w:rPr>
-                <w:sz w:val="19"/>
-                <w:szCs w:val="19"/>
-                <w:lang w:val="es-MX"/>
-              </w:rPr>
-              <w:t>39567: se muestran las últimas 20 transacciones. 39568: solo los movimientos del último mes</w:t>
-            </w:r>
-          </w:p>
-        </w:tc>
-        <w:tc>
-          <w:tcPr>
-            <w:tcW w:w="2900" w:type="dxa"/>
-            <w:tcBorders>
-              <w:top w:val="single" w:sz="4" w:space="0" w:color="BFBFBF"/>
-              <w:left w:val="single" w:sz="4" w:space="0" w:color="BFBFBF"/>
-              <w:bottom w:val="single" w:sz="4" w:space="0" w:color="BFBFBF"/>
-              <w:right w:val="single" w:sz="4" w:space="0" w:color="BFBFBF"/>
-            </w:tcBorders>
-            <w:tcMar>
-              <w:top w:w="60" w:type="dxa"/>
-              <w:left w:w="100" w:type="dxa"/>
-              <w:bottom w:w="60" w:type="dxa"/>
-              <w:right w:w="100" w:type="dxa"/>
-            </w:tcMar>
-          </w:tcPr>
-          <w:p>
-            <w:pPr>
-              <w:rPr>
-                <w:sz w:val="19"/>
-                <w:szCs w:val="19"/>
-                <w:lang w:val="es-MX"/>
-              </w:rPr>
-            </w:pPr>
-            <w:r>
-              <w:rPr>
-                <w:sz w:val="19"/>
-                <w:szCs w:val="19"/>
-                <w:lang w:val="es-MX"/>
-              </w:rPr>
-              <w:t>El aviso dice "Los movimientos mostrados corresponden a las últimas 20 transacciones", pero la app muestra solo los del último mes: un cliente con 85 transacciones (30 en abril) ve 3</w:t>
-            </w:r>
-          </w:p>
-        </w:tc>
-        <w:tc>
-          <w:tcPr>
-            <w:tcW w:w="2260" w:type="dxa"/>
-            <w:tcBorders>
-              <w:top w:val="single" w:sz="4" w:space="0" w:color="BFBFBF"/>
-              <w:left w:val="single" w:sz="4" w:space="0" w:color="BFBFBF"/>
-              <w:bottom w:val="single" w:sz="4" w:space="0" w:color="BFBFBF"/>
-              <w:right w:val="single" w:sz="4" w:space="0" w:color="BFBFBF"/>
-            </w:tcBorders>
-            <w:tcMar>
-              <w:top w:w="60" w:type="dxa"/>
-              <w:left w:w="100" w:type="dxa"/>
-              <w:bottom w:w="60" w:type="dxa"/>
-              <w:right w:w="100" w:type="dxa"/>
-            </w:tcMar>
-          </w:tcPr>
-          <w:p>
-            <w:pPr>
-              <w:rPr>
-                <w:sz w:val="19"/>
-                <w:szCs w:val="19"/>
-                <w:lang w:val="es-MX"/>
-              </w:rPr>
-            </w:pPr>
-            <w:r>
-              <w:rPr>
-                <w:sz w:val="19"/>
-                <w:szCs w:val="19"/>
-                <w:lang w:val="es-MX"/>
-              </w:rPr>
-              <w:t xml:space="preserve">Confirmado: solo se visualizan los movimientos de los últimos 30 días. Se validan ambas reglas</w:t>
-            </w:r>
-          </w:p>
-        </w:tc>
-      </w:tr>
-      <w:tr>
-        <w:tc>
-          <w:tcPr>
-            <w:tcW w:w="500" w:type="dxa"/>
-            <w:tcBorders>
-              <w:top w:val="single" w:sz="4" w:space="0" w:color="BFBFBF"/>
-              <w:left w:val="single" w:sz="4" w:space="0" w:color="BFBFBF"/>
-              <w:bottom w:val="single" w:sz="4" w:space="0" w:color="BFBFBF"/>
-              <w:right w:val="single" w:sz="4" w:space="0" w:color="BFBFBF"/>
-            </w:tcBorders>
-            <w:tcMar>
-              <w:top w:w="60" w:type="dxa"/>
-              <w:left w:w="100" w:type="dxa"/>
-              <w:bottom w:w="60" w:type="dxa"/>
-              <w:right w:w="100" w:type="dxa"/>
-            </w:tcMar>
-          </w:tcPr>
-          <w:p>
-            <w:pPr>
-              <w:rPr>
-                <w:sz w:val="19"/>
-                <w:szCs w:val="19"/>
-              </w:rPr>
-            </w:pPr>
-            <w:r>
-              <w:rPr>
-                <w:sz w:val="19"/>
-                <w:szCs w:val="19"/>
-              </w:rPr>
-              <w:t>18</w:t>
-            </w:r>
-          </w:p>
-        </w:tc>
-        <w:tc>
-          <w:tcPr>
-            <w:tcW w:w="1000" w:type="dxa"/>
-            <w:tcBorders>
-              <w:top w:val="single" w:sz="4" w:space="0" w:color="BFBFBF"/>
-              <w:left w:val="single" w:sz="4" w:space="0" w:color="BFBFBF"/>
-              <w:bottom w:val="single" w:sz="4" w:space="0" w:color="BFBFBF"/>
-              <w:right w:val="single" w:sz="4" w:space="0" w:color="BFBFBF"/>
-            </w:tcBorders>
-            <w:tcMar>
-              <w:top w:w="60" w:type="dxa"/>
-              <w:left w:w="100" w:type="dxa"/>
-              <w:bottom w:w="60" w:type="dxa"/>
-              <w:right w:w="100" w:type="dxa"/>
-            </w:tcMar>
-          </w:tcPr>
-          <w:p>
-            <w:pPr>
-              <w:rPr>
-                <w:sz w:val="19"/>
-                <w:szCs w:val="19"/>
-              </w:rPr>
-            </w:pPr>
-            <w:r>
-              <w:rPr>
-                <w:sz w:val="19"/>
-                <w:szCs w:val="19"/>
-              </w:rPr>
-              <w:t>38706, 39562</w:t>
-            </w:r>
-          </w:p>
-        </w:tc>
-        <w:tc>
-          <w:tcPr>
-            <w:tcW w:w="2700" w:type="dxa"/>
-            <w:tcBorders>
-              <w:top w:val="single" w:sz="4" w:space="0" w:color="BFBFBF"/>
-              <w:left w:val="single" w:sz="4" w:space="0" w:color="BFBFBF"/>
-              <w:bottom w:val="single" w:sz="4" w:space="0" w:color="BFBFBF"/>
-              <w:right w:val="single" w:sz="4" w:space="0" w:color="BFBFBF"/>
-            </w:tcBorders>
-            <w:tcMar>
-              <w:top w:w="60" w:type="dxa"/>
-              <w:left w:w="100" w:type="dxa"/>
-              <w:bottom w:w="60" w:type="dxa"/>
-              <w:right w:w="100" w:type="dxa"/>
-            </w:tcMar>
-          </w:tcPr>
-          <w:p>
-            <w:pPr>
-              <w:rPr>
-                <w:sz w:val="19"/>
-                <w:szCs w:val="19"/>
-                <w:lang w:val="es-MX"/>
-              </w:rPr>
-            </w:pPr>
-            <w:r>
-              <w:rPr>
-                <w:sz w:val="19"/>
-                <w:szCs w:val="19"/>
-                <w:lang w:val="es-MX"/>
-              </w:rPr>
-              <w:t>Tarjeta de cuenta corriente en "Tus cuentas"</w:t>
-            </w:r>
-          </w:p>
-        </w:tc>
-        <w:tc>
-          <w:tcPr>
-            <w:tcW w:w="2900" w:type="dxa"/>
-            <w:tcBorders>
-              <w:top w:val="single" w:sz="4" w:space="0" w:color="BFBFBF"/>
-              <w:left w:val="single" w:sz="4" w:space="0" w:color="BFBFBF"/>
-              <w:bottom w:val="single" w:sz="4" w:space="0" w:color="BFBFBF"/>
-              <w:right w:val="single" w:sz="4" w:space="0" w:color="BFBFBF"/>
-            </w:tcBorders>
-            <w:tcMar>
-              <w:top w:w="60" w:type="dxa"/>
-              <w:left w:w="100" w:type="dxa"/>
-              <w:bottom w:w="60" w:type="dxa"/>
-              <w:right w:w="100" w:type="dxa"/>
-            </w:tcMar>
-          </w:tcPr>
-          <w:p>
-            <w:pPr>
-              <w:rPr>
-                <w:sz w:val="19"/>
-                <w:szCs w:val="19"/>
-                <w:lang w:val="es-MX"/>
-              </w:rPr>
-            </w:pPr>
-            <w:r>
-              <w:rPr>
-                <w:sz w:val="19"/>
-                <w:szCs w:val="19"/>
-                <w:lang w:val="es-MX"/>
-              </w:rPr>
-              <w:t>Título "Cuentas corrientes **** 0568" (en plural, como "Cuentas de ahorro"), 20/10</w:t>
-            </w:r>
-          </w:p>
-        </w:tc>
-        <w:tc>
-          <w:tcPr>
-            <w:tcW w:w="2260" w:type="dxa"/>
-            <w:tcBorders>
-              <w:top w:val="single" w:sz="4" w:space="0" w:color="BFBFBF"/>
-              <w:left w:val="single" w:sz="4" w:space="0" w:color="BFBFBF"/>
-              <w:bottom w:val="single" w:sz="4" w:space="0" w:color="BFBFBF"/>
-              <w:right w:val="single" w:sz="4" w:space="0" w:color="BFBFBF"/>
-            </w:tcBorders>
-            <w:tcMar>
-              <w:top w:w="60" w:type="dxa"/>
-              <w:left w:w="100" w:type="dxa"/>
-              <w:bottom w:w="60" w:type="dxa"/>
-              <w:right w:w="100" w:type="dxa"/>
-            </w:tcMar>
-          </w:tcPr>
-          <w:p>
-            <w:pPr>
-              <w:rPr>
-                <w:sz w:val="19"/>
-                <w:szCs w:val="19"/>
-                <w:lang w:val="es-MX"/>
-              </w:rPr>
-            </w:pPr>
-            <w:r>
-              <w:rPr>
-                <w:sz w:val="19"/>
-                <w:szCs w:val="19"/>
-                <w:lang w:val="es-MX"/>
-              </w:rPr>
-              <w:t xml:space="preserve">Se valida el texto de la app (criterio de la respuesta #1)</w:t>
-            </w:r>
-          </w:p>
-        </w:tc>
-      </w:tr>
-    </w:tbl>
     <w:p>
       <w:pPr>
         <w:rPr>

</xml_diff>

<commit_message>
Consolidado: el corte en 20 movimientos queda como observacion, no como pendiente
Co-Authored-By: Claude Opus 5.5 <noreply@anthropic.com>
</commit_message>
<xml_diff>
--- a/Casos de Prueba/Consolidacion_Casos_de_Prueba.docx
+++ b/Casos de Prueba/Consolidacion_Casos_de_Prueba.docx
@@ -4430,25 +4430,6 @@
       </w:pPr>
       <w:r>
         <w:t xml:space="preserve">8. Pendientes por confirmar</w:t>
-      </w:r>
-    </w:p>
-    <w:p>
-      <w:pPr>
-        <w:pStyle w:val="Prrafodelista"/>
-        <w:numPr>
-          <w:ilvl w:val="0"/>
-          <w:numId w:val="2"/>
-        </w:numPr>
-        <w:spacing w:after="60"/>
-        <w:rPr>
-          <w:lang w:val="es-MX"/>
-        </w:rPr>
-      </w:pPr>
-      <w:r>
-        <w:rPr>
-          <w:lang w:val="es-MX"/>
-        </w:rPr>
-        <w:t xml:space="preserve">Corte en 20 movimientos (39567, 39569, 39570): falta un cliente con más de 20 movimientos en los últimos 30 días para comprobarlo. La app solo muestra los movimientos de ese periodo.</w:t>
       </w:r>
     </w:p>
     <w:p>

</xml_diff>

<commit_message>
Se ajustan los formatos del archivo de control for fallo en comparacion con saldos
</commit_message>
<xml_diff>
--- a/Casos de Prueba/Consolidacion_Casos_de_Prueba.docx
+++ b/Casos de Prueba/Consolidacion_Casos_de_Prueba.docx
@@ -36,7 +36,7 @@
           <w:color w:val="595959"/>
           <w:lang w:val="es-MX"/>
         </w:rPr>
-        <w:t xml:space="preserve">App Mi Banco · Procesos Registro, Autenticación, Home y Cuentas · Versión 6 · 20 de octubre de 2026</w:t>
+        <w:t>App Mi Banco · Procesos Registro, Autenticación, Home y Cuentas · Versión 6 · 20 de octubre de 2026</w:t>
       </w:r>
     </w:p>
     <w:p>
@@ -79,16 +79,22 @@
         <w:rPr>
           <w:lang w:val="es-MX"/>
         </w:rPr>
-        <w:t xml:space="preserve">Fuentes: "Proyecto App_Autenticación y Registro.xlsx" (11 casos), "Proyecto App_Home.xlsx" (14 casos) y "Proyecto App_Cuentas (Inclu. 7x24).xlsx" (13 casos), exportados de Azure DevOps.</w:t>
+        <w:t>Fuentes: "Proyecto App_Autenticación y Registro.xlsx" (11 casos), "Proyecto App_Home.xlsx" (14 casos) y "Proyecto App_Cuentas (Inclu. 7x24).xlsx" (13 casos), exportados de Azure DevOps.</w:t>
       </w:r>
     </w:p>
     <w:p>
       <w:pPr>
         <w:pStyle w:val="Ttulo1"/>
         <w:spacing w:before="280" w:after="120"/>
+        <w:rPr>
+          <w:lang w:val="es-MX"/>
+        </w:rPr>
       </w:pPr>
       <w:r>
-        <w:t xml:space="preserve">2. Cómo funciona la consolidación</w:t>
+        <w:rPr>
+          <w:lang w:val="es-MX"/>
+        </w:rPr>
+        <w:t>2. Cómo funciona la consolidación</w:t>
       </w:r>
     </w:p>
     <w:p>
@@ -109,13 +115,31 @@
           <w:bCs/>
           <w:lang w:val="es-MX"/>
         </w:rPr>
-        <w:t xml:space="preserve">Un escenario, varios IDs: </w:t>
+        <w:t xml:space="preserve">Un escenario, varios </w:t>
+      </w:r>
+      <w:proofErr w:type="spellStart"/>
+      <w:r>
+        <w:rPr>
+          <w:b/>
+          <w:bCs/>
+          <w:lang w:val="es-MX"/>
+        </w:rPr>
+        <w:t>IDs</w:t>
+      </w:r>
+      <w:proofErr w:type="spellEnd"/>
+      <w:r>
+        <w:rPr>
+          <w:b/>
+          <w:bCs/>
+          <w:lang w:val="es-MX"/>
+        </w:rPr>
+        <w:t xml:space="preserve">: </w:t>
       </w:r>
       <w:r>
         <w:rPr>
           <w:lang w:val="es-MX"/>
         </w:rPr>
-        <w:t xml:space="preserve">el escenario Gherkin lleva el tag de cada caso que cubre (por ejemplo @38498 @38502).</w:t>
+        <w:t>el escenario Gherkin lleva el tag de cada caso que cubre (por ejemplo @38498 @38502).</w:t>
       </w:r>
     </w:p>
     <w:p>
@@ -282,7 +306,7 @@
                 <w:sz w:val="19"/>
                 <w:szCs w:val="19"/>
               </w:rPr>
-              <w:t xml:space="preserve">Escenario automatizado</w:t>
+              <w:t>Escenario automatizado</w:t>
             </w:r>
           </w:p>
         </w:tc>
@@ -342,7 +366,7 @@
                 <w:sz w:val="19"/>
                 <w:szCs w:val="19"/>
               </w:rPr>
-              <w:t xml:space="preserve">Casos absorbidos</w:t>
+              <w:t>Casos absorbidos</w:t>
             </w:r>
           </w:p>
         </w:tc>
@@ -372,7 +396,7 @@
                 <w:sz w:val="19"/>
                 <w:szCs w:val="19"/>
               </w:rPr>
-              <w:t xml:space="preserve">Qué varía entre ellos</w:t>
+              <w:t>Qué varía entre ellos</w:t>
             </w:r>
           </w:p>
         </w:tc>
@@ -430,7 +454,7 @@
                 <w:sz w:val="19"/>
                 <w:szCs w:val="19"/>
               </w:rPr>
-              <w:t xml:space="preserve">Registro exitoso</w:t>
+              <w:t>Registro exitoso</w:t>
             </w:r>
           </w:p>
         </w:tc>
@@ -541,14 +565,7 @@
                 <w:szCs w:val="19"/>
                 <w:lang w:val="es-MX"/>
               </w:rPr>
-              <w:t xml:space="preserve">Construido</w:t>
-            </w:r>
-            <w:r>
-              <w:rPr>
-                <w:sz w:val="19"/>
-                <w:szCs w:val="19"/>
-              </w:rPr>
-              <w:t/>
+              <w:t>Construido</w:t>
             </w:r>
           </w:p>
         </w:tc>
@@ -703,7 +720,7 @@
                 <w:szCs w:val="19"/>
                 <w:lang w:val="es-MX"/>
               </w:rPr>
-              <w:t xml:space="preserve">Construido. Requiere un dispositivo real con la línea asociada al cliente</w:t>
+              <w:t>Construido. Requiere un dispositivo real con la línea asociada al cliente</w:t>
             </w:r>
           </w:p>
         </w:tc>
@@ -731,7 +748,23 @@
                 <w:sz w:val="19"/>
                 <w:szCs w:val="19"/>
               </w:rPr>
-              <w:t xml:space="preserve">Login exitoso → Home</w:t>
+              <w:t xml:space="preserve">Login </w:t>
+            </w:r>
+            <w:proofErr w:type="spellStart"/>
+            <w:r>
+              <w:rPr>
+                <w:sz w:val="19"/>
+                <w:szCs w:val="19"/>
+              </w:rPr>
+              <w:t>exitoso</w:t>
+            </w:r>
+            <w:proofErr w:type="spellEnd"/>
+            <w:r>
+              <w:rPr>
+                <w:sz w:val="19"/>
+                <w:szCs w:val="19"/>
+              </w:rPr>
+              <w:t xml:space="preserve"> → Home</w:t>
             </w:r>
           </w:p>
         </w:tc>
@@ -809,7 +842,7 @@
                 <w:sz w:val="19"/>
                 <w:szCs w:val="19"/>
               </w:rPr>
-              <w:t xml:space="preserve">Tipo de documento</w:t>
+              <w:t>Tipo de documento</w:t>
             </w:r>
           </w:p>
         </w:tc>
@@ -864,7 +897,7 @@
                 <w:sz w:val="19"/>
                 <w:szCs w:val="19"/>
               </w:rPr>
-              <w:t xml:space="preserve">Recuperación de clave</w:t>
+              <w:t>Recuperación de clave</w:t>
             </w:r>
           </w:p>
         </w:tc>
@@ -951,9 +984,155 @@
                 <w:szCs w:val="19"/>
                 <w:lang w:val="es-MX"/>
               </w:rPr>
-              <w:t xml:space="preserve">El flujo de 38529 pasa por la validación OTP de 38526; ese </w:t>
+              <w:t>El flujo de 38529 pasa por la validación OTP de 38526; ese punto se verifica dentro del mismo escenario</w:t>
+            </w:r>
+          </w:p>
+        </w:tc>
+        <w:tc>
+          <w:tcPr>
+            <w:tcW w:w="1500" w:type="dxa"/>
+            <w:tcBorders>
+              <w:top w:val="single" w:sz="4" w:space="0" w:color="BFBFBF"/>
+              <w:left w:val="single" w:sz="4" w:space="0" w:color="BFBFBF"/>
+              <w:bottom w:val="single" w:sz="4" w:space="0" w:color="BFBFBF"/>
+              <w:right w:val="single" w:sz="4" w:space="0" w:color="BFBFBF"/>
+            </w:tcBorders>
+            <w:shd w:val="clear" w:color="auto" w:fill="F2F2F2"/>
+            <w:tcMar>
+              <w:top w:w="60" w:type="dxa"/>
+              <w:left w:w="100" w:type="dxa"/>
+              <w:bottom w:w="60" w:type="dxa"/>
+              <w:right w:w="100" w:type="dxa"/>
+            </w:tcMar>
+          </w:tcPr>
+          <w:p>
+            <w:r>
+              <w:rPr>
+                <w:sz w:val="19"/>
+                <w:szCs w:val="19"/>
+              </w:rPr>
+              <w:t>Construido</w:t>
+            </w:r>
+          </w:p>
+        </w:tc>
+      </w:tr>
+      <w:tr>
+        <w:tc>
+          <w:tcPr>
+            <w:tcW w:w="1900" w:type="dxa"/>
+            <w:tcBorders>
+              <w:top w:val="single" w:sz="4" w:space="0" w:color="BFBFBF"/>
+              <w:left w:val="single" w:sz="4" w:space="0" w:color="BFBFBF"/>
+              <w:bottom w:val="single" w:sz="4" w:space="0" w:color="BFBFBF"/>
+              <w:right w:val="single" w:sz="4" w:space="0" w:color="BFBFBF"/>
+            </w:tcBorders>
+            <w:tcMar>
+              <w:top w:w="60" w:type="dxa"/>
+              <w:left w:w="100" w:type="dxa"/>
+              <w:bottom w:w="60" w:type="dxa"/>
+              <w:right w:w="100" w:type="dxa"/>
+            </w:tcMar>
+          </w:tcPr>
+          <w:p>
+            <w:r>
+              <w:rPr>
+                <w:sz w:val="19"/>
+                <w:szCs w:val="19"/>
+              </w:rPr>
+              <w:t>Encabezado del Home</w:t>
+            </w:r>
+          </w:p>
+        </w:tc>
+        <w:tc>
+          <w:tcPr>
+            <w:tcW w:w="1500" w:type="dxa"/>
+            <w:tcBorders>
+              <w:top w:val="single" w:sz="4" w:space="0" w:color="BFBFBF"/>
+              <w:left w:val="single" w:sz="4" w:space="0" w:color="BFBFBF"/>
+              <w:bottom w:val="single" w:sz="4" w:space="0" w:color="BFBFBF"/>
+              <w:right w:val="single" w:sz="4" w:space="0" w:color="BFBFBF"/>
+            </w:tcBorders>
+            <w:tcMar>
+              <w:top w:w="60" w:type="dxa"/>
+              <w:left w:w="100" w:type="dxa"/>
+              <w:bottom w:w="60" w:type="dxa"/>
+              <w:right w:w="100" w:type="dxa"/>
+            </w:tcMar>
+          </w:tcPr>
+          <w:p>
+            <w:r>
+              <w:rPr>
+                <w:sz w:val="19"/>
+                <w:szCs w:val="19"/>
+              </w:rPr>
+              <w:t>38700</w:t>
+            </w:r>
+          </w:p>
+        </w:tc>
+        <w:tc>
+          <w:tcPr>
+            <w:tcW w:w="1900" w:type="dxa"/>
+            <w:tcBorders>
+              <w:top w:val="single" w:sz="4" w:space="0" w:color="BFBFBF"/>
+              <w:left w:val="single" w:sz="4" w:space="0" w:color="BFBFBF"/>
+              <w:bottom w:val="single" w:sz="4" w:space="0" w:color="BFBFBF"/>
+              <w:right w:val="single" w:sz="4" w:space="0" w:color="BFBFBF"/>
+            </w:tcBorders>
+            <w:tcMar>
+              <w:top w:w="60" w:type="dxa"/>
+              <w:left w:w="100" w:type="dxa"/>
+              <w:bottom w:w="60" w:type="dxa"/>
+              <w:right w:w="100" w:type="dxa"/>
+            </w:tcMar>
+          </w:tcPr>
+          <w:p>
+            <w:r>
+              <w:rPr>
+                <w:sz w:val="19"/>
+                <w:szCs w:val="19"/>
+              </w:rPr>
+              <w:t>38699</w:t>
+            </w:r>
+          </w:p>
+        </w:tc>
+        <w:tc>
+          <w:tcPr>
+            <w:tcW w:w="2560" w:type="dxa"/>
+            <w:tcBorders>
+              <w:top w:val="single" w:sz="4" w:space="0" w:color="BFBFBF"/>
+              <w:left w:val="single" w:sz="4" w:space="0" w:color="BFBFBF"/>
+              <w:bottom w:val="single" w:sz="4" w:space="0" w:color="BFBFBF"/>
+              <w:right w:val="single" w:sz="4" w:space="0" w:color="BFBFBF"/>
+            </w:tcBorders>
+            <w:tcMar>
+              <w:top w:w="60" w:type="dxa"/>
+              <w:left w:w="100" w:type="dxa"/>
+              <w:bottom w:w="60" w:type="dxa"/>
+              <w:right w:w="100" w:type="dxa"/>
+            </w:tcMar>
+          </w:tcPr>
+          <w:p>
+            <w:pPr>
+              <w:rPr>
+                <w:lang w:val="es-MX"/>
+              </w:rPr>
+            </w:pPr>
+            <w:r>
+              <w:rPr>
+                <w:sz w:val="19"/>
+                <w:szCs w:val="19"/>
+                <w:lang w:val="es-MX"/>
+              </w:rPr>
+              <w:t xml:space="preserve">Los pasos 1 a 5 de 38700 son los mismos de 38699; 38700 </w:t>
+            </w:r>
+            <w:r>
+              <w:rPr>
+                <w:sz w:val="19"/>
+                <w:szCs w:val="19"/>
+                <w:lang w:val="es-MX"/>
+              </w:rPr>
               <w:lastRenderedPageBreak/>
-              <w:t>punto se verifica dentro del mismo escenario</w:t>
+              <w:t>agrega la fecha de último ingreso</w:t>
             </w:r>
           </w:p>
         </w:tc>
@@ -966,7 +1145,6 @@
               <w:bottom w:val="single" w:sz="4" w:space="0" w:color="BFBFBF"/>
               <w:right w:val="single" w:sz="4" w:space="0" w:color="BFBFBF"/>
             </w:tcBorders>
-            <w:shd w:val="clear" w:color="auto" w:fill="F2F2F2"/>
             <w:tcMar>
               <w:top w:w="60" w:type="dxa"/>
               <w:left w:w="100" w:type="dxa"/>
@@ -996,20 +1174,21 @@
               <w:bottom w:val="single" w:sz="4" w:space="0" w:color="BFBFBF"/>
               <w:right w:val="single" w:sz="4" w:space="0" w:color="BFBFBF"/>
             </w:tcBorders>
-            <w:tcMar>
-              <w:top w:w="60" w:type="dxa"/>
-              <w:left w:w="100" w:type="dxa"/>
-              <w:bottom w:w="60" w:type="dxa"/>
-              <w:right w:w="100" w:type="dxa"/>
-            </w:tcMar>
-          </w:tcPr>
-          <w:p>
-            <w:r>
-              <w:rPr>
-                <w:sz w:val="19"/>
-                <w:szCs w:val="19"/>
-              </w:rPr>
-              <w:t xml:space="preserve">Encabezado del Home</w:t>
+            <w:shd w:val="clear" w:color="auto" w:fill="F2F2F2"/>
+            <w:tcMar>
+              <w:top w:w="60" w:type="dxa"/>
+              <w:left w:w="100" w:type="dxa"/>
+              <w:bottom w:w="60" w:type="dxa"/>
+              <w:right w:w="100" w:type="dxa"/>
+            </w:tcMar>
+          </w:tcPr>
+          <w:p>
+            <w:r>
+              <w:rPr>
+                <w:sz w:val="19"/>
+                <w:szCs w:val="19"/>
+              </w:rPr>
+              <w:t>Accesos directos del Home</w:t>
             </w:r>
           </w:p>
         </w:tc>
@@ -1022,20 +1201,21 @@
               <w:bottom w:val="single" w:sz="4" w:space="0" w:color="BFBFBF"/>
               <w:right w:val="single" w:sz="4" w:space="0" w:color="BFBFBF"/>
             </w:tcBorders>
-            <w:tcMar>
-              <w:top w:w="60" w:type="dxa"/>
-              <w:left w:w="100" w:type="dxa"/>
-              <w:bottom w:w="60" w:type="dxa"/>
-              <w:right w:w="100" w:type="dxa"/>
-            </w:tcMar>
-          </w:tcPr>
-          <w:p>
-            <w:r>
-              <w:rPr>
-                <w:sz w:val="19"/>
-                <w:szCs w:val="19"/>
-              </w:rPr>
-              <w:t>38700</w:t>
+            <w:shd w:val="clear" w:color="auto" w:fill="F2F2F2"/>
+            <w:tcMar>
+              <w:top w:w="60" w:type="dxa"/>
+              <w:left w:w="100" w:type="dxa"/>
+              <w:bottom w:w="60" w:type="dxa"/>
+              <w:right w:w="100" w:type="dxa"/>
+            </w:tcMar>
+          </w:tcPr>
+          <w:p>
+            <w:r>
+              <w:rPr>
+                <w:sz w:val="19"/>
+                <w:szCs w:val="19"/>
+              </w:rPr>
+              <w:t>38703</w:t>
             </w:r>
           </w:p>
         </w:tc>
@@ -1048,20 +1228,30 @@
               <w:bottom w:val="single" w:sz="4" w:space="0" w:color="BFBFBF"/>
               <w:right w:val="single" w:sz="4" w:space="0" w:color="BFBFBF"/>
             </w:tcBorders>
-            <w:tcMar>
-              <w:top w:w="60" w:type="dxa"/>
-              <w:left w:w="100" w:type="dxa"/>
-              <w:bottom w:w="60" w:type="dxa"/>
-              <w:right w:w="100" w:type="dxa"/>
-            </w:tcMar>
-          </w:tcPr>
-          <w:p>
-            <w:r>
-              <w:rPr>
-                <w:sz w:val="19"/>
-                <w:szCs w:val="19"/>
-              </w:rPr>
-              <w:t>38699</w:t>
+            <w:shd w:val="clear" w:color="auto" w:fill="F2F2F2"/>
+            <w:tcMar>
+              <w:top w:w="60" w:type="dxa"/>
+              <w:left w:w="100" w:type="dxa"/>
+              <w:bottom w:w="60" w:type="dxa"/>
+              <w:right w:w="100" w:type="dxa"/>
+            </w:tcMar>
+          </w:tcPr>
+          <w:p>
+            <w:r>
+              <w:rPr>
+                <w:sz w:val="19"/>
+                <w:szCs w:val="19"/>
+              </w:rPr>
+              <w:t>38704</w:t>
+            </w:r>
+          </w:p>
+          <w:p>
+            <w:r>
+              <w:rPr>
+                <w:sz w:val="19"/>
+                <w:szCs w:val="19"/>
+              </w:rPr>
+              <w:t>38711</w:t>
             </w:r>
           </w:p>
         </w:tc>
@@ -1074,26 +1264,27 @@
               <w:bottom w:val="single" w:sz="4" w:space="0" w:color="BFBFBF"/>
               <w:right w:val="single" w:sz="4" w:space="0" w:color="BFBFBF"/>
             </w:tcBorders>
-            <w:tcMar>
-              <w:top w:w="60" w:type="dxa"/>
-              <w:left w:w="100" w:type="dxa"/>
-              <w:bottom w:w="60" w:type="dxa"/>
-              <w:right w:w="100" w:type="dxa"/>
-            </w:tcMar>
-          </w:tcPr>
-          <w:p>
-            <w:pPr>
-              <w:rPr>
-                <w:lang w:val="es-MX"/>
-              </w:rPr>
-            </w:pPr>
-            <w:r>
-              <w:rPr>
-                <w:sz w:val="19"/>
-                <w:szCs w:val="19"/>
-                <w:lang w:val="es-MX"/>
-              </w:rPr>
-              <w:t>Los pasos 1 a 5 de 38700 son los mismos de 38699; 38700 agrega la fecha de último ingreso</w:t>
+            <w:shd w:val="clear" w:color="auto" w:fill="F2F2F2"/>
+            <w:tcMar>
+              <w:top w:w="60" w:type="dxa"/>
+              <w:left w:w="100" w:type="dxa"/>
+              <w:bottom w:w="60" w:type="dxa"/>
+              <w:right w:w="100" w:type="dxa"/>
+            </w:tcMar>
+          </w:tcPr>
+          <w:p>
+            <w:pPr>
+              <w:rPr>
+                <w:lang w:val="es-MX"/>
+              </w:rPr>
+            </w:pPr>
+            <w:r>
+              <w:rPr>
+                <w:sz w:val="19"/>
+                <w:szCs w:val="19"/>
+                <w:lang w:val="es-MX"/>
+              </w:rPr>
+              <w:t>Acceso a validar (Bre-B, Pedir crédito) y menú (superior o inferior)</w:t>
             </w:r>
           </w:p>
         </w:tc>
@@ -1106,6 +1297,7 @@
               <w:bottom w:val="single" w:sz="4" w:space="0" w:color="BFBFBF"/>
               <w:right w:val="single" w:sz="4" w:space="0" w:color="BFBFBF"/>
             </w:tcBorders>
+            <w:shd w:val="clear" w:color="auto" w:fill="F2F2F2"/>
             <w:tcMar>
               <w:top w:w="60" w:type="dxa"/>
               <w:left w:w="100" w:type="dxa"/>
@@ -1134,21 +1326,20 @@
               <w:bottom w:val="single" w:sz="4" w:space="0" w:color="BFBFBF"/>
               <w:right w:val="single" w:sz="4" w:space="0" w:color="BFBFBF"/>
             </w:tcBorders>
-            <w:shd w:val="clear" w:color="auto" w:fill="F2F2F2"/>
-            <w:tcMar>
-              <w:top w:w="60" w:type="dxa"/>
-              <w:left w:w="100" w:type="dxa"/>
-              <w:bottom w:w="60" w:type="dxa"/>
-              <w:right w:w="100" w:type="dxa"/>
-            </w:tcMar>
-          </w:tcPr>
-          <w:p>
-            <w:r>
-              <w:rPr>
-                <w:sz w:val="19"/>
-                <w:szCs w:val="19"/>
-              </w:rPr>
-              <w:t xml:space="preserve">Accesos directos del Home</w:t>
+            <w:tcMar>
+              <w:top w:w="60" w:type="dxa"/>
+              <w:left w:w="100" w:type="dxa"/>
+              <w:bottom w:w="60" w:type="dxa"/>
+              <w:right w:w="100" w:type="dxa"/>
+            </w:tcMar>
+          </w:tcPr>
+          <w:p>
+            <w:r>
+              <w:rPr>
+                <w:sz w:val="19"/>
+                <w:szCs w:val="19"/>
+              </w:rPr>
+              <w:t>Productos del cliente</w:t>
             </w:r>
           </w:p>
         </w:tc>
@@ -1161,21 +1352,20 @@
               <w:bottom w:val="single" w:sz="4" w:space="0" w:color="BFBFBF"/>
               <w:right w:val="single" w:sz="4" w:space="0" w:color="BFBFBF"/>
             </w:tcBorders>
-            <w:shd w:val="clear" w:color="auto" w:fill="F2F2F2"/>
-            <w:tcMar>
-              <w:top w:w="60" w:type="dxa"/>
-              <w:left w:w="100" w:type="dxa"/>
-              <w:bottom w:w="60" w:type="dxa"/>
-              <w:right w:w="100" w:type="dxa"/>
-            </w:tcMar>
-          </w:tcPr>
-          <w:p>
-            <w:r>
-              <w:rPr>
-                <w:sz w:val="19"/>
-                <w:szCs w:val="19"/>
-              </w:rPr>
-              <w:t>38703</w:t>
+            <w:tcMar>
+              <w:top w:w="60" w:type="dxa"/>
+              <w:left w:w="100" w:type="dxa"/>
+              <w:bottom w:w="60" w:type="dxa"/>
+              <w:right w:w="100" w:type="dxa"/>
+            </w:tcMar>
+          </w:tcPr>
+          <w:p>
+            <w:r>
+              <w:rPr>
+                <w:sz w:val="19"/>
+                <w:szCs w:val="19"/>
+              </w:rPr>
+              <w:t>38705 (ahorro)</w:t>
             </w:r>
           </w:p>
         </w:tc>
@@ -1188,30 +1378,103 @@
               <w:bottom w:val="single" w:sz="4" w:space="0" w:color="BFBFBF"/>
               <w:right w:val="single" w:sz="4" w:space="0" w:color="BFBFBF"/>
             </w:tcBorders>
-            <w:shd w:val="clear" w:color="auto" w:fill="F2F2F2"/>
-            <w:tcMar>
-              <w:top w:w="60" w:type="dxa"/>
-              <w:left w:w="100" w:type="dxa"/>
-              <w:bottom w:w="60" w:type="dxa"/>
-              <w:right w:w="100" w:type="dxa"/>
-            </w:tcMar>
-          </w:tcPr>
-          <w:p>
-            <w:r>
-              <w:rPr>
-                <w:sz w:val="19"/>
-                <w:szCs w:val="19"/>
-              </w:rPr>
-              <w:t>38704</w:t>
-            </w:r>
-          </w:p>
-          <w:p>
-            <w:r>
-              <w:rPr>
-                <w:sz w:val="19"/>
-                <w:szCs w:val="19"/>
-              </w:rPr>
-              <w:t>38711</w:t>
+            <w:tcMar>
+              <w:top w:w="60" w:type="dxa"/>
+              <w:left w:w="100" w:type="dxa"/>
+              <w:bottom w:w="60" w:type="dxa"/>
+              <w:right w:w="100" w:type="dxa"/>
+            </w:tcMar>
+          </w:tcPr>
+          <w:p>
+            <w:pPr>
+              <w:rPr>
+                <w:sz w:val="19"/>
+                <w:szCs w:val="19"/>
+                <w:lang w:val="es-MX"/>
+              </w:rPr>
+            </w:pPr>
+            <w:r>
+              <w:rPr>
+                <w:sz w:val="19"/>
+                <w:szCs w:val="19"/>
+                <w:lang w:val="es-MX"/>
+              </w:rPr>
+              <w:t>38706 (corriente)</w:t>
+            </w:r>
+          </w:p>
+          <w:p>
+            <w:pPr>
+              <w:rPr>
+                <w:sz w:val="19"/>
+                <w:szCs w:val="19"/>
+                <w:lang w:val="es-MX"/>
+              </w:rPr>
+            </w:pPr>
+            <w:r>
+              <w:rPr>
+                <w:sz w:val="19"/>
+                <w:szCs w:val="19"/>
+                <w:lang w:val="es-MX"/>
+              </w:rPr>
+              <w:t>38707 (libre inversión)</w:t>
+            </w:r>
+          </w:p>
+          <w:p>
+            <w:pPr>
+              <w:rPr>
+                <w:sz w:val="19"/>
+                <w:szCs w:val="19"/>
+                <w:lang w:val="es-MX"/>
+              </w:rPr>
+            </w:pPr>
+            <w:r>
+              <w:rPr>
+                <w:sz w:val="19"/>
+                <w:szCs w:val="19"/>
+                <w:lang w:val="es-MX"/>
+              </w:rPr>
+              <w:t>38708 (rotativo)</w:t>
+            </w:r>
+          </w:p>
+          <w:p>
+            <w:pPr>
+              <w:rPr>
+                <w:sz w:val="19"/>
+                <w:szCs w:val="19"/>
+                <w:lang w:val="es-MX"/>
+              </w:rPr>
+            </w:pPr>
+            <w:r>
+              <w:rPr>
+                <w:sz w:val="19"/>
+                <w:szCs w:val="19"/>
+                <w:lang w:val="es-MX"/>
+              </w:rPr>
+              <w:t>38702 (pre aprobado)</w:t>
+            </w:r>
+          </w:p>
+          <w:p>
+            <w:pPr>
+              <w:rPr>
+                <w:sz w:val="19"/>
+                <w:szCs w:val="19"/>
+              </w:rPr>
+            </w:pPr>
+            <w:r>
+              <w:rPr>
+                <w:sz w:val="19"/>
+                <w:szCs w:val="19"/>
+              </w:rPr>
+              <w:t>38709 (saldos)</w:t>
+            </w:r>
+          </w:p>
+          <w:p>
+            <w:r>
+              <w:rPr>
+                <w:sz w:val="19"/>
+                <w:szCs w:val="19"/>
+              </w:rPr>
+              <w:t>39561 a 39565 (Cuentas)</w:t>
             </w:r>
           </w:p>
         </w:tc>
@@ -1224,27 +1487,21 @@
               <w:bottom w:val="single" w:sz="4" w:space="0" w:color="BFBFBF"/>
               <w:right w:val="single" w:sz="4" w:space="0" w:color="BFBFBF"/>
             </w:tcBorders>
-            <w:shd w:val="clear" w:color="auto" w:fill="F2F2F2"/>
-            <w:tcMar>
-              <w:top w:w="60" w:type="dxa"/>
-              <w:left w:w="100" w:type="dxa"/>
-              <w:bottom w:w="60" w:type="dxa"/>
-              <w:right w:w="100" w:type="dxa"/>
-            </w:tcMar>
-          </w:tcPr>
-          <w:p>
-            <w:pPr>
-              <w:rPr>
-                <w:lang w:val="es-MX"/>
-              </w:rPr>
-            </w:pPr>
-            <w:r>
-              <w:rPr>
-                <w:sz w:val="19"/>
-                <w:szCs w:val="19"/>
-                <w:lang w:val="es-MX"/>
-              </w:rPr>
-              <w:t>Acceso a validar (Bre-B, Pedir crédito) y menú (superior o inferior)</w:t>
+            <w:tcMar>
+              <w:top w:w="60" w:type="dxa"/>
+              <w:left w:w="100" w:type="dxa"/>
+              <w:bottom w:w="60" w:type="dxa"/>
+              <w:right w:w="100" w:type="dxa"/>
+            </w:tcMar>
+          </w:tcPr>
+          <w:p>
+            <w:r>
+              <w:rPr>
+                <w:sz w:val="19"/>
+                <w:szCs w:val="19"/>
+                <w:lang w:val="es-MX"/>
+              </w:rPr>
+              <w:t>Tipo de producto; requiere un cliente que tenga ese producto. 38709 valida los saldos de esas mismas tarjetas. 39561 a 39565 son duplicados de 38705 a 38709</w:t>
             </w:r>
           </w:p>
         </w:tc>
@@ -1257,21 +1514,26 @@
               <w:bottom w:val="single" w:sz="4" w:space="0" w:color="BFBFBF"/>
               <w:right w:val="single" w:sz="4" w:space="0" w:color="BFBFBF"/>
             </w:tcBorders>
-            <w:shd w:val="clear" w:color="auto" w:fill="F2F2F2"/>
-            <w:tcMar>
-              <w:top w:w="60" w:type="dxa"/>
-              <w:left w:w="100" w:type="dxa"/>
-              <w:bottom w:w="60" w:type="dxa"/>
-              <w:right w:w="100" w:type="dxa"/>
-            </w:tcMar>
-          </w:tcPr>
-          <w:p>
-            <w:r>
-              <w:rPr>
-                <w:sz w:val="19"/>
-                <w:szCs w:val="19"/>
-              </w:rPr>
-              <w:t>Construido</w:t>
+            <w:tcMar>
+              <w:top w:w="60" w:type="dxa"/>
+              <w:left w:w="100" w:type="dxa"/>
+              <w:bottom w:w="60" w:type="dxa"/>
+              <w:right w:w="100" w:type="dxa"/>
+            </w:tcMar>
+          </w:tcPr>
+          <w:p>
+            <w:pPr>
+              <w:rPr>
+                <w:lang w:val="es-MX"/>
+              </w:rPr>
+            </w:pPr>
+            <w:r>
+              <w:rPr>
+                <w:sz w:val="19"/>
+                <w:szCs w:val="19"/>
+                <w:lang w:val="es-MX"/>
+              </w:rPr>
+              <w:t>Construido. El saldo esperado de 38709 y 39565 se informa en la columna Monto del control</w:t>
             </w:r>
           </w:p>
         </w:tc>
@@ -1286,20 +1548,53 @@
               <w:bottom w:val="single" w:sz="4" w:space="0" w:color="BFBFBF"/>
               <w:right w:val="single" w:sz="4" w:space="0" w:color="BFBFBF"/>
             </w:tcBorders>
-            <w:tcMar>
-              <w:top w:w="60" w:type="dxa"/>
-              <w:left w:w="100" w:type="dxa"/>
-              <w:bottom w:w="60" w:type="dxa"/>
-              <w:right w:w="100" w:type="dxa"/>
-            </w:tcMar>
-          </w:tcPr>
-          <w:p>
-            <w:r>
-              <w:rPr>
-                <w:sz w:val="19"/>
-                <w:szCs w:val="19"/>
-              </w:rPr>
-              <w:t xml:space="preserve">Productos del cliente</w:t>
+            <w:shd w:val="clear" w:color="auto" w:fill="F2F2F2"/>
+            <w:tcMar>
+              <w:top w:w="60" w:type="dxa"/>
+              <w:left w:w="100" w:type="dxa"/>
+              <w:bottom w:w="60" w:type="dxa"/>
+              <w:right w:w="100" w:type="dxa"/>
+            </w:tcMar>
+          </w:tcPr>
+          <w:p>
+            <w:r>
+              <w:rPr>
+                <w:sz w:val="19"/>
+                <w:szCs w:val="19"/>
+              </w:rPr>
+              <w:t>Banner "</w:t>
+            </w:r>
+            <w:proofErr w:type="spellStart"/>
+            <w:r>
+              <w:rPr>
+                <w:sz w:val="19"/>
+                <w:szCs w:val="19"/>
+              </w:rPr>
+              <w:t>Exclusivo</w:t>
+            </w:r>
+            <w:proofErr w:type="spellEnd"/>
+            <w:r>
+              <w:rPr>
+                <w:sz w:val="19"/>
+                <w:szCs w:val="19"/>
+              </w:rPr>
+              <w:t xml:space="preserve"> para </w:t>
+            </w:r>
+            <w:proofErr w:type="spellStart"/>
+            <w:r>
+              <w:rPr>
+                <w:sz w:val="19"/>
+                <w:szCs w:val="19"/>
+              </w:rPr>
+              <w:t>ti</w:t>
+            </w:r>
+            <w:proofErr w:type="spellEnd"/>
+            <w:r>
+              <w:rPr>
+                <w:sz w:val="19"/>
+                <w:szCs w:val="19"/>
+              </w:rPr>
+              <w:t>"</w:t>
             </w:r>
           </w:p>
         </w:tc>
@@ -1312,20 +1607,21 @@
               <w:bottom w:val="single" w:sz="4" w:space="0" w:color="BFBFBF"/>
               <w:right w:val="single" w:sz="4" w:space="0" w:color="BFBFBF"/>
             </w:tcBorders>
-            <w:tcMar>
-              <w:top w:w="60" w:type="dxa"/>
-              <w:left w:w="100" w:type="dxa"/>
-              <w:bottom w:w="60" w:type="dxa"/>
-              <w:right w:w="100" w:type="dxa"/>
-            </w:tcMar>
-          </w:tcPr>
-          <w:p>
-            <w:r>
-              <w:rPr>
-                <w:sz w:val="19"/>
-                <w:szCs w:val="19"/>
-              </w:rPr>
-              <w:t>38705 (ahorro)</w:t>
+            <w:shd w:val="clear" w:color="auto" w:fill="F2F2F2"/>
+            <w:tcMar>
+              <w:top w:w="60" w:type="dxa"/>
+              <w:left w:w="100" w:type="dxa"/>
+              <w:bottom w:w="60" w:type="dxa"/>
+              <w:right w:w="100" w:type="dxa"/>
+            </w:tcMar>
+          </w:tcPr>
+          <w:p>
+            <w:r>
+              <w:rPr>
+                <w:sz w:val="19"/>
+                <w:szCs w:val="19"/>
+              </w:rPr>
+              <w:t>38710</w:t>
             </w:r>
           </w:p>
         </w:tc>
@@ -1338,103 +1634,21 @@
               <w:bottom w:val="single" w:sz="4" w:space="0" w:color="BFBFBF"/>
               <w:right w:val="single" w:sz="4" w:space="0" w:color="BFBFBF"/>
             </w:tcBorders>
-            <w:tcMar>
-              <w:top w:w="60" w:type="dxa"/>
-              <w:left w:w="100" w:type="dxa"/>
-              <w:bottom w:w="60" w:type="dxa"/>
-              <w:right w:w="100" w:type="dxa"/>
-            </w:tcMar>
-          </w:tcPr>
-          <w:p>
-            <w:pPr>
-              <w:rPr>
-                <w:sz w:val="19"/>
-                <w:szCs w:val="19"/>
-                <w:lang w:val="es-MX"/>
-              </w:rPr>
-            </w:pPr>
-            <w:r>
-              <w:rPr>
-                <w:sz w:val="19"/>
-                <w:szCs w:val="19"/>
-                <w:lang w:val="es-MX"/>
-              </w:rPr>
-              <w:t>38706 (corriente)</w:t>
-            </w:r>
-          </w:p>
-          <w:p>
-            <w:pPr>
-              <w:rPr>
-                <w:sz w:val="19"/>
-                <w:szCs w:val="19"/>
-                <w:lang w:val="es-MX"/>
-              </w:rPr>
-            </w:pPr>
-            <w:r>
-              <w:rPr>
-                <w:sz w:val="19"/>
-                <w:szCs w:val="19"/>
-                <w:lang w:val="es-MX"/>
-              </w:rPr>
-              <w:t>38707 (libre inversión)</w:t>
-            </w:r>
-          </w:p>
-          <w:p>
-            <w:pPr>
-              <w:rPr>
-                <w:sz w:val="19"/>
-                <w:szCs w:val="19"/>
-                <w:lang w:val="es-MX"/>
-              </w:rPr>
-            </w:pPr>
-            <w:r>
-              <w:rPr>
-                <w:sz w:val="19"/>
-                <w:szCs w:val="19"/>
-                <w:lang w:val="es-MX"/>
-              </w:rPr>
-              <w:t>38708 (rotativo)</w:t>
-            </w:r>
-          </w:p>
-          <w:p>
-            <w:pPr>
-              <w:rPr>
-                <w:sz w:val="19"/>
-                <w:szCs w:val="19"/>
-                <w:lang w:val="es-MX"/>
-              </w:rPr>
-            </w:pPr>
-            <w:r>
-              <w:rPr>
-                <w:sz w:val="19"/>
-                <w:szCs w:val="19"/>
-                <w:lang w:val="es-MX"/>
-              </w:rPr>
-              <w:t>38702 (pre aprobado)</w:t>
-            </w:r>
-          </w:p>
-          <w:p>
-            <w:pPr>
-              <w:rPr>
-                <w:sz w:val="19"/>
-                <w:szCs w:val="19"/>
-              </w:rPr>
-            </w:pPr>
-            <w:r>
-              <w:rPr>
-                <w:sz w:val="19"/>
-                <w:szCs w:val="19"/>
-              </w:rPr>
-              <w:t>38709 (saldos)</w:t>
-            </w:r>
-          </w:p>
-          <w:p>
-            <w:r>
-              <w:rPr>
-                <w:sz w:val="19"/>
-                <w:szCs w:val="19"/>
-              </w:rPr>
-              <w:t>39561 a 39565 (Cuentas)</w:t>
+            <w:shd w:val="clear" w:color="auto" w:fill="F2F2F2"/>
+            <w:tcMar>
+              <w:top w:w="60" w:type="dxa"/>
+              <w:left w:w="100" w:type="dxa"/>
+              <w:bottom w:w="60" w:type="dxa"/>
+              <w:right w:w="100" w:type="dxa"/>
+            </w:tcMar>
+          </w:tcPr>
+          <w:p>
+            <w:r>
+              <w:rPr>
+                <w:sz w:val="19"/>
+                <w:szCs w:val="19"/>
+              </w:rPr>
+              <w:t>—</w:t>
             </w:r>
           </w:p>
         </w:tc>
@@ -1447,28 +1661,21 @@
               <w:bottom w:val="single" w:sz="4" w:space="0" w:color="BFBFBF"/>
               <w:right w:val="single" w:sz="4" w:space="0" w:color="BFBFBF"/>
             </w:tcBorders>
-            <w:tcMar>
-              <w:top w:w="60" w:type="dxa"/>
-              <w:left w:w="100" w:type="dxa"/>
-              <w:bottom w:w="60" w:type="dxa"/>
-              <w:right w:w="100" w:type="dxa"/>
-            </w:tcMar>
-          </w:tcPr>
-          <w:p>
-            <w:r>
-              <w:rPr>
-                <w:sz w:val="19"/>
-                <w:szCs w:val="19"/>
-                <w:lang w:val="es-MX"/>
-              </w:rPr>
-              <w:t xml:space="preserve">Tipo de producto; requiere un cliente que tenga ese producto. 38709 valida los saldos de esas mismas tarjetas. 39561 a 39565 son duplicados de 38705 a 38709</w:t>
-            </w:r>
-            <w:r>
-              <w:rPr>
-                <w:sz w:val="19"/>
-                <w:szCs w:val="19"/>
-              </w:rPr>
-              <w:t/>
+            <w:shd w:val="clear" w:color="auto" w:fill="F2F2F2"/>
+            <w:tcMar>
+              <w:top w:w="60" w:type="dxa"/>
+              <w:left w:w="100" w:type="dxa"/>
+              <w:bottom w:w="60" w:type="dxa"/>
+              <w:right w:w="100" w:type="dxa"/>
+            </w:tcMar>
+          </w:tcPr>
+          <w:p>
+            <w:r>
+              <w:rPr>
+                <w:sz w:val="19"/>
+                <w:szCs w:val="19"/>
+              </w:rPr>
+              <w:t>—</w:t>
             </w:r>
           </w:p>
         </w:tc>
@@ -1481,26 +1688,27 @@
               <w:bottom w:val="single" w:sz="4" w:space="0" w:color="BFBFBF"/>
               <w:right w:val="single" w:sz="4" w:space="0" w:color="BFBFBF"/>
             </w:tcBorders>
-            <w:tcMar>
-              <w:top w:w="60" w:type="dxa"/>
-              <w:left w:w="100" w:type="dxa"/>
-              <w:bottom w:w="60" w:type="dxa"/>
-              <w:right w:w="100" w:type="dxa"/>
-            </w:tcMar>
-          </w:tcPr>
-          <w:p>
-            <w:pPr>
-              <w:rPr>
-                <w:lang w:val="es-MX"/>
-              </w:rPr>
-            </w:pPr>
-            <w:r>
-              <w:rPr>
-                <w:sz w:val="19"/>
-                <w:szCs w:val="19"/>
-                <w:lang w:val="es-MX"/>
-              </w:rPr>
-              <w:t xml:space="preserve">Construido. El saldo esperado de 38709 y 39565 se informa en la columna Monto del control</w:t>
+            <w:shd w:val="clear" w:color="auto" w:fill="F2F2F2"/>
+            <w:tcMar>
+              <w:top w:w="60" w:type="dxa"/>
+              <w:left w:w="100" w:type="dxa"/>
+              <w:bottom w:w="60" w:type="dxa"/>
+              <w:right w:w="100" w:type="dxa"/>
+            </w:tcMar>
+          </w:tcPr>
+          <w:p>
+            <w:pPr>
+              <w:rPr>
+                <w:lang w:val="es-MX"/>
+              </w:rPr>
+            </w:pPr>
+            <w:r>
+              <w:rPr>
+                <w:sz w:val="19"/>
+                <w:szCs w:val="19"/>
+                <w:lang w:val="es-MX"/>
+              </w:rPr>
+              <w:t>Construido. Con una sola campaña, el deslizamiento queda como observación</w:t>
             </w:r>
           </w:p>
         </w:tc>
@@ -1515,21 +1723,36 @@
               <w:bottom w:val="single" w:sz="4" w:space="0" w:color="BFBFBF"/>
               <w:right w:val="single" w:sz="4" w:space="0" w:color="BFBFBF"/>
             </w:tcBorders>
-            <w:shd w:val="clear" w:color="auto" w:fill="F2F2F2"/>
-            <w:tcMar>
-              <w:top w:w="60" w:type="dxa"/>
-              <w:left w:w="100" w:type="dxa"/>
-              <w:bottom w:w="60" w:type="dxa"/>
-              <w:right w:w="100" w:type="dxa"/>
-            </w:tcMar>
-          </w:tcPr>
-          <w:p>
-            <w:r>
-              <w:rPr>
-                <w:sz w:val="19"/>
-                <w:szCs w:val="19"/>
-              </w:rPr>
-              <w:t xml:space="preserve">Banner "Exclusivo para ti"</w:t>
+            <w:tcMar>
+              <w:top w:w="60" w:type="dxa"/>
+              <w:left w:w="100" w:type="dxa"/>
+              <w:bottom w:w="60" w:type="dxa"/>
+              <w:right w:w="100" w:type="dxa"/>
+            </w:tcMar>
+          </w:tcPr>
+          <w:p>
+            <w:pPr>
+              <w:rPr>
+                <w:lang w:val="es-MX"/>
+              </w:rPr>
+            </w:pPr>
+            <w:proofErr w:type="spellStart"/>
+            <w:r>
+              <w:rPr>
+                <w:sz w:val="19"/>
+                <w:szCs w:val="19"/>
+                <w:lang w:val="es-MX"/>
+              </w:rPr>
+              <w:t>Skeleton</w:t>
+            </w:r>
+            <w:proofErr w:type="spellEnd"/>
+            <w:r>
+              <w:rPr>
+                <w:sz w:val="19"/>
+                <w:szCs w:val="19"/>
+                <w:lang w:val="es-MX"/>
+              </w:rPr>
+              <w:t xml:space="preserve"> de carga del Home</w:t>
             </w:r>
           </w:p>
         </w:tc>
@@ -1542,21 +1765,20 @@
               <w:bottom w:val="single" w:sz="4" w:space="0" w:color="BFBFBF"/>
               <w:right w:val="single" w:sz="4" w:space="0" w:color="BFBFBF"/>
             </w:tcBorders>
-            <w:shd w:val="clear" w:color="auto" w:fill="F2F2F2"/>
-            <w:tcMar>
-              <w:top w:w="60" w:type="dxa"/>
-              <w:left w:w="100" w:type="dxa"/>
-              <w:bottom w:w="60" w:type="dxa"/>
-              <w:right w:w="100" w:type="dxa"/>
-            </w:tcMar>
-          </w:tcPr>
-          <w:p>
-            <w:r>
-              <w:rPr>
-                <w:sz w:val="19"/>
-                <w:szCs w:val="19"/>
-              </w:rPr>
-              <w:t>38710</w:t>
+            <w:tcMar>
+              <w:top w:w="60" w:type="dxa"/>
+              <w:left w:w="100" w:type="dxa"/>
+              <w:bottom w:w="60" w:type="dxa"/>
+              <w:right w:w="100" w:type="dxa"/>
+            </w:tcMar>
+          </w:tcPr>
+          <w:p>
+            <w:r>
+              <w:rPr>
+                <w:sz w:val="19"/>
+                <w:szCs w:val="19"/>
+              </w:rPr>
+              <w:t>38698</w:t>
             </w:r>
           </w:p>
         </w:tc>
@@ -1569,7 +1791,6 @@
               <w:bottom w:val="single" w:sz="4" w:space="0" w:color="BFBFBF"/>
               <w:right w:val="single" w:sz="4" w:space="0" w:color="BFBFBF"/>
             </w:tcBorders>
-            <w:shd w:val="clear" w:color="auto" w:fill="F2F2F2"/>
             <w:tcMar>
               <w:top w:w="60" w:type="dxa"/>
               <w:left w:w="100" w:type="dxa"/>
@@ -1596,7 +1817,6 @@
               <w:bottom w:val="single" w:sz="4" w:space="0" w:color="BFBFBF"/>
               <w:right w:val="single" w:sz="4" w:space="0" w:color="BFBFBF"/>
             </w:tcBorders>
-            <w:shd w:val="clear" w:color="auto" w:fill="F2F2F2"/>
             <w:tcMar>
               <w:top w:w="60" w:type="dxa"/>
               <w:left w:w="100" w:type="dxa"/>
@@ -1623,27 +1843,26 @@
               <w:bottom w:val="single" w:sz="4" w:space="0" w:color="BFBFBF"/>
               <w:right w:val="single" w:sz="4" w:space="0" w:color="BFBFBF"/>
             </w:tcBorders>
-            <w:shd w:val="clear" w:color="auto" w:fill="F2F2F2"/>
-            <w:tcMar>
-              <w:top w:w="60" w:type="dxa"/>
-              <w:left w:w="100" w:type="dxa"/>
-              <w:bottom w:w="60" w:type="dxa"/>
-              <w:right w:w="100" w:type="dxa"/>
-            </w:tcMar>
-          </w:tcPr>
-          <w:p>
-            <w:pPr>
-              <w:rPr>
-                <w:lang w:val="es-MX"/>
-              </w:rPr>
-            </w:pPr>
-            <w:r>
-              <w:rPr>
-                <w:sz w:val="19"/>
-                <w:szCs w:val="19"/>
-                <w:lang w:val="es-MX"/>
-              </w:rPr>
-              <w:t xml:space="preserve">Construido. Con una sola campaña, el deslizamiento queda como observación</w:t>
+            <w:tcMar>
+              <w:top w:w="60" w:type="dxa"/>
+              <w:left w:w="100" w:type="dxa"/>
+              <w:bottom w:w="60" w:type="dxa"/>
+              <w:right w:w="100" w:type="dxa"/>
+            </w:tcMar>
+          </w:tcPr>
+          <w:p>
+            <w:pPr>
+              <w:rPr>
+                <w:lang w:val="es-MX"/>
+              </w:rPr>
+            </w:pPr>
+            <w:r>
+              <w:rPr>
+                <w:sz w:val="19"/>
+                <w:szCs w:val="19"/>
+                <w:lang w:val="es-MX"/>
+              </w:rPr>
+              <w:t>Construido. El skeleton se lee desde la página (DevTools del WebView); si el backend responde muy rápido puede no alcanzar a verse</w:t>
             </w:r>
           </w:p>
         </w:tc>
@@ -1668,17 +1887,35 @@
           <w:p>
             <w:pPr>
               <w:rPr>
-                <w:lang w:val="es-MX"/>
-              </w:rPr>
-            </w:pPr>
-            <w:r>
-              <w:rPr>
-                <w:sz w:val="19"/>
-                <w:szCs w:val="19"/>
-                <w:lang w:val="es-MX"/>
-              </w:rPr>
-              <w:t xml:space="preserve">Skeleton de carga del Home</w:t>
-            </w:r>
+                <w:sz w:val="19"/>
+                <w:szCs w:val="19"/>
+              </w:rPr>
+            </w:pPr>
+            <w:proofErr w:type="spellStart"/>
+            <w:r>
+              <w:rPr>
+                <w:sz w:val="19"/>
+                <w:szCs w:val="19"/>
+              </w:rPr>
+              <w:t>Detalle</w:t>
+            </w:r>
+            <w:proofErr w:type="spellEnd"/>
+            <w:r>
+              <w:rPr>
+                <w:sz w:val="19"/>
+                <w:szCs w:val="19"/>
+              </w:rPr>
+              <w:t xml:space="preserve"> de </w:t>
+            </w:r>
+            <w:proofErr w:type="spellStart"/>
+            <w:r>
+              <w:rPr>
+                <w:sz w:val="19"/>
+                <w:szCs w:val="19"/>
+              </w:rPr>
+              <w:t>cuenta</w:t>
+            </w:r>
+            <w:proofErr w:type="spellEnd"/>
           </w:p>
         </w:tc>
         <w:tc>
@@ -1698,12 +1935,18 @@
             </w:tcMar>
           </w:tcPr>
           <w:p>
-            <w:r>
-              <w:rPr>
-                <w:sz w:val="19"/>
-                <w:szCs w:val="19"/>
-              </w:rPr>
-              <w:t>38698</w:t>
+            <w:pPr>
+              <w:rPr>
+                <w:sz w:val="19"/>
+                <w:szCs w:val="19"/>
+              </w:rPr>
+            </w:pPr>
+            <w:r>
+              <w:rPr>
+                <w:sz w:val="19"/>
+                <w:szCs w:val="19"/>
+              </w:rPr>
+              <w:t>39566</w:t>
             </w:r>
           </w:p>
         </w:tc>
@@ -1724,6 +1967,12 @@
             </w:tcMar>
           </w:tcPr>
           <w:p>
+            <w:pPr>
+              <w:rPr>
+                <w:sz w:val="19"/>
+                <w:szCs w:val="19"/>
+              </w:rPr>
+            </w:pPr>
             <w:r>
               <w:rPr>
                 <w:sz w:val="19"/>
@@ -1750,6 +1999,12 @@
             </w:tcMar>
           </w:tcPr>
           <w:p>
+            <w:pPr>
+              <w:rPr>
+                <w:sz w:val="19"/>
+                <w:szCs w:val="19"/>
+              </w:rPr>
+            </w:pPr>
             <w:r>
               <w:rPr>
                 <w:sz w:val="19"/>
@@ -1778,16 +2033,18 @@
           <w:p>
             <w:pPr>
               <w:rPr>
-                <w:lang w:val="es-MX"/>
-              </w:rPr>
-            </w:pPr>
-            <w:r>
-              <w:rPr>
-                <w:sz w:val="19"/>
-                <w:szCs w:val="19"/>
-                <w:lang w:val="es-MX"/>
-              </w:rPr>
-              <w:t xml:space="preserve">Construido. El skeleton se lee desde la página (DevTools del WebView); si el backend responde muy rápido puede no alcanzar a verse</w:t>
+                <w:sz w:val="19"/>
+                <w:szCs w:val="19"/>
+                <w:lang w:val="es-MX"/>
+              </w:rPr>
+            </w:pPr>
+            <w:r>
+              <w:rPr>
+                <w:sz w:val="19"/>
+                <w:szCs w:val="19"/>
+                <w:lang w:val="es-MX"/>
+              </w:rPr>
+              <w:t>Construido. Valida la lista de movimientos o el aviso de que no hay movimientos</w:t>
             </w:r>
           </w:p>
         </w:tc>
@@ -1814,14 +2071,16 @@
               <w:rPr>
                 <w:sz w:val="19"/>
                 <w:szCs w:val="19"/>
-              </w:rPr>
-            </w:pPr>
-            <w:r>
-              <w:rPr>
-                <w:sz w:val="19"/>
-                <w:szCs w:val="19"/>
-              </w:rPr>
-              <w:t xml:space="preserve">Detalle de cuenta</w:t>
+                <w:lang w:val="es-MX"/>
+              </w:rPr>
+            </w:pPr>
+            <w:r>
+              <w:rPr>
+                <w:sz w:val="19"/>
+                <w:szCs w:val="19"/>
+                <w:lang w:val="es-MX"/>
+              </w:rPr>
+              <w:t>Movimientos de la cuenta: tope de 20 y sin paginación</w:t>
             </w:r>
           </w:p>
         </w:tc>
@@ -1853,7 +2112,7 @@
                 <w:sz w:val="19"/>
                 <w:szCs w:val="19"/>
               </w:rPr>
-              <w:t>39566</w:t>
+              <w:t>39567</w:t>
             </w:r>
           </w:p>
         </w:tc>
@@ -1885,7 +2144,22 @@
                 <w:sz w:val="19"/>
                 <w:szCs w:val="19"/>
               </w:rPr>
-              <w:t>—</w:t>
+              <w:t>39569</w:t>
+            </w:r>
+          </w:p>
+          <w:p>
+            <w:pPr>
+              <w:rPr>
+                <w:sz w:val="19"/>
+                <w:szCs w:val="19"/>
+              </w:rPr>
+            </w:pPr>
+            <w:r>
+              <w:rPr>
+                <w:sz w:val="19"/>
+                <w:szCs w:val="19"/>
+              </w:rPr>
+              <w:t>39570</w:t>
             </w:r>
           </w:p>
         </w:tc>
@@ -1910,14 +2184,16 @@
               <w:rPr>
                 <w:sz w:val="19"/>
                 <w:szCs w:val="19"/>
-              </w:rPr>
-            </w:pPr>
-            <w:r>
-              <w:rPr>
-                <w:sz w:val="19"/>
-                <w:szCs w:val="19"/>
-              </w:rPr>
-              <w:t>—</w:t>
+                <w:lang w:val="es-MX"/>
+              </w:rPr>
+            </w:pPr>
+            <w:r>
+              <w:rPr>
+                <w:sz w:val="19"/>
+                <w:szCs w:val="19"/>
+                <w:lang w:val="es-MX"/>
+              </w:rPr>
+              <w:t>39569 y 39570 verifican lo mismo: sin botón "Ver más", sin paginación ni scroll infinito. 39567 agrega el conteo máximo de 20 y el orden de la más reciente a la más antigua</w:t>
             </w:r>
           </w:p>
         </w:tc>
@@ -1951,7 +2227,7 @@
                 <w:szCs w:val="19"/>
                 <w:lang w:val="es-MX"/>
               </w:rPr>
-              <w:t xml:space="preserve">Construido. Valida la lista de movimientos o el aviso de que no hay movimientos</w:t>
+              <w:t>Construido. Con menos de 20 movimientos en los últimos 30 días el corte queda como observación</w:t>
             </w:r>
           </w:p>
         </w:tc>
@@ -1987,7 +2263,7 @@
                 <w:szCs w:val="19"/>
                 <w:lang w:val="es-MX"/>
               </w:rPr>
-              <w:t>Movimientos de la cuenta: tope de 20 y sin paginación</w:t>
+              <w:t>Rango de fechas de los movimientos</w:t>
             </w:r>
           </w:p>
         </w:tc>
@@ -2019,7 +2295,7 @@
                 <w:sz w:val="19"/>
                 <w:szCs w:val="19"/>
               </w:rPr>
-              <w:t>39567</w:t>
+              <w:t>39568</w:t>
             </w:r>
           </w:p>
         </w:tc>
@@ -2051,22 +2327,7 @@
                 <w:sz w:val="19"/>
                 <w:szCs w:val="19"/>
               </w:rPr>
-              <w:t>39569</w:t>
-            </w:r>
-          </w:p>
-          <w:p>
-            <w:pPr>
-              <w:rPr>
-                <w:sz w:val="19"/>
-                <w:szCs w:val="19"/>
-              </w:rPr>
-            </w:pPr>
-            <w:r>
-              <w:rPr>
-                <w:sz w:val="19"/>
-                <w:szCs w:val="19"/>
-              </w:rPr>
-              <w:t>39570</w:t>
+              <w:t>—</w:t>
             </w:r>
           </w:p>
         </w:tc>
@@ -2100,7 +2361,7 @@
                 <w:szCs w:val="19"/>
                 <w:lang w:val="es-MX"/>
               </w:rPr>
-              <w:t xml:space="preserve">39569 y 39570 verifican lo mismo: sin botón "Ver más", sin paginación ni scroll infinito. 39567 agrega el conteo máximo de 20 y el orden de la más reciente a la más antigua</w:t>
+              <w:t>Reutiliza el ingreso al detalle de cuenta; valida que todas las fechas estén dentro del último mes</w:t>
             </w:r>
           </w:p>
         </w:tc>
@@ -2134,7 +2395,7 @@
                 <w:szCs w:val="19"/>
                 <w:lang w:val="es-MX"/>
               </w:rPr>
-              <w:t xml:space="preserve">Construido. Con menos de 20 movimientos en los últimos 30 días el corte queda como observación</w:t>
+              <w:t>Construido. La app solo muestra los movimientos de los últimos 30 días</w:t>
             </w:r>
           </w:p>
         </w:tc>
@@ -2161,17 +2422,34 @@
               <w:rPr>
                 <w:sz w:val="19"/>
                 <w:szCs w:val="19"/>
-                <w:lang w:val="es-MX"/>
-              </w:rPr>
-            </w:pPr>
-            <w:r>
-              <w:rPr>
-                <w:sz w:val="19"/>
-                <w:szCs w:val="19"/>
-                <w:lang w:val="es-MX"/>
-              </w:rPr>
-              <w:t>Rango de fechas de los movimientos</w:t>
-            </w:r>
+              </w:rPr>
+            </w:pPr>
+            <w:proofErr w:type="spellStart"/>
+            <w:r>
+              <w:rPr>
+                <w:sz w:val="19"/>
+                <w:szCs w:val="19"/>
+              </w:rPr>
+              <w:lastRenderedPageBreak/>
+              <w:t>Detalle</w:t>
+            </w:r>
+            <w:proofErr w:type="spellEnd"/>
+            <w:r>
+              <w:rPr>
+                <w:sz w:val="19"/>
+                <w:szCs w:val="19"/>
+              </w:rPr>
+              <w:t xml:space="preserve"> de </w:t>
+            </w:r>
+            <w:proofErr w:type="spellStart"/>
+            <w:r>
+              <w:rPr>
+                <w:sz w:val="19"/>
+                <w:szCs w:val="19"/>
+              </w:rPr>
+              <w:t>transacción</w:t>
+            </w:r>
+            <w:proofErr w:type="spellEnd"/>
           </w:p>
         </w:tc>
         <w:tc>
@@ -2202,7 +2480,7 @@
                 <w:sz w:val="19"/>
                 <w:szCs w:val="19"/>
               </w:rPr>
-              <w:t>39568</w:t>
+              <w:t>39571</w:t>
             </w:r>
           </w:p>
         </w:tc>
@@ -2259,18 +2537,14 @@
               <w:rPr>
                 <w:sz w:val="19"/>
                 <w:szCs w:val="19"/>
-                <w:lang w:val="es-MX"/>
-              </w:rPr>
-            </w:pPr>
-            <w:r>
-              <w:rPr>
-                <w:sz w:val="19"/>
-                <w:szCs w:val="19"/>
-                <w:lang w:val="es-MX"/>
-              </w:rPr>
-              <w:t xml:space="preserve">Reutiliza el ingreso al detalle de cuenta; valida que todas </w:t>
-              <w:lastRenderedPageBreak/>
-              <w:t>las fechas estén dentro del último mes</w:t>
+              </w:rPr>
+            </w:pPr>
+            <w:r>
+              <w:rPr>
+                <w:sz w:val="19"/>
+                <w:szCs w:val="19"/>
+              </w:rPr>
+              <w:t>—</w:t>
             </w:r>
           </w:p>
         </w:tc>
@@ -2304,10 +2578,7 @@
                 <w:szCs w:val="19"/>
                 <w:lang w:val="es-MX"/>
               </w:rPr>
-              <w:lastRenderedPageBreak/>
-              <w:t xml:space="preserve">Construido. La app solo muestra los movimientos de los últimos 30 días</w:t>
-              <w:lastRenderedPageBreak/>
-              <w:t/>
+              <w:t>Construido. La app no muestra cuenta de origen ni de destino: queda como observación</w:t>
             </w:r>
           </w:p>
         </w:tc>
@@ -2336,14 +2607,31 @@
                 <w:szCs w:val="19"/>
               </w:rPr>
             </w:pPr>
-            <w:r>
-              <w:rPr>
-                <w:sz w:val="19"/>
-                <w:szCs w:val="19"/>
-              </w:rPr>
-              <w:lastRenderedPageBreak/>
-              <w:t xml:space="preserve">Detalle de transacción</w:t>
-            </w:r>
+            <w:proofErr w:type="spellStart"/>
+            <w:r>
+              <w:rPr>
+                <w:sz w:val="19"/>
+                <w:szCs w:val="19"/>
+              </w:rPr>
+              <w:t>Comprobante</w:t>
+            </w:r>
+            <w:proofErr w:type="spellEnd"/>
+            <w:r>
+              <w:rPr>
+                <w:sz w:val="19"/>
+                <w:szCs w:val="19"/>
+              </w:rPr>
+              <w:t xml:space="preserve"> de </w:t>
+            </w:r>
+            <w:proofErr w:type="spellStart"/>
+            <w:r>
+              <w:rPr>
+                <w:sz w:val="19"/>
+                <w:szCs w:val="19"/>
+              </w:rPr>
+              <w:t>transacción</w:t>
+            </w:r>
+            <w:proofErr w:type="spellEnd"/>
           </w:p>
         </w:tc>
         <w:tc>
@@ -2374,7 +2662,7 @@
                 <w:sz w:val="19"/>
                 <w:szCs w:val="19"/>
               </w:rPr>
-              <w:t>39571</w:t>
+              <w:t>39572 (descargar)</w:t>
             </w:r>
           </w:p>
         </w:tc>
@@ -2406,7 +2694,7 @@
                 <w:sz w:val="19"/>
                 <w:szCs w:val="19"/>
               </w:rPr>
-              <w:t>—</w:t>
+              <w:t>39573 (compartir)</w:t>
             </w:r>
           </w:p>
         </w:tc>
@@ -2431,14 +2719,16 @@
               <w:rPr>
                 <w:sz w:val="19"/>
                 <w:szCs w:val="19"/>
-              </w:rPr>
-            </w:pPr>
-            <w:r>
-              <w:rPr>
-                <w:sz w:val="19"/>
-                <w:szCs w:val="19"/>
-              </w:rPr>
-              <w:t>—</w:t>
+                <w:lang w:val="es-MX"/>
+              </w:rPr>
+            </w:pPr>
+            <w:r>
+              <w:rPr>
+                <w:sz w:val="19"/>
+                <w:szCs w:val="19"/>
+                <w:lang w:val="es-MX"/>
+              </w:rPr>
+              <w:t>Acción sobre el comprobante: descargarlo o compartirlo</w:t>
             </w:r>
           </w:p>
         </w:tc>
@@ -2463,198 +2753,22 @@
               <w:rPr>
                 <w:sz w:val="19"/>
                 <w:szCs w:val="19"/>
-                <w:lang w:val="es-MX"/>
-              </w:rPr>
-            </w:pPr>
-            <w:r>
-              <w:rPr>
-                <w:sz w:val="19"/>
-                <w:szCs w:val="19"/>
-                <w:lang w:val="es-MX"/>
-              </w:rPr>
-              <w:t xml:space="preserve">Construido. La app no muestra cuenta de origen ni de destino: queda como observación</w:t>
-            </w:r>
-          </w:p>
-        </w:tc>
-      </w:tr>
-      <w:tr>
-        <w:tc>
-          <w:tcPr>
-            <w:tcW w:w="1900" w:type="dxa"/>
-            <w:tcBorders>
-              <w:top w:val="single" w:sz="4" w:space="0" w:color="BFBFBF"/>
-              <w:left w:val="single" w:sz="4" w:space="0" w:color="BFBFBF"/>
-              <w:bottom w:val="single" w:sz="4" w:space="0" w:color="BFBFBF"/>
-              <w:right w:val="single" w:sz="4" w:space="0" w:color="BFBFBF"/>
-            </w:tcBorders>
-            <w:tcMar>
-              <w:top w:w="60" w:type="dxa"/>
-              <w:left w:w="100" w:type="dxa"/>
-              <w:bottom w:w="60" w:type="dxa"/>
-              <w:right w:w="100" w:type="dxa"/>
-            </w:tcMar>
-          </w:tcPr>
-          <w:p>
-            <w:pPr>
-              <w:rPr>
-                <w:sz w:val="19"/>
-                <w:szCs w:val="19"/>
-              </w:rPr>
-            </w:pPr>
-            <w:r>
-              <w:rPr>
-                <w:sz w:val="19"/>
-                <w:szCs w:val="19"/>
-              </w:rPr>
-              <w:t xml:space="preserve">Comprobante de transacción</w:t>
-            </w:r>
-          </w:p>
-        </w:tc>
-        <w:tc>
-          <w:tcPr>
-            <w:tcW w:w="1500" w:type="dxa"/>
-            <w:tcBorders>
-              <w:top w:val="single" w:sz="4" w:space="0" w:color="BFBFBF"/>
-              <w:left w:val="single" w:sz="4" w:space="0" w:color="BFBFBF"/>
-              <w:bottom w:val="single" w:sz="4" w:space="0" w:color="BFBFBF"/>
-              <w:right w:val="single" w:sz="4" w:space="0" w:color="BFBFBF"/>
-            </w:tcBorders>
-            <w:tcMar>
-              <w:top w:w="60" w:type="dxa"/>
-              <w:left w:w="100" w:type="dxa"/>
-              <w:bottom w:w="60" w:type="dxa"/>
-              <w:right w:w="100" w:type="dxa"/>
-            </w:tcMar>
-          </w:tcPr>
-          <w:p>
-            <w:pPr>
-              <w:rPr>
-                <w:sz w:val="19"/>
-                <w:szCs w:val="19"/>
-              </w:rPr>
-            </w:pPr>
-            <w:r>
-              <w:rPr>
-                <w:sz w:val="19"/>
-                <w:szCs w:val="19"/>
-              </w:rPr>
-              <w:t>39572 (descargar)</w:t>
-            </w:r>
-          </w:p>
-        </w:tc>
-        <w:tc>
-          <w:tcPr>
-            <w:tcW w:w="1900" w:type="dxa"/>
-            <w:tcBorders>
-              <w:top w:val="single" w:sz="4" w:space="0" w:color="BFBFBF"/>
-              <w:left w:val="single" w:sz="4" w:space="0" w:color="BFBFBF"/>
-              <w:bottom w:val="single" w:sz="4" w:space="0" w:color="BFBFBF"/>
-              <w:right w:val="single" w:sz="4" w:space="0" w:color="BFBFBF"/>
-            </w:tcBorders>
-            <w:tcMar>
-              <w:top w:w="60" w:type="dxa"/>
-              <w:left w:w="100" w:type="dxa"/>
-              <w:bottom w:w="60" w:type="dxa"/>
-              <w:right w:w="100" w:type="dxa"/>
-            </w:tcMar>
-          </w:tcPr>
-          <w:p>
-            <w:pPr>
-              <w:rPr>
-                <w:sz w:val="19"/>
-                <w:szCs w:val="19"/>
-              </w:rPr>
-            </w:pPr>
-            <w:r>
-              <w:rPr>
-                <w:sz w:val="19"/>
-                <w:szCs w:val="19"/>
-              </w:rPr>
-              <w:t>39573 (compartir)</w:t>
-            </w:r>
-          </w:p>
-        </w:tc>
-        <w:tc>
-          <w:tcPr>
-            <w:tcW w:w="2560" w:type="dxa"/>
-            <w:tcBorders>
-              <w:top w:val="single" w:sz="4" w:space="0" w:color="BFBFBF"/>
-              <w:left w:val="single" w:sz="4" w:space="0" w:color="BFBFBF"/>
-              <w:bottom w:val="single" w:sz="4" w:space="0" w:color="BFBFBF"/>
-              <w:right w:val="single" w:sz="4" w:space="0" w:color="BFBFBF"/>
-            </w:tcBorders>
-            <w:tcMar>
-              <w:top w:w="60" w:type="dxa"/>
-              <w:left w:w="100" w:type="dxa"/>
-              <w:bottom w:w="60" w:type="dxa"/>
-              <w:right w:w="100" w:type="dxa"/>
-            </w:tcMar>
-          </w:tcPr>
-          <w:p>
-            <w:pPr>
-              <w:rPr>
-                <w:sz w:val="19"/>
-                <w:szCs w:val="19"/>
-                <w:lang w:val="es-MX"/>
-              </w:rPr>
-            </w:pPr>
-            <w:r>
-              <w:rPr>
-                <w:sz w:val="19"/>
-                <w:szCs w:val="19"/>
-                <w:lang w:val="es-MX"/>
-              </w:rPr>
-              <w:t>Acción sobre el comprobante: descargarlo o compartirlo</w:t>
-            </w:r>
-          </w:p>
-        </w:tc>
-        <w:tc>
-          <w:tcPr>
-            <w:tcW w:w="1500" w:type="dxa"/>
-            <w:tcBorders>
-              <w:top w:val="single" w:sz="4" w:space="0" w:color="BFBFBF"/>
-              <w:left w:val="single" w:sz="4" w:space="0" w:color="BFBFBF"/>
-              <w:bottom w:val="single" w:sz="4" w:space="0" w:color="BFBFBF"/>
-              <w:right w:val="single" w:sz="4" w:space="0" w:color="BFBFBF"/>
-            </w:tcBorders>
-            <w:tcMar>
-              <w:top w:w="60" w:type="dxa"/>
-              <w:left w:w="100" w:type="dxa"/>
-              <w:bottom w:w="60" w:type="dxa"/>
-              <w:right w:w="100" w:type="dxa"/>
-            </w:tcMar>
-          </w:tcPr>
-          <w:p>
-            <w:pPr>
-              <w:rPr>
-                <w:sz w:val="19"/>
-                <w:szCs w:val="19"/>
-              </w:rPr>
-            </w:pPr>
-            <w:r>
-              <w:rPr>
-                <w:sz w:val="19"/>
-                <w:szCs w:val="19"/>
-                <w:lang w:val="es-MX"/>
-              </w:rPr>
-              <w:t xml:space="preserve">Construidos; </w:t>
-            </w:r>
-            <w:bookmarkStart w:id="0" w:name="_GoBack"/>
-            <w:bookmarkEnd w:id="0"/>
-            <w:r>
-              <w:rPr>
-                <w:sz w:val="19"/>
-                <w:szCs w:val="19"/>
-                <w:lang w:val="es-MX"/>
-              </w:rPr>
-              <w:t xml:space="preserve">Descargar: la imagen se adjunta a la evidencia y se borra del dispositivo. </w:t>
-            </w:r>
-            <w:r>
-              <w:rPr>
-                <w:sz w:val="19"/>
-                <w:szCs w:val="19"/>
-              </w:rPr>
-              <w:t xml:space="preserve">Compartir: se cancela sin elegir app</w:t>
+              </w:rPr>
+            </w:pPr>
+            <w:r>
+              <w:rPr>
+                <w:sz w:val="19"/>
+                <w:szCs w:val="19"/>
+                <w:lang w:val="es-MX"/>
+              </w:rPr>
+              <w:t xml:space="preserve">Construidos; Descargar: la imagen se adjunta a la evidencia y se borra del dispositivo. </w:t>
+            </w:r>
+            <w:r>
+              <w:rPr>
+                <w:sz w:val="19"/>
+                <w:szCs w:val="19"/>
+              </w:rPr>
+              <w:t>Compartir: se cancela sin elegir app</w:t>
             </w:r>
           </w:p>
         </w:tc>
@@ -2677,7 +2791,7 @@
         <w:rPr>
           <w:lang w:val="es-MX"/>
         </w:rPr>
-        <w:t xml:space="preserve">4. Caso descartado</w:t>
+        <w:t>4. Caso descartado</w:t>
       </w:r>
     </w:p>
     <w:p>
@@ -2693,13 +2807,7 @@
           <w:bCs/>
           <w:lang w:val="es-MX"/>
         </w:rPr>
-        <w:t xml:space="preserve">38701 – Visualización de componentes de la pantalla: se cierra como cubierto por los casos de cada componente del Home: saludo (38699), último ingreso (38700), accesos (38703, 38704, 38711) y productos (38705 a 38708).</w:t>
-      </w:r>
-      <w:r>
-        <w:rPr>
-          <w:lang w:val="es-MX"/>
-        </w:rPr>
-        <w:t/>
+        <w:t>38701 – Visualización de componentes de la pantalla: se cierra como cubierto por los casos de cada componente del Home: saludo (38699), último ingreso (38700), accesos (38703, 38704, 38711) y productos (38705 a 38708).</w:t>
       </w:r>
     </w:p>
     <w:p>
@@ -2728,7 +2836,7 @@
         <w:rPr>
           <w:lang w:val="es-MX"/>
         </w:rPr>
-        <w:t xml:space="preserve">Los casos de logs quedan excluidos de esta etapa porque requieren acceso al servicio de logs:</w:t>
+        <w:t>Los casos de logs quedan excluidos de esta etapa porque requieren acceso al servicio de logs:</w:t>
       </w:r>
     </w:p>
     <w:tbl>
@@ -2813,7 +2921,7 @@
                 <w:sz w:val="19"/>
                 <w:szCs w:val="19"/>
               </w:rPr>
-              <w:t xml:space="preserve">Título resumido</w:t>
+              <w:t>Título resumido</w:t>
             </w:r>
           </w:p>
         </w:tc>
@@ -2897,7 +3005,7 @@
                 <w:sz w:val="19"/>
                 <w:szCs w:val="19"/>
               </w:rPr>
-              <w:t xml:space="preserve">Log por registro exitoso</w:t>
+              <w:t>Log por registro exitoso</w:t>
             </w:r>
           </w:p>
         </w:tc>
@@ -2958,7 +3066,6 @@
                 <w:sz w:val="19"/>
                 <w:szCs w:val="19"/>
               </w:rPr>
-              <w:lastRenderedPageBreak/>
               <w:t>38504</w:t>
             </w:r>
           </w:p>
@@ -2986,7 +3093,7 @@
                 <w:sz w:val="19"/>
                 <w:szCs w:val="19"/>
               </w:rPr>
-              <w:t xml:space="preserve">Log por registro exitoso</w:t>
+              <w:t>Log por registro exitoso</w:t>
             </w:r>
           </w:p>
         </w:tc>
@@ -3019,7 +3126,7 @@
                 <w:szCs w:val="19"/>
                 <w:lang w:val="es-MX"/>
               </w:rPr>
-              <w:t xml:space="preserve">Fuera por ahora: requiere acceso al servicio de logs</w:t>
+              <w:t>Fuera por ahora: requiere acceso al servicio de logs</w:t>
             </w:r>
           </w:p>
         </w:tc>
@@ -3272,7 +3379,7 @@
                 <w:sz w:val="19"/>
                 <w:szCs w:val="19"/>
               </w:rPr>
-              <w:t xml:space="preserve">Tratamiento propuesto</w:t>
+              <w:t>Tratamiento propuesto</w:t>
             </w:r>
           </w:p>
         </w:tc>
@@ -3364,7 +3471,7 @@
                 <w:szCs w:val="19"/>
                 <w:lang w:val="es-MX"/>
               </w:rPr>
-              <w:t xml:space="preserve">Sin el documento de diseño ni herramienta de pruebas visuales, esa comparación queda manual. La automatización valida que el acceso exista, esté habilitado y responda</w:t>
+              <w:t>Sin el documento de diseño ni herramienta de pruebas visuales, esa comparación queda manual. La automatización valida que el acceso exista, esté habilitado y responda</w:t>
             </w:r>
           </w:p>
         </w:tc>
@@ -3393,6 +3500,7 @@
                 <w:sz w:val="19"/>
                 <w:szCs w:val="19"/>
               </w:rPr>
+              <w:lastRenderedPageBreak/>
               <w:t>38702</w:t>
             </w:r>
           </w:p>
@@ -3426,7 +3534,7 @@
                 <w:szCs w:val="19"/>
                 <w:lang w:val="es-MX"/>
               </w:rPr>
-              <w:t xml:space="preserve">Paso 6: "validar que el crédito que muestra con el cliente exista y este correcto en la bd"</w:t>
+              <w:t>Paso 6: "validar que el crédito que muestra con el cliente exista y este correcto en la bd"</w:t>
             </w:r>
           </w:p>
         </w:tc>
@@ -3459,7 +3567,7 @@
                 <w:szCs w:val="19"/>
                 <w:lang w:val="es-MX"/>
               </w:rPr>
-              <w:t xml:space="preserve">Se valida que el banner exista; la verificación en BD queda manual o pendiente de acceso</w:t>
+              <w:t>Se valida que el banner exista; la verificación en BD queda manual o pendiente de acceso</w:t>
             </w:r>
           </w:p>
         </w:tc>
@@ -3519,7 +3627,7 @@
                 <w:szCs w:val="19"/>
                 <w:lang w:val="es-MX"/>
               </w:rPr>
-              <w:t xml:space="preserve">Paso 4: "Validar que los saldos y estados de cada producto financiero correspondan a la información real del cliente" (según el diseño y el backend)</w:t>
+              <w:t>Paso 4: "Validar que los saldos y estados de cada producto financiero correspondan a la información real del cliente" (según el diseño y el backend)</w:t>
             </w:r>
           </w:p>
         </w:tc>
@@ -3551,7 +3659,7 @@
                 <w:szCs w:val="19"/>
                 <w:lang w:val="es-MX"/>
               </w:rPr>
-              <w:t xml:space="preserve">El saldo esperado se informa en la columna Monto del control y se compara con el de la tarjeta; la verificación de los estados contra el backend queda manual o pendiente de acceso</w:t>
+              <w:t>El saldo esperado se informa en la columna Monto del control y se compara con el de la tarjeta; la verificación de los estados contra el backend queda manual o pendiente de acceso</w:t>
             </w:r>
           </w:p>
         </w:tc>
@@ -3619,7 +3727,7 @@
                 <w:szCs w:val="19"/>
                 <w:lang w:val="es-MX"/>
               </w:rPr>
-              <w:t xml:space="preserve">Paso 4: "Comparar las fechas y horas de las primeras y últimas transacciones de la lista con los datos reales del backend del usuario"</w:t>
+              <w:t>Paso 4: "Comparar las fechas y horas de las primeras y últimas transacciones de la lista con los datos reales del backend del usuario"</w:t>
             </w:r>
           </w:p>
         </w:tc>
@@ -3653,7 +3761,7 @@
                 <w:szCs w:val="19"/>
                 <w:lang w:val="es-MX"/>
               </w:rPr>
-              <w:t xml:space="preserve">Igual que 38709: sin acceso al backend se valida el conteo, el orden y el formato; la comparación con el backend queda manual o pendiente de acceso</w:t>
+              <w:t>Igual que 38709: sin acceso al backend se valida el conteo, el orden y el formato; la comparación con el backend queda manual o pendiente de acceso</w:t>
             </w:r>
           </w:p>
         </w:tc>
@@ -3721,7 +3829,7 @@
                 <w:szCs w:val="19"/>
                 <w:lang w:val="es-MX"/>
               </w:rPr>
-              <w:t xml:space="preserve">"No se realiza ninguna petición de carga adicional" / "no realiza peticiones adicionales al backend (lazy loading)"</w:t>
+              <w:t>"No se realiza ninguna petición de carga adicional" / "no realiza peticiones adicionales al backend (lazy loading)"</w:t>
             </w:r>
           </w:p>
         </w:tc>
@@ -3755,7 +3863,7 @@
                 <w:szCs w:val="19"/>
                 <w:lang w:val="es-MX"/>
               </w:rPr>
-              <w:t xml:space="preserve">La automatización valida que no aparezca "Ver más" ni paginación y que la lista no crezca al forzar el scroll; la ausencia de peticiones de red queda manual</w:t>
+              <w:t>La automatización valida que no aparezca "Ver más" ni paginación y que la lista no crezca al forzar el scroll; la ausencia de peticiones de red queda manual</w:t>
             </w:r>
           </w:p>
         </w:tc>
@@ -3979,7 +4087,7 @@
         <w:spacing w:before="280" w:after="120"/>
       </w:pPr>
       <w:r>
-        <w:t xml:space="preserve">7. Resumen</w:t>
+        <w:t>7. Resumen</w:t>
       </w:r>
     </w:p>
     <w:tbl>
@@ -4091,7 +4199,7 @@
                 <w:sz w:val="19"/>
                 <w:szCs w:val="19"/>
               </w:rPr>
-              <w:t xml:space="preserve">Casos planificados</w:t>
+              <w:t>Casos planificados</w:t>
             </w:r>
           </w:p>
         </w:tc>
@@ -4274,7 +4382,6 @@
                 <w:szCs w:val="19"/>
                 <w:lang w:val="es-MX"/>
               </w:rPr>
-              <w:lastRenderedPageBreak/>
               <w:t>Casos fuera de alcance por logs</w:t>
             </w:r>
           </w:p>
@@ -4330,7 +4437,7 @@
                 <w:sz w:val="19"/>
                 <w:szCs w:val="19"/>
               </w:rPr>
-              <w:t xml:space="preserve">Casos descartados</w:t>
+              <w:t>Casos descartados</w:t>
             </w:r>
           </w:p>
         </w:tc>
@@ -4429,7 +4536,7 @@
         <w:spacing w:before="280" w:after="120"/>
       </w:pPr>
       <w:r>
-        <w:t xml:space="preserve">8. Pendientes por confirmar</w:t>
+        <w:t>8. Pendientes por confirmar</w:t>
       </w:r>
     </w:p>
     <w:p>
@@ -4448,7 +4555,7 @@
         <w:rPr>
           <w:lang w:val="es-MX"/>
         </w:rPr>
-        <w:t>39566: confirmar qué significa "ID 10 / ID 11 según el tipo", que no es visible en la app.</w:t>
+        <w:t>N/A</w:t>
       </w:r>
     </w:p>
     <w:p>
@@ -4457,6 +4564,8 @@
           <w:lang w:val="es-MX"/>
         </w:rPr>
       </w:pPr>
+      <w:bookmarkStart w:id="0" w:name="_GoBack"/>
+      <w:bookmarkEnd w:id="0"/>
     </w:p>
     <w:sectPr>
       <w:footerReference w:type="default" r:id="rId7"/>

</xml_diff>